<commit_message>
Minor updates to test plan
</commit_message>
<xml_diff>
--- a/doc/test-plan.docx
+++ b/doc/test-plan.docx
@@ -841,6 +841,27 @@
     <w:p>
       <w:pPr>
         <w:numPr>
+          <w:ilvl w:val="2"/>
+          <w:numId w:val="12"/>
+        </w:numPr>
+        <w:spacing w:after="0" w:afterAutospacing="0"/>
+        <w:ind w:left="2160" w:hanging="360"/>
+        <w:rPr>
+          <w:color w:val="0000ff"/>
+          <w:u w:val="none"/>
+        </w:rPr>
+      </w:pPr>
+      <w:r>
+        <w:rPr>
+          <w:color w:val="0000ff"/>
+          <w:rtl w:val="0"/>
+        </w:rPr>
+        <w:t xml:space="preserve">Hard snail trail - spawns additional inert bullets when destroyed</w:t>
+      </w:r>
+    </w:p>
+    <w:p>
+      <w:pPr>
+        <w:numPr>
           <w:ilvl w:val="1"/>
           <w:numId w:val="12"/>
         </w:numPr>
@@ -1436,6 +1457,27 @@
     <w:p>
       <w:pPr>
         <w:numPr>
+          <w:ilvl w:val="1"/>
+          <w:numId w:val="9"/>
+        </w:numPr>
+        <w:spacing w:after="0" w:afterAutospacing="0"/>
+        <w:ind w:left="1440" w:hanging="360"/>
+        <w:rPr>
+          <w:color w:val="0000ff"/>
+          <w:u w:val="none"/>
+        </w:rPr>
+      </w:pPr>
+      <w:r>
+        <w:rPr>
+          <w:color w:val="0000ff"/>
+          <w:rtl w:val="0"/>
+        </w:rPr>
+        <w:t xml:space="preserve">Sword enemy: charges at player </w:t>
+      </w:r>
+    </w:p>
+    <w:p>
+      <w:pPr>
+        <w:numPr>
           <w:ilvl w:val="0"/>
           <w:numId w:val="9"/>
         </w:numPr>
@@ -1905,11 +1947,12 @@
         <w:spacing w:after="0" w:afterAutospacing="0"/>
         <w:ind w:left="720" w:hanging="360"/>
         <w:rPr>
-          <w:u w:val="none"/>
-        </w:rPr>
-      </w:pPr>
-      <w:r>
-        <w:rPr>
+          <w:color w:val="0000ff"/>
+        </w:rPr>
+      </w:pPr>
+      <w:r>
+        <w:rPr>
+          <w:color w:val="0000ff"/>
           <w:rtl w:val="0"/>
         </w:rPr>
         <w:t xml:space="preserve">Interactable objects can be interacted with by pressing E when near them (an E indicator should appear). Almost all of them pull up dialogue when doing so, with the exception of open doors that simply send the player to the next room.</w:t>
@@ -1924,11 +1967,12 @@
         <w:spacing w:after="0" w:afterAutospacing="0"/>
         <w:ind w:left="1440" w:hanging="360"/>
         <w:rPr>
-          <w:u w:val="none"/>
-        </w:rPr>
-      </w:pPr>
-      <w:r>
-        <w:rPr>
+          <w:color w:val="0000ff"/>
+        </w:rPr>
+      </w:pPr>
+      <w:r>
+        <w:rPr>
+          <w:color w:val="0000ff"/>
           <w:rtl w:val="0"/>
         </w:rPr>
         <w:t xml:space="preserve">Tree and Gardener NPC: only have interactable dialogue. Found in some resting rooms.</w:t>
@@ -1943,11 +1987,12 @@
         <w:spacing w:after="0" w:afterAutospacing="0"/>
         <w:ind w:left="1440" w:hanging="360"/>
         <w:rPr>
-          <w:u w:val="none"/>
-        </w:rPr>
-      </w:pPr>
-      <w:r>
-        <w:rPr>
+          <w:color w:val="0000ff"/>
+        </w:rPr>
+      </w:pPr>
+      <w:r>
+        <w:rPr>
+          <w:color w:val="0000ff"/>
           <w:rtl w:val="0"/>
         </w:rPr>
         <w:t xml:space="preserve">Pop console: pops all bullets on stack. Found in some resting rooms.</w:t>
@@ -1962,11 +2007,12 @@
         <w:spacing w:after="0" w:afterAutospacing="0"/>
         <w:ind w:left="1440" w:hanging="360"/>
         <w:rPr>
-          <w:u w:val="none"/>
-        </w:rPr>
-      </w:pPr>
-      <w:r>
-        <w:rPr>
+          <w:color w:val="0000ff"/>
+        </w:rPr>
+      </w:pPr>
+      <w:r>
+        <w:rPr>
+          <w:color w:val="0000ff"/>
           <w:rtl w:val="0"/>
         </w:rPr>
         <w:t xml:space="preserve">Push console: pushes bullet(s) onto the stack. Can also push keys. Should add new bullets and not replace pre-existing ones. Found in treasure rooms or after defeating hard enemy rooms (like ones with BOIDs).</w:t>
@@ -1981,11 +2027,12 @@
         <w:spacing w:after="0" w:afterAutospacing="0"/>
         <w:ind w:left="1440" w:hanging="360"/>
         <w:rPr>
-          <w:u w:val="none"/>
-        </w:rPr>
-      </w:pPr>
-      <w:r>
-        <w:rPr>
+          <w:color w:val="0000ff"/>
+        </w:rPr>
+      </w:pPr>
+      <w:r>
+        <w:rPr>
+          <w:color w:val="0000ff"/>
           <w:rtl w:val="0"/>
         </w:rPr>
         <w:t xml:space="preserve">RAM stick: increase stack size. Found in treasure rooms or after defeating boss.</w:t>
@@ -2000,11 +2047,12 @@
         <w:spacing w:after="0" w:afterAutospacing="0"/>
         <w:ind w:left="1440" w:hanging="360"/>
         <w:rPr>
-          <w:u w:val="none"/>
-        </w:rPr>
-      </w:pPr>
-      <w:r>
-        <w:rPr>
+          <w:color w:val="0000ff"/>
+        </w:rPr>
+      </w:pPr>
+      <w:r>
+        <w:rPr>
+          <w:color w:val="0000ff"/>
           <w:rtl w:val="0"/>
         </w:rPr>
         <w:t xml:space="preserve">Locked doors: unlockable with a key. A max of 2 locked doors will appear in a room. If the player tries to unlock a door for the first time without a key, the scientist will give them a friendly reminder of where to get keys.</w:t>
@@ -2018,11 +2066,12 @@
         </w:numPr>
         <w:ind w:left="1440" w:hanging="360"/>
         <w:rPr>
-          <w:u w:val="none"/>
-        </w:rPr>
-      </w:pPr>
-      <w:r>
-        <w:rPr>
+          <w:color w:val="0000ff"/>
+        </w:rPr>
+      </w:pPr>
+      <w:r>
+        <w:rPr>
+          <w:color w:val="0000ff"/>
           <w:rtl w:val="0"/>
         </w:rPr>
         <w:t xml:space="preserve">Open doors: send the player to the next room.</w:t>
@@ -2102,11 +2151,12 @@
         <w:spacing w:after="0" w:afterAutospacing="0"/>
         <w:ind w:left="1440" w:hanging="360"/>
         <w:rPr>
-          <w:u w:val="none"/>
-        </w:rPr>
-      </w:pPr>
-      <w:r>
-        <w:rPr>
+          <w:color w:val="0000ff"/>
+        </w:rPr>
+      </w:pPr>
+      <w:r>
+        <w:rPr>
+          <w:color w:val="0000ff"/>
           <w:rtl w:val="0"/>
         </w:rPr>
         <w:t xml:space="preserve">Some doors also require a key to unlock.</w:t>
@@ -2222,11 +2272,12 @@
         </w:numPr>
         <w:ind w:left="720" w:hanging="360"/>
         <w:rPr>
-          <w:u w:val="none"/>
-        </w:rPr>
-      </w:pPr>
-      <w:r>
-        <w:rPr>
+          <w:color w:val="0000ff"/>
+        </w:rPr>
+      </w:pPr>
+      <w:r>
+        <w:rPr>
+          <w:color w:val="0000ff"/>
           <w:rtl w:val="0"/>
         </w:rPr>
         <w:t xml:space="preserve">The difficulty of the game increases the more rooms are cleared, with the player encountering a boss room every 12 rooms.</w:t>
@@ -2280,7 +2331,14 @@
         <w:rPr>
           <w:rtl w:val="0"/>
         </w:rPr>
-        <w:t xml:space="preserve">Players colliding with enemies or enemy bullets should make the player briefly switch to a damaged sprite and emit particles near the player.</w:t>
+        <w:t xml:space="preserve">Players colliding with enemies or enemy bullets should make the player briefly switch to a damaged sprite </w:t>
+      </w:r>
+      <w:r>
+        <w:rPr>
+          <w:color w:val="0000ff"/>
+          <w:rtl w:val="0"/>
+        </w:rPr>
+        <w:t xml:space="preserve">and emit particles near the player.</w:t>
       </w:r>
     </w:p>
     <w:p>
@@ -2342,11 +2400,12 @@
         </w:numPr>
         <w:ind w:left="720" w:hanging="360"/>
         <w:rPr>
-          <w:u w:val="none"/>
-        </w:rPr>
-      </w:pPr>
-      <w:r>
-        <w:rPr>
+          <w:color w:val="0000ff"/>
+        </w:rPr>
+      </w:pPr>
+      <w:r>
+        <w:rPr>
+          <w:color w:val="0000ff"/>
           <w:rtl w:val="0"/>
         </w:rPr>
         <w:t xml:space="preserve">When coloured bullets are shot, they should have a trail of particles</w:t>
@@ -2501,6 +2560,46 @@
           <w:rtl w:val="0"/>
         </w:rPr>
         <w:t xml:space="preserve">When the scientist unlocks the first door in the dialogue</w:t>
+      </w:r>
+    </w:p>
+    <w:p>
+      <w:pPr>
+        <w:numPr>
+          <w:ilvl w:val="1"/>
+          <w:numId w:val="5"/>
+        </w:numPr>
+        <w:spacing w:after="0" w:afterAutospacing="0"/>
+        <w:ind w:left="1440" w:hanging="360"/>
+        <w:rPr>
+          <w:color w:val="0000ff"/>
+        </w:rPr>
+      </w:pPr>
+      <w:r>
+        <w:rPr>
+          <w:color w:val="0000ff"/>
+          <w:rtl w:val="0"/>
+        </w:rPr>
+        <w:t xml:space="preserve">When popping stack, pushing onto stack, obtaining the RAM stick</w:t>
+      </w:r>
+    </w:p>
+    <w:p>
+      <w:pPr>
+        <w:numPr>
+          <w:ilvl w:val="1"/>
+          <w:numId w:val="5"/>
+        </w:numPr>
+        <w:spacing w:after="0" w:afterAutospacing="0"/>
+        <w:ind w:left="1440" w:hanging="360"/>
+        <w:rPr>
+          <w:color w:val="0000ff"/>
+        </w:rPr>
+      </w:pPr>
+      <w:r>
+        <w:rPr>
+          <w:color w:val="0000ff"/>
+          <w:rtl w:val="0"/>
+        </w:rPr>
+        <w:t xml:space="preserve">When certain bullets explode into more bullets</w:t>
       </w:r>
     </w:p>
     <w:p>

</xml_diff>

<commit_message>
Lowered max player speed to 350 until player clip through walls problem is fixed. Moved objects rendering under particles. Resized sword enemy sprite.
</commit_message>
<xml_diff>
--- a/doc/test-plan.docx
+++ b/doc/test-plan.docx
@@ -1289,6 +1289,26 @@
           <w:color w:val="0000ff"/>
           <w:rtl w:val="0"/>
         </w:rPr>
+        <w:t xml:space="preserve">Laser crab: crab, but green. Shoots a laser instead.</w:t>
+      </w:r>
+    </w:p>
+    <w:p>
+      <w:pPr>
+        <w:numPr>
+          <w:ilvl w:val="1"/>
+          <w:numId w:val="9"/>
+        </w:numPr>
+        <w:spacing w:after="0" w:afterAutospacing="0"/>
+        <w:ind w:left="1440" w:hanging="360"/>
+        <w:rPr>
+          <w:color w:val="0000ff"/>
+        </w:rPr>
+      </w:pPr>
+      <w:r>
+        <w:rPr>
+          <w:color w:val="0000ff"/>
+          <w:rtl w:val="0"/>
+        </w:rPr>
         <w:t xml:space="preserve">bio-BOIDS: using coherence, alignment, and separation with a fixed factor of 0.01, 0.05, 0.01 respectively. This give a swarm of bees that not too close to each other but still act as a group and align the direction between each other</w:t>
       </w:r>
     </w:p>
@@ -1409,7 +1429,7 @@
           <w:color w:val="0000ff"/>
           <w:rtl w:val="0"/>
         </w:rPr>
-        <w:t xml:space="preserve">Charge Snail: when near player it will go to charge state, accelerate itself and charge to the direction to the player.</w:t>
+        <w:t xml:space="preserve">Charge Snail: when near player it will go to charge state, accelerate itself and charge to the direction to the player. Leaves behind a trail of bullets.</w:t>
       </w:r>
     </w:p>
     <w:p>
@@ -1430,6 +1450,27 @@
           <w:color w:val="0000ff"/>
           <w:rtl w:val="0"/>
         </w:rPr>
+        <w:t xml:space="preserve">Purple charge snail: the bullets left behind can explode into more bullets upon contact/expiration.</w:t>
+      </w:r>
+    </w:p>
+    <w:p>
+      <w:pPr>
+        <w:numPr>
+          <w:ilvl w:val="1"/>
+          <w:numId w:val="9"/>
+        </w:numPr>
+        <w:spacing w:after="0" w:afterAutospacing="0"/>
+        <w:ind w:left="1440" w:hanging="360"/>
+        <w:rPr>
+          <w:color w:val="0000ff"/>
+          <w:u w:val="none"/>
+        </w:rPr>
+      </w:pPr>
+      <w:r>
+        <w:rPr>
+          <w:color w:val="0000ff"/>
+          <w:rtl w:val="0"/>
+        </w:rPr>
         <w:t xml:space="preserve">beeHive : when hp drop to 25% spawn boids </w:t>
       </w:r>
     </w:p>
@@ -1472,7 +1513,7 @@
           <w:color w:val="0000ff"/>
           <w:rtl w:val="0"/>
         </w:rPr>
-        <w:t xml:space="preserve">Sword enemy: charges at player </w:t>
+        <w:t xml:space="preserve">Sword enemy: charges at player. Behaviour otherwise identical to the angel enemy’s old AI.</w:t>
       </w:r>
     </w:p>
     <w:p>

</xml_diff>

<commit_message>
Minor update to test plan
</commit_message>
<xml_diff>
--- a/doc/test-plan.docx
+++ b/doc/test-plan.docx
@@ -1,6 +1,6 @@
 
 <file path=word/document.xml><?xml version="1.0" encoding="utf-8"?>
-<w:document xmlns:mc="http://schemas.openxmlformats.org/markup-compatibility/2006" xmlns:o="urn:schemas-microsoft-com:office:office" xmlns:r="http://schemas.openxmlformats.org/officeDocument/2006/relationships" xmlns:m="http://schemas.openxmlformats.org/officeDocument/2006/math" xmlns:v="urn:schemas-microsoft-com:vml" xmlns:wp="http://schemas.openxmlformats.org/drawingml/2006/wordprocessingDrawing" xmlns:w10="urn:schemas-microsoft-com:office:word" xmlns:w="http://schemas.openxmlformats.org/wordprocessingml/2006/main" xmlns:wne="http://schemas.microsoft.com/office/word/2006/wordml" xmlns:sl="http://schemas.openxmlformats.org/schemaLibrary/2006/main" xmlns:a="http://schemas.openxmlformats.org/drawingml/2006/main" xmlns:pic="http://schemas.openxmlformats.org/drawingml/2006/picture" xmlns:c="http://schemas.openxmlformats.org/drawingml/2006/chart" xmlns:lc="http://schemas.openxmlformats.org/drawingml/2006/lockedCanvas" xmlns:dgm="http://schemas.openxmlformats.org/drawingml/2006/diagram" xmlns:wps="http://schemas.microsoft.com/office/word/2010/wordprocessingShape" xmlns:wpg="http://schemas.microsoft.com/office/word/2010/wordprocessingGroup" xmlns:w14="http://schemas.microsoft.com/office/word/2010/wordml" xmlns:w15="http://schemas.microsoft.com/office/word/2012/wordml" xmlns:w16="http://schemas.microsoft.com/office/word/2018/wordml" xmlns:w16cex="http://schemas.microsoft.com/office/word/2018/wordml/cex" xmlns:w16cid="http://schemas.microsoft.com/office/word/2016/wordml/cid" xmlns="http://schemas.microsoft.com/office/tasks/2019/documenttasks" xmlns:cr="http://schemas.microsoft.com/office/comments/2020/reactions">
+<w:document xmlns:wpc="http://schemas.microsoft.com/office/word/2010/wordprocessingCanvas" xmlns:cx="http://schemas.microsoft.com/office/drawing/2014/chartex" xmlns:cx1="http://schemas.microsoft.com/office/drawing/2015/9/8/chartex" xmlns:cx2="http://schemas.microsoft.com/office/drawing/2015/10/21/chartex" xmlns:cx3="http://schemas.microsoft.com/office/drawing/2016/5/9/chartex" xmlns:cx4="http://schemas.microsoft.com/office/drawing/2016/5/10/chartex" xmlns:cx5="http://schemas.microsoft.com/office/drawing/2016/5/11/chartex" xmlns:cx6="http://schemas.microsoft.com/office/drawing/2016/5/12/chartex" xmlns:cx7="http://schemas.microsoft.com/office/drawing/2016/5/13/chartex" xmlns:cx8="http://schemas.microsoft.com/office/drawing/2016/5/14/chartex" xmlns:mc="http://schemas.openxmlformats.org/markup-compatibility/2006" xmlns:aink="http://schemas.microsoft.com/office/drawing/2016/ink" xmlns:am3d="http://schemas.microsoft.com/office/drawing/2017/model3d" xmlns:o="urn:schemas-microsoft-com:office:office" xmlns:oel="http://schemas.microsoft.com/office/2019/extlst" xmlns:r="http://schemas.openxmlformats.org/officeDocument/2006/relationships" xmlns:m="http://schemas.openxmlformats.org/officeDocument/2006/math" xmlns:v="urn:schemas-microsoft-com:vml" xmlns:wp14="http://schemas.microsoft.com/office/word/2010/wordprocessingDrawing" xmlns:wp="http://schemas.openxmlformats.org/drawingml/2006/wordprocessingDrawing" xmlns:w10="urn:schemas-microsoft-com:office:word" xmlns:w="http://schemas.openxmlformats.org/wordprocessingml/2006/main" xmlns:w14="http://schemas.microsoft.com/office/word/2010/wordml" xmlns:w15="http://schemas.microsoft.com/office/word/2012/wordml" xmlns:w16cex="http://schemas.microsoft.com/office/word/2018/wordml/cex" xmlns:w16cid="http://schemas.microsoft.com/office/word/2016/wordml/cid" xmlns:w16="http://schemas.microsoft.com/office/word/2018/wordml" xmlns:w16du="http://schemas.microsoft.com/office/word/2023/wordml/word16du" xmlns:w16sdtdh="http://schemas.microsoft.com/office/word/2020/wordml/sdtdatahash" xmlns:w16se="http://schemas.microsoft.com/office/word/2015/wordml/symex" xmlns:wpg="http://schemas.microsoft.com/office/word/2010/wordprocessingGroup" xmlns:wpi="http://schemas.microsoft.com/office/word/2010/wordprocessingInk" xmlns:wne="http://schemas.microsoft.com/office/word/2006/wordml" xmlns:wps="http://schemas.microsoft.com/office/word/2010/wordprocessingShape" mc:Ignorable="w14 w15 w16se w16cid w16 w16cex w16sdtdh w16du wp14">
   <w:body>
     <w:p>
       <w:pPr>
@@ -10,50 +10,40 @@
       </w:pPr>
       <w:r>
         <w:rPr>
-          <w:b w:val="1"/>
-          <w:rtl w:val="0"/>
+          <w:b/>
         </w:rPr>
         <w:t xml:space="preserve">Note: </w:t>
       </w:r>
       <w:r>
-        <w:rPr>
-          <w:rtl w:val="0"/>
-        </w:rPr>
         <w:t xml:space="preserve">new additions for M3 are in </w:t>
       </w:r>
       <w:r>
         <w:rPr>
-          <w:color w:val="0000ff"/>
-          <w:rtl w:val="0"/>
-        </w:rPr>
-        <w:t xml:space="preserve">blue</w:t>
-      </w:r>
-      <w:r>
-        <w:rPr>
-          <w:rtl w:val="0"/>
-        </w:rPr>
+          <w:color w:val="0000FF"/>
+        </w:rPr>
+        <w:t>blue</w:t>
+      </w:r>
+      <w:r>
         <w:t xml:space="preserve">, removals in </w:t>
       </w:r>
       <w:r>
         <w:rPr>
           <w:color w:val="980000"/>
-          <w:rtl w:val="0"/>
-        </w:rPr>
-        <w:t xml:space="preserve">red</w:t>
-      </w:r>
-    </w:p>
-    <w:p>
-      <w:pPr>
-        <w:rPr>
-          <w:b w:val="1"/>
-        </w:rPr>
-      </w:pPr>
-      <w:r>
-        <w:rPr>
-          <w:b w:val="1"/>
-          <w:rtl w:val="0"/>
-        </w:rPr>
-        <w:t xml:space="preserve">Movement Controls</w:t>
+        </w:rPr>
+        <w:t>red</w:t>
+      </w:r>
+    </w:p>
+    <w:p>
+      <w:pPr>
+        <w:rPr>
+          <w:b/>
+        </w:rPr>
+      </w:pPr>
+      <w:r>
+        <w:rPr>
+          <w:b/>
+        </w:rPr>
+        <w:t>Movement Controls</w:t>
       </w:r>
     </w:p>
     <w:p>
@@ -62,15 +52,10 @@
           <w:ilvl w:val="0"/>
           <w:numId w:val="6"/>
         </w:numPr>
-        <w:spacing w:after="0" w:afterAutospacing="0"/>
-        <w:ind w:left="720" w:hanging="360"/>
-        <w:rPr/>
-      </w:pPr>
-      <w:r>
-        <w:rPr>
-          <w:rtl w:val="0"/>
-        </w:rPr>
-        <w:t xml:space="preserve">Pressing W/A/S/D should move the player Up/Down/Left/Right</w:t>
+        <w:spacing w:after="0"/>
+      </w:pPr>
+      <w:r>
+        <w:t>Pressing W/A/S/D should move the player Up/Down/Left/Right</w:t>
       </w:r>
     </w:p>
     <w:p>
@@ -79,15 +64,10 @@
           <w:ilvl w:val="0"/>
           <w:numId w:val="6"/>
         </w:numPr>
-        <w:spacing w:after="0" w:afterAutospacing="0"/>
-        <w:ind w:left="720" w:hanging="360"/>
-        <w:rPr/>
-      </w:pPr>
-      <w:r>
-        <w:rPr>
-          <w:rtl w:val="0"/>
-        </w:rPr>
-        <w:t xml:space="preserve">Pressing SPACE/RMB (right mouse button) should make the player dash in the direction they are moving in. If WASD is not pressed, the player will move in the cardinal direction of the last key pressed. If the player has not pressed WASD at all yet, the player will dash towards the bottom right.</w:t>
+        <w:spacing w:after="0"/>
+      </w:pPr>
+      <w:r>
+        <w:t>Pressing SPACE/RMB (right mouse button) should make the player dash in the direction they are moving in. If WASD is not pressed, the player will move in the cardinal direction of the last key pressed. If the player has not pressed WASD at all yet, the player will dash towards the bottom right.</w:t>
       </w:r>
     </w:p>
     <w:p>
@@ -96,27 +76,10 @@
           <w:ilvl w:val="1"/>
           <w:numId w:val="6"/>
         </w:numPr>
-        <w:spacing w:after="0" w:afterAutospacing="0"/>
-        <w:ind w:left="1440" w:hanging="360"/>
-        <w:rPr/>
-      </w:pPr>
-      <w:r>
-        <w:rPr>
-          <w:rtl w:val="0"/>
-        </w:rPr>
-        <w:t xml:space="preserve">Player starts with 3 dashes</w:t>
-      </w:r>
-      <w:r>
-        <w:rPr>
-          <w:rtl w:val="0"/>
-        </w:rPr>
-        <w:t xml:space="preserve">, dashes recharge after a cooldown of 3 seconds. </w:t>
-      </w:r>
-      <w:r>
-        <w:rPr>
-          <w:rtl w:val="0"/>
-        </w:rPr>
-        <w:t xml:space="preserve">Dash charge count and dash charge cooldown is displayed in the top left corner.</w:t>
+        <w:spacing w:after="0"/>
+      </w:pPr>
+      <w:r>
+        <w:t>Player starts with 3 dashes, dashes recharge after a cooldown of 3 seconds. Dash charge count and dash charge cooldown is displayed in the top left corner.</w:t>
       </w:r>
     </w:p>
     <w:p>
@@ -125,29 +88,22 @@
           <w:ilvl w:val="1"/>
           <w:numId w:val="6"/>
         </w:numPr>
-        <w:ind w:left="1440" w:hanging="360"/>
-        <w:rPr/>
-      </w:pPr>
-      <w:r>
-        <w:rPr>
-          <w:rtl w:val="0"/>
-        </w:rPr>
-        <w:t xml:space="preserve">Can’t dash while all dashes are recharging.</w:t>
-      </w:r>
-    </w:p>
-    <w:p>
-      <w:pPr>
-        <w:ind w:left="0" w:firstLine="0"/>
-        <w:rPr>
-          <w:b w:val="1"/>
-        </w:rPr>
-      </w:pPr>
-      <w:r>
-        <w:rPr>
-          <w:b w:val="1"/>
-          <w:rtl w:val="0"/>
-        </w:rPr>
-        <w:t xml:space="preserve">Shooting Controls</w:t>
+      </w:pPr>
+      <w:r>
+        <w:t>Can’t dash while all dashes are recharging.</w:t>
+      </w:r>
+    </w:p>
+    <w:p>
+      <w:pPr>
+        <w:rPr>
+          <w:b/>
+        </w:rPr>
+      </w:pPr>
+      <w:r>
+        <w:rPr>
+          <w:b/>
+        </w:rPr>
+        <w:t>Shooting Controls</w:t>
       </w:r>
     </w:p>
     <w:p>
@@ -156,15 +112,10 @@
           <w:ilvl w:val="0"/>
           <w:numId w:val="10"/>
         </w:numPr>
-        <w:spacing w:after="0" w:afterAutospacing="0"/>
-        <w:ind w:left="720" w:hanging="360"/>
-        <w:rPr/>
-      </w:pPr>
-      <w:r>
-        <w:rPr>
-          <w:rtl w:val="0"/>
-        </w:rPr>
-        <w:t xml:space="preserve">Aim with cursor, the aim indicator will follow the player’s cursor direction</w:t>
+        <w:spacing w:after="0"/>
+      </w:pPr>
+      <w:r>
+        <w:t>Aim with cursor, the aim indicator will follow the player’s cursor direction</w:t>
       </w:r>
     </w:p>
     <w:p>
@@ -173,15 +124,10 @@
           <w:ilvl w:val="0"/>
           <w:numId w:val="10"/>
         </w:numPr>
-        <w:spacing w:after="0" w:afterAutospacing="0"/>
-        <w:ind w:left="720" w:hanging="360"/>
-        <w:rPr/>
-      </w:pPr>
-      <w:r>
-        <w:rPr>
-          <w:rtl w:val="0"/>
-        </w:rPr>
-        <w:t xml:space="preserve">Press LMB (left mouse button) to shoot.</w:t>
+        <w:spacing w:after="0"/>
+      </w:pPr>
+      <w:r>
+        <w:t>Press LMB (left mouse button) to shoot.</w:t>
       </w:r>
     </w:p>
     <w:p>
@@ -190,28 +136,22 @@
           <w:ilvl w:val="1"/>
           <w:numId w:val="10"/>
         </w:numPr>
-        <w:ind w:left="1440" w:hanging="360"/>
-        <w:rPr/>
-      </w:pPr>
-      <w:r>
-        <w:rPr>
-          <w:rtl w:val="0"/>
-        </w:rPr>
-        <w:t xml:space="preserve">Pressing and holding should continuously shoot a chain of bullets</w:t>
-      </w:r>
-    </w:p>
-    <w:p>
-      <w:pPr>
-        <w:rPr>
-          <w:b w:val="1"/>
-        </w:rPr>
-      </w:pPr>
-      <w:r>
-        <w:rPr>
-          <w:b w:val="1"/>
-          <w:rtl w:val="0"/>
-        </w:rPr>
-        <w:t xml:space="preserve">Other Controls</w:t>
+      </w:pPr>
+      <w:r>
+        <w:t>Pressing and holding should continuously shoot a chain of bullets</w:t>
+      </w:r>
+    </w:p>
+    <w:p>
+      <w:pPr>
+        <w:rPr>
+          <w:b/>
+        </w:rPr>
+      </w:pPr>
+      <w:r>
+        <w:rPr>
+          <w:b/>
+        </w:rPr>
+        <w:t>Other Controls</w:t>
       </w:r>
     </w:p>
     <w:p>
@@ -220,27 +160,16 @@
           <w:ilvl w:val="0"/>
           <w:numId w:val="1"/>
         </w:numPr>
-        <w:spacing w:after="0" w:afterAutospacing="0"/>
-        <w:ind w:left="720" w:hanging="360"/>
-        <w:rPr/>
-      </w:pPr>
-      <w:r>
-        <w:rPr>
-          <w:rtl w:val="0"/>
-        </w:rPr>
+        <w:spacing w:after="0"/>
+      </w:pPr>
+      <w:r>
         <w:t xml:space="preserve">Pressing R should reset the game and </w:t>
       </w:r>
       <w:r>
         <w:rPr>
-          <w:color w:val="0000ff"/>
-          <w:rtl w:val="0"/>
-        </w:rPr>
-        <w:t xml:space="preserve">bring the player back to the title</w:t>
-      </w:r>
-      <w:r>
-        <w:rPr>
-          <w:rtl w:val="0"/>
-        </w:rPr>
+          <w:color w:val="0000FF"/>
+        </w:rPr>
+        <w:t>bring the player back to the title</w:t>
       </w:r>
     </w:p>
     <w:p>
@@ -249,34 +178,19 @@
           <w:ilvl w:val="0"/>
           <w:numId w:val="1"/>
         </w:numPr>
-        <w:spacing w:after="0" w:afterAutospacing="0"/>
-        <w:ind w:left="720" w:hanging="360"/>
-        <w:rPr/>
-      </w:pPr>
-      <w:r>
-        <w:rPr>
-          <w:rtl w:val="0"/>
-        </w:rPr>
+        <w:spacing w:after="0"/>
+      </w:pPr>
+      <w:r>
         <w:t xml:space="preserve">Pressing </w:t>
       </w:r>
       <w:r>
         <w:rPr>
-          <w:color w:val="0000ff"/>
-          <w:rtl w:val="0"/>
-        </w:rPr>
-        <w:t xml:space="preserve">L</w:t>
-      </w:r>
-      <w:r>
-        <w:rPr>
-          <w:rtl w:val="0"/>
-        </w:rPr>
-        <w:t xml:space="preserve"> should exit the game.</w:t>
-      </w:r>
-      <w:r>
-        <w:rPr>
-          <w:rtl w:val="0"/>
-        </w:rPr>
-        <w:t xml:space="preserve"> Temporary function until the pause menu is setup to allow exiting the game </w:t>
+          <w:color w:val="0000FF"/>
+        </w:rPr>
+        <w:t>L</w:t>
+      </w:r>
+      <w:r>
+        <w:t xml:space="preserve"> should exit the game. Temporary function until the pause menu is setup to allow exiting the game </w:t>
       </w:r>
     </w:p>
     <w:p>
@@ -285,65 +199,28 @@
           <w:ilvl w:val="0"/>
           <w:numId w:val="1"/>
         </w:numPr>
-        <w:spacing w:after="0" w:afterAutospacing="0"/>
-        <w:ind w:left="720" w:hanging="360"/>
-        <w:rPr/>
-      </w:pPr>
-      <w:r>
-        <w:rPr>
-          <w:rtl w:val="0"/>
-        </w:rPr>
+        <w:spacing w:after="0"/>
+      </w:pPr>
+      <w:r>
         <w:t xml:space="preserve">Pressing </w:t>
       </w:r>
       <w:r>
         <w:rPr>
-          <w:color w:val="0000ff"/>
-          <w:rtl w:val="0"/>
-        </w:rPr>
-        <w:t xml:space="preserve">ESC</w:t>
-      </w:r>
-      <w:r>
-        <w:rPr>
-          <w:rtl w:val="0"/>
-        </w:rPr>
-        <w:t xml:space="preserve"> should pause the game.</w:t>
-      </w:r>
-      <w:r>
-        <w:rPr>
-          <w:rtl w:val="0"/>
-        </w:rPr>
-        <w:t xml:space="preserve"> </w:t>
-      </w:r>
-      <w:r>
-        <w:rPr>
-          <w:rtl w:val="0"/>
-        </w:rPr>
-        <w:t xml:space="preserve">No other input should be processed while the game is paused</w:t>
-      </w:r>
-      <w:r>
-        <w:rPr>
-          <w:rtl w:val="0"/>
-        </w:rPr>
-        <w:t xml:space="preserve">, aside from </w:t>
-      </w:r>
-      <w:r>
-        <w:rPr>
-          <w:color w:val="0000ff"/>
-          <w:rtl w:val="0"/>
+          <w:color w:val="0000FF"/>
+        </w:rPr>
+        <w:t>ESC</w:t>
+      </w:r>
+      <w:r>
+        <w:t xml:space="preserve"> should pause the game. No other input should be processed while the game is paused, aside from </w:t>
+      </w:r>
+      <w:r>
+        <w:rPr>
+          <w:color w:val="0000FF"/>
         </w:rPr>
         <w:t xml:space="preserve">L </w:t>
       </w:r>
       <w:r>
-        <w:rPr>
-          <w:rtl w:val="0"/>
-        </w:rPr>
-        <w:t xml:space="preserve">and R. </w:t>
-      </w:r>
-      <w:r>
-        <w:rPr>
-          <w:rtl w:val="0"/>
-        </w:rPr>
-        <w:t xml:space="preserve">Currently also displays all the controls while the game is paused.</w:t>
+        <w:t>and R. Currently also displays all the controls while the game is paused.</w:t>
       </w:r>
     </w:p>
     <w:p>
@@ -352,15 +229,10 @@
           <w:ilvl w:val="0"/>
           <w:numId w:val="1"/>
         </w:numPr>
-        <w:spacing w:after="0" w:afterAutospacing="0"/>
-        <w:ind w:left="720" w:hanging="360"/>
-        <w:rPr/>
-      </w:pPr>
-      <w:r>
-        <w:rPr>
-          <w:rtl w:val="0"/>
-        </w:rPr>
-        <w:t xml:space="preserve">Pressing C should turn circle and AABB collider visuals on/off</w:t>
+        <w:spacing w:after="0"/>
+      </w:pPr>
+      <w:r>
+        <w:t>Pressing C should turn circle and AABB collider visuals on/off</w:t>
       </w:r>
     </w:p>
     <w:p>
@@ -369,27 +241,18 @@
           <w:ilvl w:val="0"/>
           <w:numId w:val="1"/>
         </w:numPr>
-        <w:spacing w:after="0" w:afterAutospacing="0"/>
-        <w:ind w:left="720" w:hanging="360"/>
-        <w:rPr/>
-      </w:pPr>
-      <w:r>
-        <w:rPr>
-          <w:rtl w:val="0"/>
-        </w:rPr>
-        <w:t xml:space="preserve">Pressing/</w:t>
-      </w:r>
-      <w:r>
-        <w:rPr>
-          <w:color w:val="0000ff"/>
-          <w:rtl w:val="0"/>
-        </w:rPr>
-        <w:t xml:space="preserve">Holding</w:t>
-      </w:r>
-      <w:r>
-        <w:rPr>
-          <w:rtl w:val="0"/>
-        </w:rPr>
+        <w:spacing w:after="0"/>
+      </w:pPr>
+      <w:r>
+        <w:t>Pressing/</w:t>
+      </w:r>
+      <w:r>
+        <w:rPr>
+          <w:color w:val="0000FF"/>
+        </w:rPr>
+        <w:t>Holding</w:t>
+      </w:r>
+      <w:r>
         <w:t xml:space="preserve"> -/= should decrease/increase game audio volume</w:t>
       </w:r>
     </w:p>
@@ -399,41 +262,31 @@
           <w:ilvl w:val="0"/>
           <w:numId w:val="1"/>
         </w:numPr>
-        <w:ind w:left="720" w:hanging="360"/>
-        <w:rPr/>
-      </w:pPr>
-      <w:r>
-        <w:rPr>
-          <w:rtl w:val="0"/>
-        </w:rPr>
+      </w:pPr>
+      <w:r>
         <w:t xml:space="preserve">Pressing E will progress the current dialogue/pull up a new one (depends on scenario, more in </w:t>
       </w:r>
       <w:r>
         <w:rPr>
-          <w:b w:val="1"/>
-          <w:rtl w:val="0"/>
+          <w:b/>
         </w:rPr>
         <w:t xml:space="preserve">Dialogue </w:t>
       </w:r>
       <w:r>
-        <w:rPr>
-          <w:rtl w:val="0"/>
-        </w:rPr>
-        <w:t xml:space="preserve">section)</w:t>
-      </w:r>
-    </w:p>
-    <w:p>
-      <w:pPr>
-        <w:rPr>
-          <w:b w:val="1"/>
-        </w:rPr>
-      </w:pPr>
-      <w:r>
-        <w:rPr>
-          <w:b w:val="1"/>
-          <w:rtl w:val="0"/>
-        </w:rPr>
-        <w:t xml:space="preserve">Collisions</w:t>
+        <w:t>section)</w:t>
+      </w:r>
+    </w:p>
+    <w:p>
+      <w:pPr>
+        <w:rPr>
+          <w:b/>
+        </w:rPr>
+      </w:pPr>
+      <w:r>
+        <w:rPr>
+          <w:b/>
+        </w:rPr>
+        <w:t>Collisions</w:t>
       </w:r>
     </w:p>
     <w:p>
@@ -442,15 +295,10 @@
           <w:ilvl w:val="0"/>
           <w:numId w:val="8"/>
         </w:numPr>
-        <w:spacing w:after="0" w:afterAutospacing="0"/>
-        <w:ind w:left="720" w:hanging="360"/>
-        <w:rPr/>
-      </w:pPr>
-      <w:r>
-        <w:rPr>
-          <w:rtl w:val="0"/>
-        </w:rPr>
-        <w:t xml:space="preserve">Player moving into a wall should move the player back to an acceptable location. There should be no jitter.</w:t>
+        <w:spacing w:after="0"/>
+      </w:pPr>
+      <w:r>
+        <w:t>Player moving into a wall should move the player back to an acceptable location. There should be no jitter.</w:t>
       </w:r>
     </w:p>
     <w:p>
@@ -459,27 +307,10 @@
           <w:ilvl w:val="0"/>
           <w:numId w:val="8"/>
         </w:numPr>
-        <w:spacing w:after="0" w:afterAutospacing="0"/>
-        <w:ind w:left="720" w:hanging="360"/>
-        <w:rPr/>
-      </w:pPr>
-      <w:r>
-        <w:rPr>
-          <w:rtl w:val="0"/>
-        </w:rPr>
-        <w:t xml:space="preserve">Player colliding with enemy should </w:t>
-      </w:r>
-      <w:r>
-        <w:rPr>
-          <w:rtl w:val="0"/>
-        </w:rPr>
-        <w:t xml:space="preserve">add a</w:t>
-      </w:r>
-      <w:r>
-        <w:rPr>
-          <w:rtl w:val="0"/>
-        </w:rPr>
-        <w:t xml:space="preserve">n inert bullet onto the stack</w:t>
+        <w:spacing w:after="0"/>
+      </w:pPr>
+      <w:r>
+        <w:t>Player colliding with enemy should add an inert bullet onto the stack</w:t>
       </w:r>
     </w:p>
     <w:p>
@@ -488,21 +319,10 @@
           <w:ilvl w:val="0"/>
           <w:numId w:val="8"/>
         </w:numPr>
-        <w:spacing w:after="0" w:afterAutospacing="0"/>
-        <w:ind w:left="720" w:hanging="360"/>
-        <w:rPr/>
-      </w:pPr>
-      <w:r>
-        <w:rPr>
-          <w:rtl w:val="0"/>
-        </w:rPr>
-        <w:t xml:space="preserve">Player colliding with enemy bullets should add a bullet onto the stack with an effect attached to it that will modify the player’s stats. </w:t>
-      </w:r>
-      <w:r>
-        <w:rPr>
-          <w:rtl w:val="0"/>
-        </w:rPr>
-        <w:t xml:space="preserve">Enemy bullets get deleted upon colliding with the player unless they have pierce. </w:t>
+        <w:spacing w:after="0"/>
+      </w:pPr>
+      <w:r>
+        <w:t xml:space="preserve">Player colliding with enemy bullets should add a bullet onto the stack with an effect attached to it that will modify the player’s stats. Enemy bullets get deleted upon colliding with the player unless they have pierce. </w:t>
       </w:r>
     </w:p>
     <w:p>
@@ -511,15 +331,10 @@
           <w:ilvl w:val="0"/>
           <w:numId w:val="8"/>
         </w:numPr>
-        <w:spacing w:after="0" w:afterAutospacing="0"/>
-        <w:ind w:left="720" w:hanging="360"/>
-        <w:rPr/>
-      </w:pPr>
-      <w:r>
-        <w:rPr>
-          <w:rtl w:val="0"/>
-        </w:rPr>
-        <w:t xml:space="preserve">Enemy colliding with player bullets should make the enemy lose HP. Player bullet should be deleted unless the bullet has pierce</w:t>
+        <w:spacing w:after="0"/>
+      </w:pPr>
+      <w:r>
+        <w:t>Enemy colliding with player bullets should make the enemy lose HP. Player bullet should be deleted unless the bullet has pierce</w:t>
       </w:r>
     </w:p>
     <w:p>
@@ -528,15 +343,10 @@
           <w:ilvl w:val="0"/>
           <w:numId w:val="8"/>
         </w:numPr>
-        <w:spacing w:after="0" w:afterAutospacing="0"/>
-        <w:ind w:left="720" w:hanging="360"/>
-        <w:rPr/>
-      </w:pPr>
-      <w:r>
-        <w:rPr>
-          <w:rtl w:val="0"/>
-        </w:rPr>
-        <w:t xml:space="preserve">Player or enemy bullets colliding with walls should bounce off or be deleted.</w:t>
+        <w:spacing w:after="0"/>
+      </w:pPr>
+      <w:r>
+        <w:t>Player or enemy bullets colliding with walls should bounce off or be deleted.</w:t>
       </w:r>
     </w:p>
     <w:p>
@@ -545,28 +355,22 @@
           <w:ilvl w:val="0"/>
           <w:numId w:val="8"/>
         </w:numPr>
-        <w:ind w:left="720" w:hanging="360"/>
-        <w:rPr/>
-      </w:pPr>
-      <w:r>
-        <w:rPr>
-          <w:rtl w:val="0"/>
-        </w:rPr>
-        <w:t xml:space="preserve">Players colliding with the door (shown by a red line) should transport them to the room behind the door, unless a) the door leads to no room, thus the player won’t be able to walk through it, or b) the player has not yet cleared the room of enemies.</w:t>
-      </w:r>
-    </w:p>
-    <w:p>
-      <w:pPr>
-        <w:rPr>
-          <w:b w:val="1"/>
-        </w:rPr>
-      </w:pPr>
-      <w:r>
-        <w:rPr>
-          <w:b w:val="1"/>
-          <w:rtl w:val="0"/>
-        </w:rPr>
-        <w:t xml:space="preserve">Bullet Stack</w:t>
+      </w:pPr>
+      <w:r>
+        <w:t>Players colliding with the door (shown by a red line) should transport them to the room behind the door, unless a) the door leads to no room, thus the player won’t be able to walk through it, or b) the player has not yet cleared the room of enemies.</w:t>
+      </w:r>
+    </w:p>
+    <w:p>
+      <w:pPr>
+        <w:rPr>
+          <w:b/>
+        </w:rPr>
+      </w:pPr>
+      <w:r>
+        <w:rPr>
+          <w:b/>
+        </w:rPr>
+        <w:t>Bullet Stack</w:t>
       </w:r>
     </w:p>
     <w:p>
@@ -575,15 +379,11 @@
           <w:ilvl w:val="0"/>
           <w:numId w:val="12"/>
         </w:numPr>
-        <w:spacing w:after="0" w:afterAutospacing="0"/>
-        <w:ind w:left="720" w:hanging="360"/>
-        <w:rPr/>
-      </w:pPr>
-      <w:r>
-        <w:rPr>
-          <w:rtl w:val="0"/>
-        </w:rPr>
-        <w:t xml:space="preserve">Each time the player gets hit by a bullet, an extra bullet should be visible on the stack UI to the top left of the screen, and the stack count should go up. When a bullet is added to the stack, its effects should modify the player stats.</w:t>
+        <w:spacing w:after="0"/>
+      </w:pPr>
+      <w:r>
+        <w:lastRenderedPageBreak/>
+        <w:t>Each time the player gets hit by a bullet, an extra bullet should be visible on the stack UI to the top left of the screen, and the stack count should go up. When a bullet is added to the stack, its effects should modify the player stats.</w:t>
       </w:r>
     </w:p>
     <w:p>
@@ -592,15 +392,10 @@
           <w:ilvl w:val="1"/>
           <w:numId w:val="12"/>
         </w:numPr>
-        <w:spacing w:after="0" w:afterAutospacing="0"/>
-        <w:ind w:left="1440" w:hanging="360"/>
-        <w:rPr/>
-      </w:pPr>
-      <w:r>
-        <w:rPr>
-          <w:rtl w:val="0"/>
-        </w:rPr>
-        <w:t xml:space="preserve">Some bullets give multiple effects; these bullets will have multiple colours (up to 2 for now). When being hit by these bullets, multiple corresponding effects will be placed on the stack.</w:t>
+        <w:spacing w:after="0"/>
+      </w:pPr>
+      <w:r>
+        <w:t>Some bullets give multiple effects; these bullets will have multiple colours (up to 2 for now). When being hit by these bullets, multiple corresponding effects will be placed on the stack.</w:t>
       </w:r>
     </w:p>
     <w:p>
@@ -609,18 +404,16 @@
           <w:ilvl w:val="1"/>
           <w:numId w:val="12"/>
         </w:numPr>
-        <w:spacing w:after="0" w:afterAutospacing="0"/>
-        <w:ind w:left="1440" w:hanging="360"/>
-        <w:rPr>
-          <w:color w:val="0000ff"/>
-        </w:rPr>
-      </w:pPr>
-      <w:r>
-        <w:rPr>
-          <w:color w:val="0000ff"/>
-          <w:rtl w:val="0"/>
-        </w:rPr>
-        <w:t xml:space="preserve">bullets with effects have special color and emit a particle trail when fired</w:t>
+        <w:spacing w:after="0"/>
+        <w:rPr>
+          <w:color w:val="0000FF"/>
+        </w:rPr>
+      </w:pPr>
+      <w:r>
+        <w:rPr>
+          <w:color w:val="0000FF"/>
+        </w:rPr>
+        <w:t>bullets with effects have special color and emit a particle trail when fired</w:t>
       </w:r>
     </w:p>
     <w:p>
@@ -629,18 +422,16 @@
           <w:ilvl w:val="1"/>
           <w:numId w:val="12"/>
         </w:numPr>
-        <w:spacing w:after="0" w:afterAutospacing="0"/>
-        <w:ind w:left="1440" w:hanging="360"/>
-        <w:rPr>
-          <w:color w:val="0000ff"/>
-        </w:rPr>
-      </w:pPr>
-      <w:r>
-        <w:rPr>
-          <w:color w:val="0000ff"/>
-          <w:rtl w:val="0"/>
-        </w:rPr>
-        <w:t xml:space="preserve">the effects on the stack are viewable in the pause menu (Esc) when hovering over the bullets on the stack UI</w:t>
+        <w:spacing w:after="0"/>
+        <w:rPr>
+          <w:color w:val="0000FF"/>
+        </w:rPr>
+      </w:pPr>
+      <w:r>
+        <w:rPr>
+          <w:color w:val="0000FF"/>
+        </w:rPr>
+        <w:t>the effects on the stack are viewable in the pause menu (Esc) when hovering over the bullets on the stack UI</w:t>
       </w:r>
     </w:p>
     <w:p>
@@ -649,19 +440,16 @@
           <w:ilvl w:val="1"/>
           <w:numId w:val="12"/>
         </w:numPr>
-        <w:spacing w:after="0" w:afterAutospacing="0"/>
-        <w:ind w:left="1440" w:hanging="360"/>
-        <w:rPr>
-          <w:color w:val="0000ff"/>
-          <w:u w:val="none"/>
-        </w:rPr>
-      </w:pPr>
-      <w:r>
-        <w:rPr>
-          <w:color w:val="0000ff"/>
-          <w:rtl w:val="0"/>
-        </w:rPr>
-        <w:t xml:space="preserve">In addition to bullets that modify player stats, we also have a key bullet used to unlock locked rooms.</w:t>
+        <w:spacing w:after="0"/>
+        <w:rPr>
+          <w:color w:val="0000FF"/>
+        </w:rPr>
+      </w:pPr>
+      <w:r>
+        <w:rPr>
+          <w:color w:val="0000FF"/>
+        </w:rPr>
+        <w:t>In addition to bullets that modify player stats, we also have a key bullet used to unlock locked rooms.</w:t>
       </w:r>
     </w:p>
     <w:p>
@@ -670,28 +458,17 @@
           <w:ilvl w:val="0"/>
           <w:numId w:val="12"/>
         </w:numPr>
-        <w:spacing w:after="0" w:afterAutospacing="0"/>
-        <w:ind w:left="720" w:hanging="360"/>
-        <w:rPr/>
-      </w:pPr>
-      <w:r>
-        <w:rPr>
-          <w:rtl w:val="0"/>
-        </w:rPr>
-        <w:t xml:space="preserve">Bullet Attack Pattern Types</w:t>
-      </w:r>
-      <w:r>
-        <w:rPr>
-          <w:strike w:val="1"/>
-          <w:rtl w:val="0"/>
+        <w:spacing w:after="0"/>
+      </w:pPr>
+      <w:r>
+        <w:t>Bullet Attack Pattern Types</w:t>
+      </w:r>
+      <w:r>
+        <w:rPr>
+          <w:strike/>
         </w:rPr>
         <w:t xml:space="preserve"> </w:t>
       </w:r>
-      <w:r>
-        <w:rPr>
-          <w:rtl w:val="0"/>
-        </w:rPr>
-      </w:r>
     </w:p>
     <w:p>
       <w:pPr>
@@ -699,20 +476,18 @@
           <w:ilvl w:val="1"/>
           <w:numId w:val="12"/>
         </w:numPr>
-        <w:spacing w:after="0" w:afterAutospacing="0"/>
-        <w:ind w:left="1440" w:hanging="360"/>
-        <w:rPr>
-          <w:strike w:val="1"/>
+        <w:spacing w:after="0"/>
+        <w:rPr>
+          <w:strike/>
           <w:color w:val="980000"/>
         </w:rPr>
       </w:pPr>
       <w:r>
         <w:rPr>
-          <w:strike w:val="1"/>
+          <w:strike/>
           <w:color w:val="980000"/>
-          <w:rtl w:val="0"/>
-        </w:rPr>
-        <w:t xml:space="preserve">Inert (grey): this bullet gives no extra effects, and is currently obtained when colliding with the enemy or when colliding with grey enemy bullets.</w:t>
+        </w:rPr>
+        <w:t>Inert (grey): this bullet gives no extra effects, and is currently obtained when colliding with the enemy or when colliding with grey enemy bullets.</w:t>
       </w:r>
     </w:p>
     <w:p>
@@ -721,20 +496,18 @@
           <w:ilvl w:val="1"/>
           <w:numId w:val="12"/>
         </w:numPr>
-        <w:spacing w:after="0" w:afterAutospacing="0"/>
-        <w:ind w:left="1440" w:hanging="360"/>
-        <w:rPr>
-          <w:strike w:val="1"/>
+        <w:spacing w:after="0"/>
+        <w:rPr>
+          <w:strike/>
           <w:color w:val="980000"/>
         </w:rPr>
       </w:pPr>
       <w:r>
         <w:rPr>
-          <w:strike w:val="1"/>
+          <w:strike/>
           <w:color w:val="980000"/>
-          <w:rtl w:val="0"/>
-        </w:rPr>
-        <w:t xml:space="preserve">Bullet size up (red): increases the player’s projectile size by an additive amount.</w:t>
+        </w:rPr>
+        <w:t>Bullet size up (red): increases the player’s projectile size by an additive amount.</w:t>
       </w:r>
     </w:p>
     <w:p>
@@ -743,20 +516,18 @@
           <w:ilvl w:val="1"/>
           <w:numId w:val="12"/>
         </w:numPr>
-        <w:spacing w:after="0" w:afterAutospacing="0"/>
-        <w:ind w:left="1440" w:hanging="360"/>
-        <w:rPr>
-          <w:strike w:val="1"/>
+        <w:spacing w:after="0"/>
+        <w:rPr>
+          <w:strike/>
           <w:color w:val="980000"/>
         </w:rPr>
       </w:pPr>
       <w:r>
         <w:rPr>
-          <w:strike w:val="1"/>
+          <w:strike/>
           <w:color w:val="980000"/>
-          <w:rtl w:val="0"/>
-        </w:rPr>
-        <w:t xml:space="preserve">Dash charge up (light blue): increases the player’s max dash charges by one.</w:t>
+        </w:rPr>
+        <w:t>Dash charge up (light blue): increases the player’s max dash charges by one.</w:t>
       </w:r>
     </w:p>
     <w:p>
@@ -765,20 +536,18 @@
           <w:ilvl w:val="1"/>
           <w:numId w:val="12"/>
         </w:numPr>
-        <w:spacing w:after="0" w:afterAutospacing="0"/>
-        <w:ind w:left="1440" w:hanging="360"/>
-        <w:rPr>
-          <w:strike w:val="1"/>
+        <w:spacing w:after="0"/>
+        <w:rPr>
+          <w:strike/>
           <w:color w:val="980000"/>
         </w:rPr>
       </w:pPr>
       <w:r>
         <w:rPr>
-          <w:strike w:val="1"/>
+          <w:strike/>
           <w:color w:val="980000"/>
-          <w:rtl w:val="0"/>
-        </w:rPr>
-        <w:t xml:space="preserve">Number of bullets up (dark blue): increases the number of bullets the player shoots at once by one.</w:t>
+        </w:rPr>
+        <w:t>Number of bullets up (dark blue): increases the number of bullets the player shoots at once by one.</w:t>
       </w:r>
     </w:p>
     <w:p>
@@ -787,15 +556,10 @@
           <w:ilvl w:val="1"/>
           <w:numId w:val="12"/>
         </w:numPr>
-        <w:spacing w:after="0" w:afterAutospacing="0"/>
-        <w:ind w:left="1440" w:hanging="360"/>
-        <w:rPr/>
-      </w:pPr>
-      <w:r>
-        <w:rPr>
-          <w:rtl w:val="0"/>
-        </w:rPr>
-        <w:t xml:space="preserve">Homing bullets that spawn more bullets upon impact</w:t>
+        <w:spacing w:after="0"/>
+      </w:pPr>
+      <w:r>
+        <w:t>Homing bullets that spawn more bullets upon impact</w:t>
       </w:r>
     </w:p>
     <w:p>
@@ -804,18 +568,16 @@
           <w:ilvl w:val="1"/>
           <w:numId w:val="12"/>
         </w:numPr>
-        <w:spacing w:after="0" w:afterAutospacing="0"/>
-        <w:ind w:left="1440" w:hanging="360"/>
-        <w:rPr>
-          <w:color w:val="0000ff"/>
-        </w:rPr>
-      </w:pPr>
-      <w:r>
-        <w:rPr>
-          <w:color w:val="0000ff"/>
-          <w:rtl w:val="0"/>
-        </w:rPr>
-        <w:t xml:space="preserve">Rotating laser, sixshot, four all round have no effects (inert)</w:t>
+        <w:spacing w:after="0"/>
+        <w:rPr>
+          <w:color w:val="0000FF"/>
+        </w:rPr>
+      </w:pPr>
+      <w:r>
+        <w:rPr>
+          <w:color w:val="0000FF"/>
+        </w:rPr>
+        <w:t>Rotating laser, sixshot, four all round have no effects (inert)</w:t>
       </w:r>
     </w:p>
     <w:p>
@@ -824,18 +586,16 @@
           <w:ilvl w:val="1"/>
           <w:numId w:val="12"/>
         </w:numPr>
-        <w:spacing w:after="0" w:afterAutospacing="0"/>
-        <w:ind w:left="1440" w:hanging="360"/>
-        <w:rPr>
-          <w:color w:val="0000ff"/>
-        </w:rPr>
-      </w:pPr>
-      <w:r>
-        <w:rPr>
-          <w:color w:val="0000ff"/>
-          <w:rtl w:val="0"/>
-        </w:rPr>
-        <w:t xml:space="preserve">Trail - stationary and have a chance spawn bullet to increase player damage when added to stack</w:t>
+        <w:spacing w:after="0"/>
+        <w:rPr>
+          <w:color w:val="0000FF"/>
+        </w:rPr>
+      </w:pPr>
+      <w:r>
+        <w:rPr>
+          <w:color w:val="0000FF"/>
+        </w:rPr>
+        <w:t>Trail - stationary and have a chance spawn bullet to increase player damage when added to stack</w:t>
       </w:r>
     </w:p>
     <w:p>
@@ -844,19 +604,16 @@
           <w:ilvl w:val="2"/>
           <w:numId w:val="12"/>
         </w:numPr>
-        <w:spacing w:after="0" w:afterAutospacing="0"/>
-        <w:ind w:left="2160" w:hanging="360"/>
-        <w:rPr>
-          <w:color w:val="0000ff"/>
-          <w:u w:val="none"/>
-        </w:rPr>
-      </w:pPr>
-      <w:r>
-        <w:rPr>
-          <w:color w:val="0000ff"/>
-          <w:rtl w:val="0"/>
-        </w:rPr>
-        <w:t xml:space="preserve">Hard snail trail - spawns additional inert bullets when destroyed</w:t>
+        <w:spacing w:after="0"/>
+        <w:rPr>
+          <w:color w:val="0000FF"/>
+        </w:rPr>
+      </w:pPr>
+      <w:r>
+        <w:rPr>
+          <w:color w:val="0000FF"/>
+        </w:rPr>
+        <w:t>Hard snail trail - spawns additional inert bullets when destroyed</w:t>
       </w:r>
     </w:p>
     <w:p>
@@ -865,19 +622,16 @@
           <w:ilvl w:val="1"/>
           <w:numId w:val="12"/>
         </w:numPr>
-        <w:spacing w:after="0" w:afterAutospacing="0"/>
-        <w:ind w:left="1440" w:hanging="360"/>
-        <w:rPr>
-          <w:color w:val="0000ff"/>
-          <w:u w:val="none"/>
-        </w:rPr>
-      </w:pPr>
-      <w:r>
-        <w:rPr>
-          <w:color w:val="0000ff"/>
-          <w:rtl w:val="0"/>
-        </w:rPr>
-        <w:t xml:space="preserve">Wave - have a chance to spawn bullet to reduce damage but increase number of bullets per shot</w:t>
+        <w:spacing w:after="0"/>
+        <w:rPr>
+          <w:color w:val="0000FF"/>
+        </w:rPr>
+      </w:pPr>
+      <w:r>
+        <w:rPr>
+          <w:color w:val="0000FF"/>
+        </w:rPr>
+        <w:t>Wave - have a chance to spawn bullet to reduce damage but increase number of bullets per shot</w:t>
       </w:r>
     </w:p>
     <w:p>
@@ -886,19 +640,16 @@
           <w:ilvl w:val="1"/>
           <w:numId w:val="12"/>
         </w:numPr>
-        <w:spacing w:after="0" w:afterAutospacing="0"/>
-        <w:ind w:left="1440" w:hanging="360"/>
-        <w:rPr>
-          <w:color w:val="0000ff"/>
-          <w:u w:val="none"/>
-        </w:rPr>
-      </w:pPr>
-      <w:r>
-        <w:rPr>
-          <w:color w:val="0000ff"/>
-          <w:rtl w:val="0"/>
-        </w:rPr>
-        <w:t xml:space="preserve">Non-rotating laser - chance spawn bullet that increase number of bounces on the wall before bullet is destroyed</w:t>
+        <w:spacing w:after="0"/>
+        <w:rPr>
+          <w:color w:val="0000FF"/>
+        </w:rPr>
+      </w:pPr>
+      <w:r>
+        <w:rPr>
+          <w:color w:val="0000FF"/>
+        </w:rPr>
+        <w:t>Non-rotating laser - chance spawn bullet that increase number of bounces on the wall before bullet is destroyed</w:t>
       </w:r>
     </w:p>
     <w:p>
@@ -907,19 +658,16 @@
           <w:ilvl w:val="1"/>
           <w:numId w:val="12"/>
         </w:numPr>
-        <w:spacing w:after="0" w:afterAutospacing="0"/>
-        <w:ind w:left="1440" w:hanging="360"/>
-        <w:rPr>
-          <w:color w:val="0000ff"/>
-          <w:u w:val="none"/>
-        </w:rPr>
-      </w:pPr>
-      <w:r>
-        <w:rPr>
-          <w:color w:val="0000ff"/>
-          <w:rtl w:val="0"/>
-        </w:rPr>
-        <w:t xml:space="preserve">Three shot - chance to spawn bullet to reduce dash CDR</w:t>
+        <w:spacing w:after="0"/>
+        <w:rPr>
+          <w:color w:val="0000FF"/>
+        </w:rPr>
+      </w:pPr>
+      <w:r>
+        <w:rPr>
+          <w:color w:val="0000FF"/>
+        </w:rPr>
+        <w:t>Three shot - chance to spawn bullet to reduce dash CDR</w:t>
       </w:r>
     </w:p>
     <w:p>
@@ -928,19 +676,16 @@
           <w:ilvl w:val="1"/>
           <w:numId w:val="12"/>
         </w:numPr>
-        <w:spacing w:after="0" w:afterAutospacing="0"/>
-        <w:ind w:left="1440" w:hanging="360"/>
-        <w:rPr>
-          <w:color w:val="0000ff"/>
-          <w:u w:val="none"/>
-        </w:rPr>
-      </w:pPr>
-      <w:r>
-        <w:rPr>
-          <w:color w:val="0000ff"/>
-          <w:rtl w:val="0"/>
-        </w:rPr>
-        <w:t xml:space="preserve">Missile - chance to spawn bullets that increase bullet spread and size</w:t>
+        <w:spacing w:after="0"/>
+        <w:rPr>
+          <w:color w:val="0000FF"/>
+        </w:rPr>
+      </w:pPr>
+      <w:r>
+        <w:rPr>
+          <w:color w:val="0000FF"/>
+        </w:rPr>
+        <w:t>Missile - chance to spawn bullets that increase bullet spread and size</w:t>
       </w:r>
     </w:p>
     <w:p>
@@ -949,19 +694,16 @@
           <w:ilvl w:val="1"/>
           <w:numId w:val="12"/>
         </w:numPr>
-        <w:spacing w:after="0" w:afterAutospacing="0"/>
-        <w:ind w:left="1440" w:hanging="360"/>
-        <w:rPr>
-          <w:color w:val="0000ff"/>
-          <w:u w:val="none"/>
-        </w:rPr>
-      </w:pPr>
-      <w:r>
-        <w:rPr>
-          <w:color w:val="0000ff"/>
-          <w:rtl w:val="0"/>
-        </w:rPr>
-        <w:t xml:space="preserve">Radial burst and radial polygon - chance to spawn bullets that increase size and bullet count</w:t>
+        <w:spacing w:after="0"/>
+        <w:rPr>
+          <w:color w:val="0000FF"/>
+        </w:rPr>
+      </w:pPr>
+      <w:r>
+        <w:rPr>
+          <w:color w:val="0000FF"/>
+        </w:rPr>
+        <w:t>Radial burst and radial polygon - chance to spawn bullets that increase size and bullet count</w:t>
       </w:r>
     </w:p>
     <w:p>
@@ -970,32 +712,28 @@
           <w:ilvl w:val="1"/>
           <w:numId w:val="12"/>
         </w:numPr>
-        <w:ind w:left="1440" w:hanging="360"/>
-        <w:rPr>
-          <w:color w:val="0000ff"/>
-          <w:u w:val="none"/>
-        </w:rPr>
-      </w:pPr>
-      <w:r>
-        <w:rPr>
-          <w:color w:val="0000ff"/>
-          <w:rtl w:val="0"/>
-        </w:rPr>
-        <w:t xml:space="preserve">Additionally, some enemies have a chance of shooting out a key bullet.</w:t>
-      </w:r>
-    </w:p>
-    <w:p>
-      <w:pPr>
-        <w:rPr>
-          <w:b w:val="1"/>
-        </w:rPr>
-      </w:pPr>
-      <w:r>
-        <w:rPr>
-          <w:b w:val="1"/>
-          <w:rtl w:val="0"/>
-        </w:rPr>
-        <w:t xml:space="preserve">Enemy AI</w:t>
+        <w:rPr>
+          <w:color w:val="0000FF"/>
+        </w:rPr>
+      </w:pPr>
+      <w:r>
+        <w:rPr>
+          <w:color w:val="0000FF"/>
+        </w:rPr>
+        <w:t>Additionally, some enemies have a chance of shooting out a key bullet.</w:t>
+      </w:r>
+    </w:p>
+    <w:p>
+      <w:pPr>
+        <w:rPr>
+          <w:b/>
+        </w:rPr>
+      </w:pPr>
+      <w:r>
+        <w:rPr>
+          <w:b/>
+        </w:rPr>
+        <w:t>Enemy AI</w:t>
       </w:r>
     </w:p>
     <w:p>
@@ -1004,27 +742,10 @@
           <w:ilvl w:val="0"/>
           <w:numId w:val="9"/>
         </w:numPr>
-        <w:spacing w:after="0" w:afterAutospacing="0"/>
-        <w:ind w:left="720" w:hanging="360"/>
-        <w:rPr/>
-      </w:pPr>
-      <w:r>
-        <w:rPr>
-          <w:rtl w:val="0"/>
-        </w:rPr>
-        <w:t xml:space="preserve">Enemy can either follow the player, randomly move around, or </w:t>
-      </w:r>
-      <w:r>
-        <w:rPr>
-          <w:rtl w:val="0"/>
-        </w:rPr>
-        <w:t xml:space="preserve">patrol on a set path </w:t>
-      </w:r>
-      <w:r>
-        <w:rPr>
-          <w:rtl w:val="0"/>
-        </w:rPr>
-        <w:t xml:space="preserve">using LERP for enemy position and rotation. </w:t>
+        <w:spacing w:after="0"/>
+      </w:pPr>
+      <w:r>
+        <w:t xml:space="preserve">Enemy can either follow the player, randomly move around, or patrol on a set path using LERP for enemy position and rotation. </w:t>
       </w:r>
     </w:p>
     <w:p>
@@ -1033,15 +754,10 @@
           <w:ilvl w:val="1"/>
           <w:numId w:val="9"/>
         </w:numPr>
-        <w:spacing w:after="0" w:afterAutospacing="0"/>
-        <w:ind w:left="1440" w:hanging="360"/>
-        <w:rPr/>
-      </w:pPr>
-      <w:r>
-        <w:rPr>
-          <w:rtl w:val="0"/>
-        </w:rPr>
-        <w:t xml:space="preserve">Follow player: enemy position and rotation should follow where the player is. If the player doesn’t move after the enemy has reached the player position, it will stay there.</w:t>
+        <w:spacing w:after="0"/>
+      </w:pPr>
+      <w:r>
+        <w:t>Follow player: enemy position and rotation should follow where the player is. If the player doesn’t move after the enemy has reached the player position, it will stay there.</w:t>
       </w:r>
     </w:p>
     <w:p>
@@ -1050,15 +766,10 @@
           <w:ilvl w:val="1"/>
           <w:numId w:val="9"/>
         </w:numPr>
-        <w:spacing w:after="0" w:afterAutospacing="0"/>
-        <w:ind w:left="1440" w:hanging="360"/>
-        <w:rPr/>
-      </w:pPr>
-      <w:r>
-        <w:rPr>
-          <w:rtl w:val="0"/>
-        </w:rPr>
-        <w:t xml:space="preserve">Randomly move: every so often, enemy will move to a random location on the screen. Note that it should never leave the confines of the screen.</w:t>
+        <w:spacing w:after="0"/>
+      </w:pPr>
+      <w:r>
+        <w:t>Randomly move: every so often, enemy will move to a random location on the screen. Note that it should never leave the confines of the screen.</w:t>
       </w:r>
     </w:p>
     <w:p>
@@ -1067,15 +778,10 @@
           <w:ilvl w:val="1"/>
           <w:numId w:val="9"/>
         </w:numPr>
-        <w:spacing w:after="0" w:afterAutospacing="0"/>
-        <w:ind w:left="1440" w:hanging="360"/>
-        <w:rPr/>
-      </w:pPr>
-      <w:r>
-        <w:rPr>
-          <w:rtl w:val="0"/>
-        </w:rPr>
-        <w:t xml:space="preserve">Patrol: enemy patrols between 2 set points.</w:t>
+        <w:spacing w:after="0"/>
+      </w:pPr>
+      <w:r>
+        <w:t>Patrol: enemy patrols between 2 set points.</w:t>
       </w:r>
     </w:p>
     <w:p>
@@ -1084,27 +790,10 @@
           <w:ilvl w:val="0"/>
           <w:numId w:val="9"/>
         </w:numPr>
-        <w:spacing w:after="0" w:afterAutospacing="0"/>
-        <w:ind w:left="720" w:hanging="360"/>
-        <w:rPr/>
-      </w:pPr>
-      <w:r>
-        <w:rPr>
-          <w:rtl w:val="0"/>
-        </w:rPr>
-        <w:t xml:space="preserve">Enemies should lose HP when they are shot at, </w:t>
-      </w:r>
-      <w:r>
-        <w:rPr>
-          <w:rtl w:val="0"/>
-        </w:rPr>
-        <w:t xml:space="preserve">with their hp indicated by the hp underneath them.</w:t>
-      </w:r>
-      <w:r>
-        <w:rPr>
-          <w:rtl w:val="0"/>
-        </w:rPr>
-        <w:t xml:space="preserve"> Once their HP reaches 0, they should die and disappear from the screen.</w:t>
+        <w:spacing w:after="0"/>
+      </w:pPr>
+      <w:r>
+        <w:t>Enemies should lose HP when they are shot at, with their hp indicated by the hp underneath them. Once their HP reaches 0, they should die and disappear from the screen.</w:t>
       </w:r>
     </w:p>
     <w:p>
@@ -1113,15 +802,10 @@
           <w:ilvl w:val="0"/>
           <w:numId w:val="9"/>
         </w:numPr>
-        <w:spacing w:after="0" w:afterAutospacing="0"/>
-        <w:ind w:left="720" w:hanging="360"/>
-        <w:rPr/>
-      </w:pPr>
-      <w:r>
-        <w:rPr>
-          <w:rtl w:val="0"/>
-        </w:rPr>
-        <w:t xml:space="preserve">Every few seconds, enemies will attack by shooting bullets. The specific pattern and shooting behaviour depends on the enemy.</w:t>
+        <w:spacing w:after="0"/>
+      </w:pPr>
+      <w:r>
+        <w:t>Every few seconds, enemies will attack by shooting bullets. The specific pattern and shooting behaviour depends on the enemy.</w:t>
       </w:r>
     </w:p>
     <w:p>
@@ -1130,15 +814,11 @@
           <w:ilvl w:val="0"/>
           <w:numId w:val="9"/>
         </w:numPr>
-        <w:spacing w:after="0" w:afterAutospacing="0"/>
-        <w:ind w:left="720" w:hanging="360"/>
-        <w:rPr/>
-      </w:pPr>
-      <w:r>
-        <w:rPr>
-          <w:rtl w:val="0"/>
-        </w:rPr>
-        <w:t xml:space="preserve">Some enemies’ behaviour is driven by the current game state:</w:t>
+        <w:spacing w:after="0"/>
+      </w:pPr>
+      <w:r>
+        <w:lastRenderedPageBreak/>
+        <w:t>Some enemies’ behaviour is driven by the current game state:</w:t>
       </w:r>
     </w:p>
     <w:p>
@@ -1147,15 +827,10 @@
           <w:ilvl w:val="1"/>
           <w:numId w:val="9"/>
         </w:numPr>
-        <w:spacing w:after="0" w:afterAutospacing="0"/>
-        <w:ind w:left="1440" w:hanging="360"/>
-        <w:rPr/>
-      </w:pPr>
-      <w:r>
-        <w:rPr>
-          <w:rtl w:val="0"/>
-        </w:rPr>
-        <w:t xml:space="preserve">Bees: can merge when other bees are nearby (in a radius of 150 pixels). Up to three bees can merge together. Each stage of a merged bee has different behaviours:</w:t>
+        <w:spacing w:after="0"/>
+      </w:pPr>
+      <w:r>
+        <w:t>Bees: can merge when other bees are nearby (in a radius of 150 pixels). Up to three bees can merge together. Each stage of a merged bee has different behaviours:</w:t>
       </w:r>
     </w:p>
     <w:p>
@@ -1164,15 +839,10 @@
           <w:ilvl w:val="2"/>
           <w:numId w:val="9"/>
         </w:numPr>
-        <w:spacing w:after="0" w:afterAutospacing="0"/>
-        <w:ind w:left="2160" w:hanging="360"/>
-        <w:rPr/>
-      </w:pPr>
-      <w:r>
-        <w:rPr>
-          <w:rtl w:val="0"/>
-        </w:rPr>
-        <w:t xml:space="preserve">1 bee (unmerged): simply flies around randomly.</w:t>
+        <w:spacing w:after="0"/>
+      </w:pPr>
+      <w:r>
+        <w:t>1 bee (unmerged): simply flies around randomly.</w:t>
       </w:r>
     </w:p>
     <w:p>
@@ -1181,15 +851,10 @@
           <w:ilvl w:val="2"/>
           <w:numId w:val="9"/>
         </w:numPr>
-        <w:spacing w:after="0" w:afterAutospacing="0"/>
-        <w:ind w:left="2160" w:hanging="360"/>
-        <w:rPr/>
-      </w:pPr>
-      <w:r>
-        <w:rPr>
-          <w:rtl w:val="0"/>
-        </w:rPr>
-        <w:t xml:space="preserve">2 bees: patrols and periodically shoots a fast grey bullet aimed at the player’s current position.</w:t>
+        <w:spacing w:after="0"/>
+      </w:pPr>
+      <w:r>
+        <w:t>2 bees: patrols and periodically shoots a fast grey bullet aimed at the player’s current position.</w:t>
       </w:r>
     </w:p>
     <w:p>
@@ -1198,15 +863,10 @@
           <w:ilvl w:val="2"/>
           <w:numId w:val="9"/>
         </w:numPr>
-        <w:spacing w:after="0" w:afterAutospacing="0"/>
-        <w:ind w:left="2160" w:hanging="360"/>
-        <w:rPr/>
-      </w:pPr>
-      <w:r>
-        <w:rPr>
-          <w:rtl w:val="0"/>
-        </w:rPr>
-        <w:t xml:space="preserve">3 bees: follows the player when the player is near (in a radius of 400 pixels). Should also shoot 3 grey bullet shots periodically.</w:t>
+        <w:spacing w:after="0"/>
+      </w:pPr>
+      <w:r>
+        <w:t>3 bees: follows the player when the player is near (in a radius of 400 pixels). Should also shoot 3 grey bullet shots periodically.</w:t>
       </w:r>
     </w:p>
     <w:p>
@@ -1215,21 +875,10 @@
           <w:ilvl w:val="1"/>
           <w:numId w:val="9"/>
         </w:numPr>
-        <w:spacing w:after="0" w:afterAutospacing="0"/>
-        <w:ind w:left="1440" w:hanging="360"/>
-        <w:rPr/>
-      </w:pPr>
-      <w:r>
-        <w:rPr>
-          <w:rtl w:val="0"/>
-        </w:rPr>
-        <w:t xml:space="preserve">Pufferfish: follows player when player is near the pufferfish.</w:t>
-      </w:r>
-      <w:r>
-        <w:rPr>
-          <w:rtl w:val="0"/>
-        </w:rPr>
-        <w:t xml:space="preserve"> Periodically shoots a ring of light blue bullets around itself.</w:t>
+        <w:spacing w:after="0"/>
+      </w:pPr>
+      <w:r>
+        <w:t>Pufferfish: follows player when player is near the pufferfish. Periodically shoots a ring of light blue bullets around itself.</w:t>
       </w:r>
     </w:p>
     <w:p>
@@ -1238,21 +887,10 @@
           <w:ilvl w:val="1"/>
           <w:numId w:val="9"/>
         </w:numPr>
-        <w:spacing w:after="0" w:afterAutospacing="0"/>
-        <w:ind w:left="1440" w:hanging="360"/>
-        <w:rPr/>
-      </w:pPr>
-      <w:r>
-        <w:rPr>
-          <w:rtl w:val="0"/>
-        </w:rPr>
-        <w:t xml:space="preserve">M</w:t>
-      </w:r>
-      <w:r>
-        <w:rPr>
-          <w:rtl w:val="0"/>
-        </w:rPr>
-        <w:t xml:space="preserve">agnet: follows the player when above 50% hp, and stops following player and goes into ranged mode if below 50% hp. </w:t>
+        <w:spacing w:after="0"/>
+      </w:pPr>
+      <w:r>
+        <w:t xml:space="preserve">Magnet: follows the player when above 50% hp, and stops following player and goes into ranged mode if below 50% hp. </w:t>
       </w:r>
     </w:p>
     <w:p>
@@ -1261,15 +899,10 @@
           <w:ilvl w:val="1"/>
           <w:numId w:val="9"/>
         </w:numPr>
-        <w:spacing w:after="0" w:afterAutospacing="0"/>
-        <w:ind w:left="1440" w:hanging="360"/>
-        <w:rPr/>
-      </w:pPr>
-      <w:r>
-        <w:rPr>
-          <w:rtl w:val="0"/>
-        </w:rPr>
-        <w:t xml:space="preserve">Crab: when above 50% hp, shoots a multi-armed spiral stream of grey bullets around itself, with the occasional red-blue double buff bullet. Also shoots homing bullets that try to home in on the player, and split into further bullets on contact with the player/wall/on expiration. Performs different and more aggressive attack when hp below 50%, firing light blue bullets.</w:t>
+        <w:spacing w:after="0"/>
+      </w:pPr>
+      <w:r>
+        <w:t>Crab: when above 50% hp, shoots a multi-armed spiral stream of grey bullets around itself, with the occasional red-blue double buff bullet. Also shoots homing bullets that try to home in on the player, and split into further bullets on contact with the player/wall/on expiration. Performs different and more aggressive attack when hp below 50%, firing light blue bullets.</w:t>
       </w:r>
     </w:p>
     <w:p>
@@ -1278,18 +911,16 @@
           <w:ilvl w:val="1"/>
           <w:numId w:val="9"/>
         </w:numPr>
-        <w:spacing w:after="0" w:afterAutospacing="0"/>
-        <w:ind w:left="1440" w:hanging="360"/>
-        <w:rPr>
-          <w:color w:val="0000ff"/>
-        </w:rPr>
-      </w:pPr>
-      <w:r>
-        <w:rPr>
-          <w:color w:val="0000ff"/>
-          <w:rtl w:val="0"/>
-        </w:rPr>
-        <w:t xml:space="preserve">Laser crab: crab, but green. Shoots a laser instead.</w:t>
+        <w:spacing w:after="0"/>
+        <w:rPr>
+          <w:color w:val="0000FF"/>
+        </w:rPr>
+      </w:pPr>
+      <w:r>
+        <w:rPr>
+          <w:color w:val="0000FF"/>
+        </w:rPr>
+        <w:t>Laser crab: crab, but green. Shoots a laser instead.</w:t>
       </w:r>
     </w:p>
     <w:p>
@@ -1298,18 +929,16 @@
           <w:ilvl w:val="1"/>
           <w:numId w:val="9"/>
         </w:numPr>
-        <w:spacing w:after="0" w:afterAutospacing="0"/>
-        <w:ind w:left="1440" w:hanging="360"/>
-        <w:rPr>
-          <w:color w:val="0000ff"/>
-        </w:rPr>
-      </w:pPr>
-      <w:r>
-        <w:rPr>
-          <w:color w:val="0000ff"/>
-          <w:rtl w:val="0"/>
-        </w:rPr>
-        <w:t xml:space="preserve">bio-BOIDS: using coherence, alignment, and separation with a fixed factor of 0.01, 0.05, 0.01 respectively. This give a swarm of bees that not too close to each other but still act as a group and align the direction between each other</w:t>
+        <w:spacing w:after="0"/>
+        <w:rPr>
+          <w:color w:val="0000FF"/>
+        </w:rPr>
+      </w:pPr>
+      <w:r>
+        <w:rPr>
+          <w:color w:val="0000FF"/>
+        </w:rPr>
+        <w:t>bio-BOIDS: using coherence, alignment, and separation with a fixed factor of 0.01, 0.05, 0.01 respectively. This give a swarm of bees that not too close to each other but still act as a group and align the direction between each other</w:t>
       </w:r>
     </w:p>
     <w:p>
@@ -1318,18 +947,16 @@
           <w:ilvl w:val="1"/>
           <w:numId w:val="9"/>
         </w:numPr>
-        <w:spacing w:after="0" w:afterAutospacing="0"/>
-        <w:ind w:left="1440" w:hanging="360"/>
-        <w:rPr>
-          <w:color w:val="0000ff"/>
-        </w:rPr>
-      </w:pPr>
-      <w:r>
-        <w:rPr>
-          <w:color w:val="0000ff"/>
-          <w:rtl w:val="0"/>
-        </w:rPr>
-        <w:t xml:space="preserve">hifi-BOIDS: adding new states for BOIDS:</w:t>
+        <w:spacing w:after="0"/>
+        <w:rPr>
+          <w:color w:val="0000FF"/>
+        </w:rPr>
+      </w:pPr>
+      <w:r>
+        <w:rPr>
+          <w:color w:val="0000FF"/>
+        </w:rPr>
+        <w:t>hifi-BOIDS: adding new states for BOIDS:</w:t>
       </w:r>
     </w:p>
     <w:p>
@@ -1338,18 +965,16 @@
           <w:ilvl w:val="2"/>
           <w:numId w:val="9"/>
         </w:numPr>
-        <w:spacing w:after="0" w:afterAutospacing="0"/>
-        <w:ind w:left="2160" w:hanging="360"/>
-        <w:rPr>
-          <w:color w:val="0000ff"/>
-        </w:rPr>
-      </w:pPr>
-      <w:r>
-        <w:rPr>
-          <w:color w:val="0000ff"/>
-          <w:rtl w:val="0"/>
-        </w:rPr>
-        <w:t xml:space="preserve">Normal state : using 0.01, 0.05, 0.02 factor as coherence , alignment and separation</w:t>
+        <w:spacing w:after="0"/>
+        <w:rPr>
+          <w:color w:val="0000FF"/>
+        </w:rPr>
+      </w:pPr>
+      <w:r>
+        <w:rPr>
+          <w:color w:val="0000FF"/>
+        </w:rPr>
+        <w:t>Normal state : using 0.01, 0.05, 0.02 factor as coherence , alignment and separation</w:t>
       </w:r>
     </w:p>
     <w:p>
@@ -1358,16 +983,14 @@
           <w:ilvl w:val="2"/>
           <w:numId w:val="9"/>
         </w:numPr>
-        <w:spacing w:after="0" w:afterAutospacing="0"/>
-        <w:ind w:left="2160" w:hanging="360"/>
-        <w:rPr>
-          <w:color w:val="0000ff"/>
-        </w:rPr>
-      </w:pPr>
-      <w:r>
-        <w:rPr>
-          <w:color w:val="0000ff"/>
-          <w:rtl w:val="0"/>
+        <w:spacing w:after="0"/>
+        <w:rPr>
+          <w:color w:val="0000FF"/>
+        </w:rPr>
+      </w:pPr>
+      <w:r>
+        <w:rPr>
+          <w:color w:val="0000FF"/>
         </w:rPr>
         <w:t xml:space="preserve">Grouping state : maximum coherence only , where all BOIDS go to one point </w:t>
       </w:r>
@@ -1378,18 +1001,16 @@
           <w:ilvl w:val="2"/>
           <w:numId w:val="9"/>
         </w:numPr>
-        <w:spacing w:after="0" w:afterAutospacing="0"/>
-        <w:ind w:left="2160" w:hanging="360"/>
-        <w:rPr>
-          <w:color w:val="0000ff"/>
-        </w:rPr>
-      </w:pPr>
-      <w:r>
-        <w:rPr>
-          <w:color w:val="0000ff"/>
-          <w:rtl w:val="0"/>
-        </w:rPr>
-        <w:t xml:space="preserve">Explode State : maximum separation only, where all BOIDS try to get away from each other, visualizing explosion</w:t>
+        <w:spacing w:after="0"/>
+        <w:rPr>
+          <w:color w:val="0000FF"/>
+        </w:rPr>
+      </w:pPr>
+      <w:r>
+        <w:rPr>
+          <w:color w:val="0000FF"/>
+        </w:rPr>
+        <w:t>Explode State : maximum separation only, where all BOIDS try to get away from each other, visualizing explosion</w:t>
       </w:r>
     </w:p>
     <w:p>
@@ -1398,18 +1019,16 @@
           <w:ilvl w:val="1"/>
           <w:numId w:val="9"/>
         </w:numPr>
-        <w:spacing w:after="0" w:afterAutospacing="0"/>
-        <w:ind w:left="1440" w:hanging="360"/>
-        <w:rPr>
-          <w:color w:val="0000ff"/>
-        </w:rPr>
-      </w:pPr>
-      <w:r>
-        <w:rPr>
-          <w:color w:val="0000ff"/>
-          <w:rtl w:val="0"/>
-        </w:rPr>
-        <w:t xml:space="preserve">Healer Angel: when other enemies get hurt , it will move behind the enemies and heal every 3 seconds, the healer keep healing the enemy until the targeted enemy dies, if the targeted enemy dies it will try to find other enemy that has below 100% health</w:t>
+        <w:spacing w:after="0"/>
+        <w:rPr>
+          <w:color w:val="0000FF"/>
+        </w:rPr>
+      </w:pPr>
+      <w:r>
+        <w:rPr>
+          <w:color w:val="0000FF"/>
+        </w:rPr>
+        <w:t>Healer Angel: when other enemies get hurt , it will move behind the enemies and heal every 3 seconds, the healer keep healing the enemy until the targeted enemy dies, if the targeted enemy dies it will try to find other enemy that has below 100% health</w:t>
       </w:r>
     </w:p>
     <w:p>
@@ -1418,18 +1037,16 @@
           <w:ilvl w:val="1"/>
           <w:numId w:val="9"/>
         </w:numPr>
-        <w:spacing w:after="0" w:afterAutospacing="0"/>
-        <w:ind w:left="1440" w:hanging="360"/>
-        <w:rPr>
-          <w:color w:val="0000ff"/>
-        </w:rPr>
-      </w:pPr>
-      <w:r>
-        <w:rPr>
-          <w:color w:val="0000ff"/>
-          <w:rtl w:val="0"/>
-        </w:rPr>
-        <w:t xml:space="preserve">Charge Snail: when near player it will go to charge state, accelerate itself and charge to the direction to the player. Leaves behind a trail of bullets.</w:t>
+        <w:spacing w:after="0"/>
+        <w:rPr>
+          <w:color w:val="0000FF"/>
+        </w:rPr>
+      </w:pPr>
+      <w:r>
+        <w:rPr>
+          <w:color w:val="0000FF"/>
+        </w:rPr>
+        <w:t>Charge Snail: when near player it will go to charge state, accelerate itself and charge to the direction to the player. Leaves behind a trail of bullets.</w:t>
       </w:r>
     </w:p>
     <w:p>
@@ -1438,19 +1055,16 @@
           <w:ilvl w:val="1"/>
           <w:numId w:val="9"/>
         </w:numPr>
-        <w:spacing w:after="0" w:afterAutospacing="0"/>
-        <w:ind w:left="1440" w:hanging="360"/>
-        <w:rPr>
-          <w:color w:val="0000ff"/>
-          <w:u w:val="none"/>
-        </w:rPr>
-      </w:pPr>
-      <w:r>
-        <w:rPr>
-          <w:color w:val="0000ff"/>
-          <w:rtl w:val="0"/>
-        </w:rPr>
-        <w:t xml:space="preserve">Purple charge snail: the bullets left behind can explode into more bullets upon contact/expiration.</w:t>
+        <w:spacing w:after="0"/>
+        <w:rPr>
+          <w:color w:val="0000FF"/>
+        </w:rPr>
+      </w:pPr>
+      <w:r>
+        <w:rPr>
+          <w:color w:val="0000FF"/>
+        </w:rPr>
+        <w:t>Purple charge snail: the bullets left behind can explode into more bullets upon contact/expiration.</w:t>
       </w:r>
     </w:p>
     <w:p>
@@ -1459,17 +1073,14 @@
           <w:ilvl w:val="1"/>
           <w:numId w:val="9"/>
         </w:numPr>
-        <w:spacing w:after="0" w:afterAutospacing="0"/>
-        <w:ind w:left="1440" w:hanging="360"/>
-        <w:rPr>
-          <w:color w:val="0000ff"/>
-          <w:u w:val="none"/>
-        </w:rPr>
-      </w:pPr>
-      <w:r>
-        <w:rPr>
-          <w:color w:val="0000ff"/>
-          <w:rtl w:val="0"/>
+        <w:spacing w:after="0"/>
+        <w:rPr>
+          <w:color w:val="0000FF"/>
+        </w:rPr>
+      </w:pPr>
+      <w:r>
+        <w:rPr>
+          <w:color w:val="0000FF"/>
         </w:rPr>
         <w:t xml:space="preserve">beeHive : when hp drop to 25% spawn boids </w:t>
       </w:r>
@@ -1480,19 +1091,16 @@
           <w:ilvl w:val="1"/>
           <w:numId w:val="9"/>
         </w:numPr>
-        <w:spacing w:after="0" w:afterAutospacing="0"/>
-        <w:ind w:left="1440" w:hanging="360"/>
-        <w:rPr>
-          <w:color w:val="0000ff"/>
-          <w:u w:val="none"/>
-        </w:rPr>
-      </w:pPr>
-      <w:r>
-        <w:rPr>
-          <w:color w:val="0000ff"/>
-          <w:rtl w:val="0"/>
-        </w:rPr>
-        <w:t xml:space="preserve">BOSS beeHive : when the boss hp drops to 75% enter 2nd states where it will spawn 6 Boids , 1 normal bee and shoot radial burst , this keep repeating until it drops to 50% hp where it enters 3rd state, spawn 2Bee, boids and shoot radial burst. Last phase when boss hp drops to 25% , it just spawn 12 boids bees and not shooting</w:t>
+        <w:spacing w:after="0"/>
+        <w:rPr>
+          <w:color w:val="0000FF"/>
+        </w:rPr>
+      </w:pPr>
+      <w:r>
+        <w:rPr>
+          <w:color w:val="0000FF"/>
+        </w:rPr>
+        <w:t>BOSS beeHive : when the boss hp drops to 75% enter 2nd states where it will spawn 6 Boids , 1 normal bee and shoot radial burst , this keep repeating until it drops to 50% hp where it enters 3rd state, spawn 2Bee, boids and shoot radial burst. Last phase when boss hp drops to 25% , it just spawn 12 boids bees and not shooting</w:t>
       </w:r>
     </w:p>
     <w:p>
@@ -1501,19 +1109,16 @@
           <w:ilvl w:val="1"/>
           <w:numId w:val="9"/>
         </w:numPr>
-        <w:spacing w:after="0" w:afterAutospacing="0"/>
-        <w:ind w:left="1440" w:hanging="360"/>
-        <w:rPr>
-          <w:color w:val="0000ff"/>
-          <w:u w:val="none"/>
-        </w:rPr>
-      </w:pPr>
-      <w:r>
-        <w:rPr>
-          <w:color w:val="0000ff"/>
-          <w:rtl w:val="0"/>
-        </w:rPr>
-        <w:t xml:space="preserve">Sword enemy: charges at player. Behaviour otherwise identical to the angel enemy’s old AI.</w:t>
+        <w:spacing w:after="0"/>
+        <w:rPr>
+          <w:color w:val="0000FF"/>
+        </w:rPr>
+      </w:pPr>
+      <w:r>
+        <w:rPr>
+          <w:color w:val="0000FF"/>
+        </w:rPr>
+        <w:t>Sword enemy: charges at player.</w:t>
       </w:r>
     </w:p>
     <w:p>
@@ -1522,15 +1127,10 @@
           <w:ilvl w:val="0"/>
           <w:numId w:val="9"/>
         </w:numPr>
-        <w:spacing w:after="0" w:afterAutospacing="0"/>
-        <w:ind w:left="720" w:hanging="360"/>
-        <w:rPr/>
-      </w:pPr>
-      <w:r>
-        <w:rPr>
-          <w:rtl w:val="0"/>
-        </w:rPr>
-        <w:t xml:space="preserve">Other enemies’ behaviour is more fixed:</w:t>
+        <w:spacing w:after="0"/>
+      </w:pPr>
+      <w:r>
+        <w:t>Other enemies’ behaviour is more fixed:</w:t>
       </w:r>
     </w:p>
     <w:p>
@@ -1539,27 +1139,25 @@
           <w:ilvl w:val="1"/>
           <w:numId w:val="9"/>
         </w:numPr>
-        <w:spacing w:after="0" w:afterAutospacing="0"/>
-        <w:ind w:left="1440" w:hanging="360"/>
-        <w:rPr>
-          <w:strike w:val="1"/>
+        <w:spacing w:after="0"/>
+        <w:rPr>
+          <w:strike/>
           <w:color w:val="980000"/>
         </w:rPr>
       </w:pPr>
       <w:r>
         <w:rPr>
-          <w:strike w:val="1"/>
+          <w:strike/>
           <w:color w:val="980000"/>
-          <w:rtl w:val="0"/>
-        </w:rPr>
+        </w:rPr>
+        <w:lastRenderedPageBreak/>
         <w:t xml:space="preserve">Giant C boss: constantly rotates in the center of the screen and shoots a ring of light blue bullets at consistent intervals. </w:t>
       </w:r>
       <w:r>
         <w:rPr>
           <w:color w:val="980000"/>
-          <w:rtl w:val="0"/>
-        </w:rPr>
-        <w:t xml:space="preserve">Currently replaced by giant beehive boss, will be added later in M4.</w:t>
+        </w:rPr>
+        <w:t>Currently replaced by giant beehive boss, will be added later in M4.</w:t>
       </w:r>
     </w:p>
     <w:p>
@@ -1568,27 +1166,24 @@
           <w:ilvl w:val="1"/>
           <w:numId w:val="9"/>
         </w:numPr>
-        <w:spacing w:after="0" w:afterAutospacing="0"/>
-        <w:ind w:left="1440" w:hanging="360"/>
-        <w:rPr>
-          <w:strike w:val="1"/>
+        <w:spacing w:after="0"/>
+        <w:rPr>
+          <w:strike/>
           <w:color w:val="980000"/>
         </w:rPr>
       </w:pPr>
       <w:r>
         <w:rPr>
-          <w:strike w:val="1"/>
+          <w:strike/>
           <w:color w:val="980000"/>
-          <w:rtl w:val="0"/>
         </w:rPr>
         <w:t xml:space="preserve">Angel: constantly chases the player and shoots sniper, wave (v-shaped), and 4 shot-grey bullets at different intervals. </w:t>
       </w:r>
       <w:r>
         <w:rPr>
           <w:color w:val="980000"/>
-          <w:rtl w:val="0"/>
-        </w:rPr>
-        <w:t xml:space="preserve">Replaced with more advanced AI.</w:t>
+        </w:rPr>
+        <w:t>Replaced with more advanced AI.</w:t>
       </w:r>
     </w:p>
     <w:p>
@@ -1597,33 +1192,22 @@
           <w:ilvl w:val="1"/>
           <w:numId w:val="9"/>
         </w:numPr>
-        <w:ind w:left="1440" w:hanging="360"/>
-        <w:rPr/>
-      </w:pPr>
-      <w:r>
-        <w:rPr>
-          <w:rtl w:val="0"/>
-        </w:rPr>
-        <w:t xml:space="preserve">Blue four-shooter: constantly rotates in place and periodically shoots 4 grey bullets around itself.</w:t>
-      </w:r>
-      <w:r>
-        <w:rPr>
-          <w:rtl w:val="0"/>
-        </w:rPr>
-      </w:r>
-    </w:p>
-    <w:p>
-      <w:pPr>
-        <w:rPr>
-          <w:b w:val="1"/>
-        </w:rPr>
-      </w:pPr>
-      <w:r>
-        <w:rPr>
-          <w:b w:val="1"/>
-          <w:rtl w:val="0"/>
-        </w:rPr>
-        <w:t xml:space="preserve">Dialogue</w:t>
+      </w:pPr>
+      <w:r>
+        <w:t>Blue four-shooter: constantly rotates in place and periodically shoots 4 grey bullets around itself.</w:t>
+      </w:r>
+    </w:p>
+    <w:p>
+      <w:pPr>
+        <w:rPr>
+          <w:b/>
+        </w:rPr>
+      </w:pPr>
+      <w:r>
+        <w:rPr>
+          <w:b/>
+        </w:rPr>
+        <w:t>Dialogue</w:t>
       </w:r>
     </w:p>
     <w:p>
@@ -1632,47 +1216,28 @@
           <w:ilvl w:val="0"/>
           <w:numId w:val="2"/>
         </w:numPr>
-        <w:spacing w:after="0" w:afterAutospacing="0"/>
-        <w:ind w:left="720" w:hanging="360"/>
-        <w:rPr/>
-      </w:pPr>
-      <w:r>
-        <w:rPr>
-          <w:rtl w:val="0"/>
-        </w:rPr>
-        <w:t xml:space="preserve">Story d</w:t>
-      </w:r>
-      <w:r>
-        <w:rPr>
-          <w:rtl w:val="0"/>
-        </w:rPr>
-        <w:t xml:space="preserve">ialogue will play at the correct times through the tutorial (more in </w:t>
-      </w:r>
-      <w:r>
-        <w:rPr>
-          <w:b w:val="1"/>
-          <w:rtl w:val="0"/>
-        </w:rPr>
-        <w:t xml:space="preserve">Tutorial</w:t>
-      </w:r>
-      <w:r>
-        <w:rPr>
-          <w:rtl w:val="0"/>
-        </w:rPr>
+        <w:spacing w:after="0"/>
+      </w:pPr>
+      <w:r>
+        <w:t xml:space="preserve">Story dialogue will play at the correct times through the tutorial (more in </w:t>
+      </w:r>
+      <w:r>
+        <w:rPr>
+          <w:b/>
+        </w:rPr>
+        <w:t>Tutorial</w:t>
+      </w:r>
+      <w:r>
         <w:t xml:space="preserve">), and interactable dialogue will play when interacting with objects (more in </w:t>
       </w:r>
       <w:r>
         <w:rPr>
-          <w:b w:val="1"/>
-          <w:rtl w:val="0"/>
-        </w:rPr>
-        <w:t xml:space="preserve">Interactables</w:t>
-      </w:r>
-      <w:r>
-        <w:rPr>
-          <w:rtl w:val="0"/>
-        </w:rPr>
-        <w:t xml:space="preserve">)..</w:t>
+          <w:b/>
+        </w:rPr>
+        <w:t>Interactables</w:t>
+      </w:r>
+      <w:r>
+        <w:t>)..</w:t>
       </w:r>
     </w:p>
     <w:p>
@@ -1681,21 +1246,10 @@
           <w:ilvl w:val="0"/>
           <w:numId w:val="2"/>
         </w:numPr>
-        <w:spacing w:after="0" w:afterAutospacing="0"/>
-        <w:ind w:left="720" w:hanging="360"/>
-        <w:rPr/>
-      </w:pPr>
-      <w:r>
-        <w:rPr>
-          <w:rtl w:val="0"/>
-        </w:rPr>
-        <w:t xml:space="preserve">Pressing E will progress dialogue. </w:t>
-      </w:r>
-      <w:r>
-        <w:rPr>
-          <w:rtl w:val="0"/>
-        </w:rPr>
-        <w:t xml:space="preserve">At certain times, the player may be asked to press E to initiate the next dialogue sequence.</w:t>
+        <w:spacing w:after="0"/>
+      </w:pPr>
+      <w:r>
+        <w:t>Pressing E will progress dialogue. At certain times, the player may be asked to press E to initiate the next dialogue sequence.</w:t>
       </w:r>
     </w:p>
     <w:p>
@@ -1704,15 +1258,10 @@
           <w:ilvl w:val="0"/>
           <w:numId w:val="2"/>
         </w:numPr>
-        <w:spacing w:after="0" w:afterAutospacing="0"/>
-        <w:ind w:left="720" w:hanging="360"/>
-        <w:rPr/>
-      </w:pPr>
-      <w:r>
-        <w:rPr>
-          <w:rtl w:val="0"/>
-        </w:rPr>
-        <w:t xml:space="preserve">Dialogue box should properly display the speaker name and avatar, if there is one.</w:t>
+        <w:spacing w:after="0"/>
+      </w:pPr>
+      <w:r>
+        <w:t>Dialogue box should properly display the speaker name and avatar, if there is one.</w:t>
       </w:r>
     </w:p>
     <w:p>
@@ -1721,15 +1270,10 @@
           <w:ilvl w:val="1"/>
           <w:numId w:val="2"/>
         </w:numPr>
-        <w:spacing w:after="0" w:afterAutospacing="0"/>
-        <w:ind w:left="1440" w:hanging="360"/>
-        <w:rPr/>
-      </w:pPr>
-      <w:r>
-        <w:rPr>
-          <w:rtl w:val="0"/>
-        </w:rPr>
-        <w:t xml:space="preserve">Currently, the only speakers are the Scientist, and narration dialogue (no speaker name/avatar)</w:t>
+        <w:spacing w:after="0"/>
+      </w:pPr>
+      <w:r>
+        <w:t>Currently, the only speakers are the Scientist, and narration dialogue (no speaker name/avatar)</w:t>
       </w:r>
     </w:p>
     <w:p>
@@ -1738,15 +1282,10 @@
           <w:ilvl w:val="0"/>
           <w:numId w:val="2"/>
         </w:numPr>
-        <w:spacing w:after="0" w:afterAutospacing="0"/>
-        <w:ind w:left="720" w:hanging="360"/>
-        <w:rPr/>
-      </w:pPr>
-      <w:r>
-        <w:rPr>
-          <w:rtl w:val="0"/>
-        </w:rPr>
-        <w:t xml:space="preserve">Dialogue text should wrap and not overflow.</w:t>
+        <w:spacing w:after="0"/>
+      </w:pPr>
+      <w:r>
+        <w:t>Dialogue text should wrap and not overflow.</w:t>
       </w:r>
     </w:p>
     <w:p>
@@ -1755,15 +1294,10 @@
           <w:ilvl w:val="0"/>
           <w:numId w:val="2"/>
         </w:numPr>
-        <w:spacing w:after="0" w:afterAutospacing="0"/>
-        <w:ind w:left="720" w:hanging="360"/>
-        <w:rPr/>
-      </w:pPr>
-      <w:r>
-        <w:rPr>
-          <w:rtl w:val="0"/>
-        </w:rPr>
-        <w:t xml:space="preserve">Game is in “dialogue state” when dialogue window is open, so no fighting is happening (currently acts as if the game is paused)</w:t>
+        <w:spacing w:after="0"/>
+      </w:pPr>
+      <w:r>
+        <w:t>Game is in “dialogue state” when dialogue window is open, so no fighting is happening (currently acts as if the game is paused)</w:t>
       </w:r>
     </w:p>
     <w:p>
@@ -1772,28 +1306,22 @@
           <w:ilvl w:val="0"/>
           <w:numId w:val="2"/>
         </w:numPr>
-        <w:ind w:left="720" w:hanging="360"/>
-        <w:rPr/>
-      </w:pPr>
-      <w:r>
-        <w:rPr>
-          <w:rtl w:val="0"/>
-        </w:rPr>
-        <w:t xml:space="preserve">After reading all the current dialogue, the dialogue box will close.</w:t>
-      </w:r>
-    </w:p>
-    <w:p>
-      <w:pPr>
-        <w:rPr>
-          <w:b w:val="1"/>
-        </w:rPr>
-      </w:pPr>
-      <w:r>
-        <w:rPr>
-          <w:b w:val="1"/>
-          <w:rtl w:val="0"/>
-        </w:rPr>
-        <w:t xml:space="preserve">Tutorial</w:t>
+      </w:pPr>
+      <w:r>
+        <w:t>After reading all the current dialogue, the dialogue box will close.</w:t>
+      </w:r>
+    </w:p>
+    <w:p>
+      <w:pPr>
+        <w:rPr>
+          <w:b/>
+        </w:rPr>
+      </w:pPr>
+      <w:r>
+        <w:rPr>
+          <w:b/>
+        </w:rPr>
+        <w:t>Tutorial</w:t>
       </w:r>
     </w:p>
     <w:p>
@@ -1802,15 +1330,10 @@
           <w:ilvl w:val="0"/>
           <w:numId w:val="11"/>
         </w:numPr>
-        <w:spacing w:after="0" w:afterAutospacing="0"/>
-        <w:ind w:left="720" w:hanging="360"/>
-        <w:rPr/>
-      </w:pPr>
-      <w:r>
-        <w:rPr>
-          <w:rtl w:val="0"/>
-        </w:rPr>
-        <w:t xml:space="preserve">The tutorial sequence should play out correctly:</w:t>
+        <w:spacing w:after="0"/>
+      </w:pPr>
+      <w:r>
+        <w:t>The tutorial sequence should play out correctly:</w:t>
       </w:r>
     </w:p>
     <w:p>
@@ -1819,15 +1342,10 @@
           <w:ilvl w:val="1"/>
           <w:numId w:val="11"/>
         </w:numPr>
-        <w:spacing w:after="0" w:afterAutospacing="0"/>
-        <w:ind w:left="1440" w:hanging="360"/>
-        <w:rPr/>
-      </w:pPr>
-      <w:r>
-        <w:rPr>
-          <w:rtl w:val="0"/>
-        </w:rPr>
-        <w:t xml:space="preserve">Cutscene 1: animation of robot waking up in an empty room.</w:t>
+        <w:spacing w:after="0"/>
+      </w:pPr>
+      <w:r>
+        <w:t>Cutscene 1: animation of robot waking up in an empty room.</w:t>
       </w:r>
     </w:p>
     <w:p>
@@ -1836,15 +1354,10 @@
           <w:ilvl w:val="1"/>
           <w:numId w:val="11"/>
         </w:numPr>
-        <w:spacing w:after="0" w:afterAutospacing="0"/>
-        <w:ind w:left="1440" w:hanging="360"/>
-        <w:rPr/>
-      </w:pPr>
-      <w:r>
-        <w:rPr>
-          <w:rtl w:val="0"/>
-        </w:rPr>
-        <w:t xml:space="preserve">Dialogue 1: Scientist calls robot for the first time. A ringing sound should play at the beginning.</w:t>
+        <w:spacing w:after="0"/>
+      </w:pPr>
+      <w:r>
+        <w:t>Dialogue 1: Scientist calls robot for the first time. A ringing sound should play at the beginning.</w:t>
       </w:r>
     </w:p>
     <w:p>
@@ -1853,15 +1366,10 @@
           <w:ilvl w:val="1"/>
           <w:numId w:val="11"/>
         </w:numPr>
-        <w:spacing w:after="0" w:afterAutospacing="0"/>
-        <w:ind w:left="1440" w:hanging="360"/>
-        <w:rPr/>
-      </w:pPr>
-      <w:r>
-        <w:rPr>
-          <w:rtl w:val="0"/>
-        </w:rPr>
-        <w:t xml:space="preserve">Player action 1: player is encouraged to walk around using the WASD keys or dash using SPACE/RMB. Player should press E to start the next dialogue sequence when they’re done. Player is locked in room until they press E.</w:t>
+        <w:spacing w:after="0"/>
+      </w:pPr>
+      <w:r>
+        <w:t>Player action 1: player is encouraged to walk around using the WASD keys or dash using SPACE/RMB. Player should press E to start the next dialogue sequence when they’re done. Player is locked in room until they press E.</w:t>
       </w:r>
     </w:p>
     <w:p>
@@ -1870,15 +1378,10 @@
           <w:ilvl w:val="1"/>
           <w:numId w:val="11"/>
         </w:numPr>
-        <w:spacing w:after="0" w:afterAutospacing="0"/>
-        <w:ind w:left="1440" w:hanging="360"/>
-        <w:rPr/>
-      </w:pPr>
-      <w:r>
-        <w:rPr>
-          <w:rtl w:val="0"/>
-        </w:rPr>
-        <w:t xml:space="preserve">Dialogue 2: Player contacts the scientist (with another ringing sound) and he tells robot more about the current state of the lab. Scientist unlocks door to next room. A door opening sound should play when he does so.</w:t>
+        <w:spacing w:after="0"/>
+      </w:pPr>
+      <w:r>
+        <w:t>Dialogue 2: Player contacts the scientist (with another ringing sound) and he tells robot more about the current state of the lab. Scientist unlocks door to next room. A door opening sound should play when he does so.</w:t>
       </w:r>
     </w:p>
     <w:p>
@@ -1887,15 +1390,10 @@
           <w:ilvl w:val="1"/>
           <w:numId w:val="11"/>
         </w:numPr>
-        <w:spacing w:after="0" w:afterAutospacing="0"/>
-        <w:ind w:left="1440" w:hanging="360"/>
-        <w:rPr/>
-      </w:pPr>
-      <w:r>
-        <w:rPr>
-          <w:rtl w:val="0"/>
-        </w:rPr>
-        <w:t xml:space="preserve">Player action 2: player walks through the bottom door to progress to the next room, with a single enemy in it.</w:t>
+        <w:spacing w:after="0"/>
+      </w:pPr>
+      <w:r>
+        <w:t>Player action 2: player walks through the bottom door to progress to the next room, with a single enemy in it.</w:t>
       </w:r>
     </w:p>
     <w:p>
@@ -1904,15 +1402,10 @@
           <w:ilvl w:val="1"/>
           <w:numId w:val="11"/>
         </w:numPr>
-        <w:spacing w:after="0" w:afterAutospacing="0"/>
-        <w:ind w:left="1440" w:hanging="360"/>
-        <w:rPr/>
-      </w:pPr>
-      <w:r>
-        <w:rPr>
-          <w:rtl w:val="0"/>
-        </w:rPr>
-        <w:t xml:space="preserve">Dialogue 3: Scientist tells player to fight enemy robot.</w:t>
+        <w:spacing w:after="0"/>
+      </w:pPr>
+      <w:r>
+        <w:t>Dialogue 3: Scientist tells player to fight enemy robot.</w:t>
       </w:r>
     </w:p>
     <w:p>
@@ -1921,15 +1414,10 @@
           <w:ilvl w:val="1"/>
           <w:numId w:val="11"/>
         </w:numPr>
-        <w:spacing w:after="0" w:afterAutospacing="0"/>
-        <w:ind w:left="1440" w:hanging="360"/>
-        <w:rPr/>
-      </w:pPr>
-      <w:r>
-        <w:rPr>
-          <w:rtl w:val="0"/>
-        </w:rPr>
-        <w:t xml:space="preserve">Player action 3: Player shoots and kills enemy robot by pressing the LMB.</w:t>
+        <w:spacing w:after="0"/>
+      </w:pPr>
+      <w:r>
+        <w:t>Player action 3: Player shoots and kills enemy robot by pressing the LMB.</w:t>
       </w:r>
     </w:p>
     <w:p>
@@ -1938,15 +1426,10 @@
           <w:ilvl w:val="1"/>
           <w:numId w:val="11"/>
         </w:numPr>
-        <w:spacing w:after="0" w:afterAutospacing="0"/>
-        <w:ind w:left="1440" w:hanging="360"/>
-        <w:rPr/>
-      </w:pPr>
-      <w:r>
-        <w:rPr>
-          <w:rtl w:val="0"/>
-        </w:rPr>
-        <w:t xml:space="preserve">Dialogue 4: Scientist brings up stack to player and tells player to progress deeper into the lab.</w:t>
+        <w:spacing w:after="0"/>
+      </w:pPr>
+      <w:r>
+        <w:t>Dialogue 4: Scientist brings up stack to player and tells player to progress deeper into the lab.</w:t>
       </w:r>
     </w:p>
     <w:p>
@@ -1955,28 +1438,22 @@
           <w:ilvl w:val="0"/>
           <w:numId w:val="11"/>
         </w:numPr>
-        <w:ind w:left="720" w:hanging="360"/>
-        <w:rPr/>
-      </w:pPr>
-      <w:r>
-        <w:rPr>
-          <w:rtl w:val="0"/>
-        </w:rPr>
-        <w:t xml:space="preserve">After the tutorial is finished, the normal game loop begins.</w:t>
-      </w:r>
-    </w:p>
-    <w:p>
-      <w:pPr>
-        <w:rPr>
-          <w:b w:val="1"/>
-        </w:rPr>
-      </w:pPr>
-      <w:r>
-        <w:rPr>
-          <w:b w:val="1"/>
-          <w:rtl w:val="0"/>
-        </w:rPr>
-        <w:t xml:space="preserve">Interactables</w:t>
+      </w:pPr>
+      <w:r>
+        <w:t>After the tutorial is finished, the normal game loop begins.</w:t>
+      </w:r>
+    </w:p>
+    <w:p>
+      <w:pPr>
+        <w:rPr>
+          <w:b/>
+        </w:rPr>
+      </w:pPr>
+      <w:r>
+        <w:rPr>
+          <w:b/>
+        </w:rPr>
+        <w:t>Interactables</w:t>
       </w:r>
     </w:p>
     <w:p>
@@ -1985,18 +1462,16 @@
           <w:ilvl w:val="0"/>
           <w:numId w:val="4"/>
         </w:numPr>
-        <w:spacing w:after="0" w:afterAutospacing="0"/>
-        <w:ind w:left="720" w:hanging="360"/>
-        <w:rPr>
-          <w:color w:val="0000ff"/>
-        </w:rPr>
-      </w:pPr>
-      <w:r>
-        <w:rPr>
-          <w:color w:val="0000ff"/>
-          <w:rtl w:val="0"/>
-        </w:rPr>
-        <w:t xml:space="preserve">Interactable objects can be interacted with by pressing E when near them (an E indicator should appear). Almost all of them pull up dialogue when doing so, with the exception of open doors that simply send the player to the next room.</w:t>
+        <w:spacing w:after="0"/>
+        <w:rPr>
+          <w:color w:val="0000FF"/>
+        </w:rPr>
+      </w:pPr>
+      <w:r>
+        <w:rPr>
+          <w:color w:val="0000FF"/>
+        </w:rPr>
+        <w:t>Interactable objects can be interacted with by pressing E when near them (an E indicator should appear). Almost all of them pull up dialogue when doing so, with the exception of open doors that simply send the player to the next room.</w:t>
       </w:r>
     </w:p>
     <w:p>
@@ -2005,18 +1480,16 @@
           <w:ilvl w:val="1"/>
           <w:numId w:val="4"/>
         </w:numPr>
-        <w:spacing w:after="0" w:afterAutospacing="0"/>
-        <w:ind w:left="1440" w:hanging="360"/>
-        <w:rPr>
-          <w:color w:val="0000ff"/>
-        </w:rPr>
-      </w:pPr>
-      <w:r>
-        <w:rPr>
-          <w:color w:val="0000ff"/>
-          <w:rtl w:val="0"/>
-        </w:rPr>
-        <w:t xml:space="preserve">Tree and Gardener NPC: only have interactable dialogue. Found in some resting rooms.</w:t>
+        <w:spacing w:after="0"/>
+        <w:rPr>
+          <w:color w:val="0000FF"/>
+        </w:rPr>
+      </w:pPr>
+      <w:r>
+        <w:rPr>
+          <w:color w:val="0000FF"/>
+        </w:rPr>
+        <w:t>Tree and Gardener NPC: only have interactable dialogue. Found in some resting rooms.</w:t>
       </w:r>
     </w:p>
     <w:p>
@@ -2025,18 +1498,16 @@
           <w:ilvl w:val="1"/>
           <w:numId w:val="4"/>
         </w:numPr>
-        <w:spacing w:after="0" w:afterAutospacing="0"/>
-        <w:ind w:left="1440" w:hanging="360"/>
-        <w:rPr>
-          <w:color w:val="0000ff"/>
-        </w:rPr>
-      </w:pPr>
-      <w:r>
-        <w:rPr>
-          <w:color w:val="0000ff"/>
-          <w:rtl w:val="0"/>
-        </w:rPr>
-        <w:t xml:space="preserve">Pop console: pops all bullets on stack. Found in some resting rooms.</w:t>
+        <w:spacing w:after="0"/>
+        <w:rPr>
+          <w:color w:val="0000FF"/>
+        </w:rPr>
+      </w:pPr>
+      <w:r>
+        <w:rPr>
+          <w:color w:val="0000FF"/>
+        </w:rPr>
+        <w:t>Pop console: pops all bullets on stack. Found in some resting rooms.</w:t>
       </w:r>
     </w:p>
     <w:p>
@@ -2045,18 +1516,17 @@
           <w:ilvl w:val="1"/>
           <w:numId w:val="4"/>
         </w:numPr>
-        <w:spacing w:after="0" w:afterAutospacing="0"/>
-        <w:ind w:left="1440" w:hanging="360"/>
-        <w:rPr>
-          <w:color w:val="0000ff"/>
-        </w:rPr>
-      </w:pPr>
-      <w:r>
-        <w:rPr>
-          <w:color w:val="0000ff"/>
-          <w:rtl w:val="0"/>
-        </w:rPr>
-        <w:t xml:space="preserve">Push console: pushes bullet(s) onto the stack. Can also push keys. Should add new bullets and not replace pre-existing ones. Found in treasure rooms or after defeating hard enemy rooms (like ones with BOIDs).</w:t>
+        <w:spacing w:after="0"/>
+        <w:rPr>
+          <w:color w:val="0000FF"/>
+        </w:rPr>
+      </w:pPr>
+      <w:r>
+        <w:rPr>
+          <w:color w:val="0000FF"/>
+        </w:rPr>
+        <w:lastRenderedPageBreak/>
+        <w:t>Push console: pushes bullet(s) onto the stack. Can also push keys. Should add new bullets and not replace pre-existing ones. Found in treasure rooms or after defeating hard enemy rooms (like ones with BOIDs).</w:t>
       </w:r>
     </w:p>
     <w:p>
@@ -2065,18 +1535,16 @@
           <w:ilvl w:val="1"/>
           <w:numId w:val="4"/>
         </w:numPr>
-        <w:spacing w:after="0" w:afterAutospacing="0"/>
-        <w:ind w:left="1440" w:hanging="360"/>
-        <w:rPr>
-          <w:color w:val="0000ff"/>
-        </w:rPr>
-      </w:pPr>
-      <w:r>
-        <w:rPr>
-          <w:color w:val="0000ff"/>
-          <w:rtl w:val="0"/>
-        </w:rPr>
-        <w:t xml:space="preserve">RAM stick: increase stack size. Found in treasure rooms or after defeating boss.</w:t>
+        <w:spacing w:after="0"/>
+        <w:rPr>
+          <w:color w:val="0000FF"/>
+        </w:rPr>
+      </w:pPr>
+      <w:r>
+        <w:rPr>
+          <w:color w:val="0000FF"/>
+        </w:rPr>
+        <w:t>RAM stick: increase stack size. Found in treasure rooms or after defeating boss.</w:t>
       </w:r>
     </w:p>
     <w:p>
@@ -2085,18 +1553,16 @@
           <w:ilvl w:val="1"/>
           <w:numId w:val="4"/>
         </w:numPr>
-        <w:spacing w:after="0" w:afterAutospacing="0"/>
-        <w:ind w:left="1440" w:hanging="360"/>
-        <w:rPr>
-          <w:color w:val="0000ff"/>
-        </w:rPr>
-      </w:pPr>
-      <w:r>
-        <w:rPr>
-          <w:color w:val="0000ff"/>
-          <w:rtl w:val="0"/>
-        </w:rPr>
-        <w:t xml:space="preserve">Locked doors: unlockable with a key. A max of 2 locked doors will appear in a room. If the player tries to unlock a door for the first time without a key, the scientist will give them a friendly reminder of where to get keys.</w:t>
+        <w:spacing w:after="0"/>
+        <w:rPr>
+          <w:color w:val="0000FF"/>
+        </w:rPr>
+      </w:pPr>
+      <w:r>
+        <w:rPr>
+          <w:color w:val="0000FF"/>
+        </w:rPr>
+        <w:t>Locked doors: unlockable with a key. A max of 2 locked doors will appear in a room. If the player tries to unlock a door for the first time without a key, the scientist will give them a friendly reminder of where to get keys.</w:t>
       </w:r>
     </w:p>
     <w:p>
@@ -2105,31 +1571,28 @@
           <w:ilvl w:val="1"/>
           <w:numId w:val="4"/>
         </w:numPr>
-        <w:ind w:left="1440" w:hanging="360"/>
-        <w:rPr>
-          <w:color w:val="0000ff"/>
-        </w:rPr>
-      </w:pPr>
-      <w:r>
-        <w:rPr>
-          <w:color w:val="0000ff"/>
-          <w:rtl w:val="0"/>
-        </w:rPr>
-        <w:t xml:space="preserve">Open doors: send the player to the next room.</w:t>
-      </w:r>
-    </w:p>
-    <w:p>
-      <w:pPr>
-        <w:rPr>
-          <w:b w:val="1"/>
-        </w:rPr>
-      </w:pPr>
-      <w:r>
-        <w:rPr>
-          <w:b w:val="1"/>
-          <w:rtl w:val="0"/>
-        </w:rPr>
-        <w:t xml:space="preserve">Rooms and Game Loop</w:t>
+        <w:rPr>
+          <w:color w:val="0000FF"/>
+        </w:rPr>
+      </w:pPr>
+      <w:r>
+        <w:rPr>
+          <w:color w:val="0000FF"/>
+        </w:rPr>
+        <w:t>Open doors: send the player to the next room.</w:t>
+      </w:r>
+    </w:p>
+    <w:p>
+      <w:pPr>
+        <w:rPr>
+          <w:b/>
+        </w:rPr>
+      </w:pPr>
+      <w:r>
+        <w:rPr>
+          <w:b/>
+        </w:rPr>
+        <w:t>Rooms and Game Loop</w:t>
       </w:r>
     </w:p>
     <w:p>
@@ -2138,15 +1601,10 @@
           <w:ilvl w:val="0"/>
           <w:numId w:val="13"/>
         </w:numPr>
-        <w:spacing w:after="0" w:afterAutospacing="0"/>
-        <w:ind w:left="720" w:hanging="360"/>
-        <w:rPr/>
-      </w:pPr>
-      <w:r>
-        <w:rPr>
-          <w:rtl w:val="0"/>
-        </w:rPr>
-        <w:t xml:space="preserve">After the player clears each room by killing all enemies (or in the case of the first room, by completing the dialogue) the player can move onto the next room by walking through the doors along the top, bottom, left and right walls.</w:t>
+        <w:spacing w:after="0"/>
+      </w:pPr>
+      <w:r>
+        <w:t>After the player clears each room by killing all enemies (or in the case of the first room, by completing the dialogue) the player can move onto the next room by walking through the doors along the top, bottom, left and right walls.</w:t>
       </w:r>
     </w:p>
     <w:p>
@@ -2155,15 +1613,10 @@
           <w:ilvl w:val="1"/>
           <w:numId w:val="13"/>
         </w:numPr>
-        <w:spacing w:after="0" w:afterAutospacing="0"/>
-        <w:ind w:left="1440" w:hanging="360"/>
-        <w:rPr/>
-      </w:pPr>
-      <w:r>
-        <w:rPr>
-          <w:rtl w:val="0"/>
-        </w:rPr>
-        <w:t xml:space="preserve">The player cannot walk through the door they entered from. Eg: if the player walked through the top door, then they cannot walk through the bottom door in the next room.</w:t>
+        <w:spacing w:after="0"/>
+      </w:pPr>
+      <w:r>
+        <w:t>The player cannot walk through the door they entered from. Eg: if the player walked through the top door, then they cannot walk through the bottom door in the next room.</w:t>
       </w:r>
     </w:p>
     <w:p>
@@ -2172,15 +1625,10 @@
           <w:ilvl w:val="1"/>
           <w:numId w:val="13"/>
         </w:numPr>
-        <w:spacing w:after="0" w:afterAutospacing="0"/>
-        <w:ind w:left="1440" w:hanging="360"/>
-        <w:rPr/>
-      </w:pPr>
-      <w:r>
-        <w:rPr>
-          <w:rtl w:val="0"/>
-        </w:rPr>
-        <w:t xml:space="preserve">Additionally, some doors do not lead to rooms.</w:t>
+        <w:spacing w:after="0"/>
+      </w:pPr>
+      <w:r>
+        <w:t>Additionally, some doors do not lead to rooms.</w:t>
       </w:r>
     </w:p>
     <w:p>
@@ -2189,18 +1637,16 @@
           <w:ilvl w:val="1"/>
           <w:numId w:val="13"/>
         </w:numPr>
-        <w:spacing w:after="0" w:afterAutospacing="0"/>
-        <w:ind w:left="1440" w:hanging="360"/>
-        <w:rPr>
-          <w:color w:val="0000ff"/>
-        </w:rPr>
-      </w:pPr>
-      <w:r>
-        <w:rPr>
-          <w:color w:val="0000ff"/>
-          <w:rtl w:val="0"/>
-        </w:rPr>
-        <w:t xml:space="preserve">Some doors also require a key to unlock.</w:t>
+        <w:spacing w:after="0"/>
+        <w:rPr>
+          <w:color w:val="0000FF"/>
+        </w:rPr>
+      </w:pPr>
+      <w:r>
+        <w:rPr>
+          <w:color w:val="0000FF"/>
+        </w:rPr>
+        <w:t>Some doors also require a key to unlock.</w:t>
       </w:r>
     </w:p>
     <w:p>
@@ -2209,15 +1655,10 @@
           <w:ilvl w:val="0"/>
           <w:numId w:val="13"/>
         </w:numPr>
-        <w:spacing w:after="0" w:afterAutospacing="0"/>
-        <w:ind w:left="720" w:hanging="360"/>
-        <w:rPr/>
-      </w:pPr>
-      <w:r>
-        <w:rPr>
-          <w:rtl w:val="0"/>
-        </w:rPr>
-        <w:t xml:space="preserve">There are currently 5 types of rooms, with the type of each room indicated by the symbol on each door. Aside from the first two tutorial rooms, the other rooms are randomized:</w:t>
+        <w:spacing w:after="0"/>
+      </w:pPr>
+      <w:r>
+        <w:t>There are currently 5 types of rooms, with the type of each room indicated by the symbol on each door. Aside from the first two tutorial rooms, the other rooms are randomized:</w:t>
       </w:r>
     </w:p>
     <w:p>
@@ -2226,15 +1667,10 @@
           <w:ilvl w:val="1"/>
           <w:numId w:val="13"/>
         </w:numPr>
-        <w:spacing w:after="0" w:afterAutospacing="0"/>
-        <w:ind w:left="1440" w:hanging="360"/>
-        <w:rPr/>
-      </w:pPr>
-      <w:r>
-        <w:rPr>
-          <w:rtl w:val="0"/>
-        </w:rPr>
-        <w:t xml:space="preserve">Tutorial room: the first two rooms are set to be tutorial rooms. In the first tutorial room, only the bottom door leads to a room (the next tutorial room). The second tutorial room will have one enemy.</w:t>
+        <w:spacing w:after="0"/>
+      </w:pPr>
+      <w:r>
+        <w:t>Tutorial room: the first two rooms are set to be tutorial rooms. In the first tutorial room, only the bottom door leads to a room (the next tutorial room). The second tutorial room will have one enemy.</w:t>
       </w:r>
     </w:p>
     <w:p>
@@ -2243,15 +1679,10 @@
           <w:ilvl w:val="1"/>
           <w:numId w:val="13"/>
         </w:numPr>
-        <w:spacing w:after="0" w:afterAutospacing="0"/>
-        <w:ind w:left="1440" w:hanging="360"/>
-        <w:rPr/>
-      </w:pPr>
-      <w:r>
-        <w:rPr>
-          <w:rtl w:val="0"/>
-        </w:rPr>
-        <w:t xml:space="preserve">Enemy room: Several types of enemy rooms exist using the enemies described above.</w:t>
+        <w:spacing w:after="0"/>
+      </w:pPr>
+      <w:r>
+        <w:t>Enemy room: Several types of enemy rooms exist using the enemies described above.</w:t>
       </w:r>
     </w:p>
     <w:p>
@@ -2260,15 +1691,10 @@
           <w:ilvl w:val="1"/>
           <w:numId w:val="13"/>
         </w:numPr>
-        <w:spacing w:after="0" w:afterAutospacing="0"/>
-        <w:ind w:left="1440" w:hanging="360"/>
-        <w:rPr/>
-      </w:pPr>
-      <w:r>
-        <w:rPr>
-          <w:rtl w:val="0"/>
-        </w:rPr>
-        <w:t xml:space="preserve">Boss room: holds a single giant beehive boss.</w:t>
+        <w:spacing w:after="0"/>
+      </w:pPr>
+      <w:r>
+        <w:t>Boss room: holds a single giant beehive boss.</w:t>
       </w:r>
     </w:p>
     <w:p>
@@ -2277,15 +1703,10 @@
           <w:ilvl w:val="1"/>
           <w:numId w:val="13"/>
         </w:numPr>
-        <w:spacing w:after="0" w:afterAutospacing="0"/>
-        <w:ind w:left="1440" w:hanging="360"/>
-        <w:rPr/>
-      </w:pPr>
-      <w:r>
-        <w:rPr>
-          <w:rtl w:val="0"/>
-        </w:rPr>
-        <w:t xml:space="preserve">Resting room: contains a pop console, or a tree and Gardener NPC.</w:t>
+        <w:spacing w:after="0"/>
+      </w:pPr>
+      <w:r>
+        <w:t>Resting room: contains a pop console, or a tree and Gardener NPC.</w:t>
       </w:r>
     </w:p>
     <w:p>
@@ -2294,15 +1715,10 @@
           <w:ilvl w:val="1"/>
           <w:numId w:val="13"/>
         </w:numPr>
-        <w:spacing w:after="0" w:afterAutospacing="0"/>
-        <w:ind w:left="1440" w:hanging="360"/>
-        <w:rPr/>
-      </w:pPr>
-      <w:r>
-        <w:rPr>
-          <w:rtl w:val="0"/>
-        </w:rPr>
-        <w:t xml:space="preserve">Treasure room: contains a push console, or three push consoles, or a RAM stick.</w:t>
+        <w:spacing w:after="0"/>
+      </w:pPr>
+      <w:r>
+        <w:t>Treasure room: contains a push console, or three push consoles, or a RAM stick.</w:t>
       </w:r>
     </w:p>
     <w:p>
@@ -2311,34 +1727,23 @@
           <w:ilvl w:val="0"/>
           <w:numId w:val="13"/>
         </w:numPr>
-        <w:ind w:left="720" w:hanging="360"/>
-        <w:rPr>
-          <w:color w:val="0000ff"/>
-        </w:rPr>
-      </w:pPr>
-      <w:r>
-        <w:rPr>
-          <w:color w:val="0000ff"/>
-          <w:rtl w:val="0"/>
-        </w:rPr>
-        <w:t xml:space="preserve">The difficulty of the game increases the more rooms are cleared, with the player encountering a boss room every 12 rooms.</w:t>
-      </w:r>
-    </w:p>
-    <w:p>
-      <w:pPr>
-        <w:rPr/>
-      </w:pPr>
-      <w:r>
-        <w:rPr>
-          <w:b w:val="1"/>
-          <w:rtl w:val="0"/>
-        </w:rPr>
-        <w:t xml:space="preserve">Visuals</w:t>
-      </w:r>
-      <w:r>
-        <w:rPr>
-          <w:rtl w:val="0"/>
-        </w:rPr>
+        <w:rPr>
+          <w:color w:val="0000FF"/>
+        </w:rPr>
+      </w:pPr>
+      <w:r>
+        <w:rPr>
+          <w:color w:val="0000FF"/>
+        </w:rPr>
+        <w:t>The difficulty of the game increases the more rooms are cleared, with the player encountering a boss room every 12 rooms.</w:t>
+      </w:r>
+    </w:p>
+    <w:p>
+      <w:r>
+        <w:rPr>
+          <w:b/>
+        </w:rPr>
+        <w:t>Visuals</w:t>
       </w:r>
     </w:p>
     <w:p>
@@ -2347,15 +1752,10 @@
           <w:ilvl w:val="0"/>
           <w:numId w:val="3"/>
         </w:numPr>
-        <w:spacing w:after="0" w:afterAutospacing="0"/>
-        <w:ind w:left="720" w:hanging="360"/>
-        <w:rPr/>
-      </w:pPr>
-      <w:r>
-        <w:rPr>
-          <w:rtl w:val="0"/>
-        </w:rPr>
-        <w:t xml:space="preserve">As the number of stacks increases, the chromatic aberration effect should intensify.</w:t>
+        <w:spacing w:after="0"/>
+      </w:pPr>
+      <w:r>
+        <w:t>As the number of stacks increases, the chromatic aberration effect should intensify.</w:t>
       </w:r>
     </w:p>
     <w:p>
@@ -2364,22 +1764,16 @@
           <w:ilvl w:val="0"/>
           <w:numId w:val="3"/>
         </w:numPr>
-        <w:spacing w:after="0" w:afterAutospacing="0"/>
-        <w:ind w:left="720" w:hanging="360"/>
-        <w:rPr/>
-      </w:pPr>
-      <w:r>
-        <w:rPr>
-          <w:rtl w:val="0"/>
-        </w:rPr>
+        <w:spacing w:after="0"/>
+      </w:pPr>
+      <w:r>
         <w:t xml:space="preserve">Players colliding with enemies or enemy bullets should make the player briefly switch to a damaged sprite </w:t>
       </w:r>
       <w:r>
         <w:rPr>
-          <w:color w:val="0000ff"/>
-          <w:rtl w:val="0"/>
-        </w:rPr>
-        <w:t xml:space="preserve">and emit particles near the player.</w:t>
+          <w:color w:val="0000FF"/>
+        </w:rPr>
+        <w:t>and emit particles near the player.</w:t>
       </w:r>
     </w:p>
     <w:p>
@@ -2388,15 +1782,10 @@
           <w:ilvl w:val="0"/>
           <w:numId w:val="3"/>
         </w:numPr>
-        <w:spacing w:after="0" w:afterAutospacing="0"/>
-        <w:ind w:left="720" w:hanging="360"/>
-        <w:rPr/>
-      </w:pPr>
-      <w:r>
-        <w:rPr>
-          <w:rtl w:val="0"/>
-        </w:rPr>
-        <w:t xml:space="preserve">When the player dashes, they should leave behind a trail of particles</w:t>
+        <w:spacing w:after="0"/>
+      </w:pPr>
+      <w:r>
+        <w:t>When the player dashes, they should leave behind a trail of particles</w:t>
       </w:r>
     </w:p>
     <w:p>
@@ -2405,15 +1794,10 @@
           <w:ilvl w:val="0"/>
           <w:numId w:val="3"/>
         </w:numPr>
-        <w:spacing w:after="0" w:afterAutospacing="0"/>
-        <w:ind w:left="720" w:hanging="360"/>
-        <w:rPr/>
-      </w:pPr>
-      <w:r>
-        <w:rPr>
-          <w:rtl w:val="0"/>
-        </w:rPr>
-        <w:t xml:space="preserve">When enemies die, they should slowly fade out and emit an explosion of particles</w:t>
+        <w:spacing w:after="0"/>
+      </w:pPr>
+      <w:r>
+        <w:t>When enemies die, they should slowly fade out and emit an explosion of particles</w:t>
       </w:r>
     </w:p>
     <w:p>
@@ -2422,15 +1806,10 @@
           <w:ilvl w:val="0"/>
           <w:numId w:val="3"/>
         </w:numPr>
-        <w:spacing w:after="0" w:afterAutospacing="0"/>
-        <w:ind w:left="720" w:hanging="360"/>
-        <w:rPr/>
-      </w:pPr>
-      <w:r>
-        <w:rPr>
-          <w:rtl w:val="0"/>
-        </w:rPr>
-        <w:t xml:space="preserve">When player bullets collide with the wall, they should emit a spray of particles</w:t>
+        <w:spacing w:after="0"/>
+      </w:pPr>
+      <w:r>
+        <w:t>When player bullets collide with the wall, they should emit a spray of particles</w:t>
       </w:r>
     </w:p>
     <w:p>
@@ -2439,32 +1818,28 @@
           <w:ilvl w:val="0"/>
           <w:numId w:val="3"/>
         </w:numPr>
-        <w:ind w:left="720" w:hanging="360"/>
-        <w:rPr>
-          <w:color w:val="0000ff"/>
-        </w:rPr>
-      </w:pPr>
-      <w:r>
-        <w:rPr>
-          <w:color w:val="0000ff"/>
-          <w:rtl w:val="0"/>
-        </w:rPr>
-        <w:t xml:space="preserve">When coloured bullets are shot, they should have a trail of particles</w:t>
-      </w:r>
-    </w:p>
-    <w:p>
-      <w:pPr>
-        <w:ind w:left="0" w:firstLine="0"/>
-        <w:rPr>
-          <w:b w:val="1"/>
-        </w:rPr>
-      </w:pPr>
-      <w:r>
-        <w:rPr>
-          <w:b w:val="1"/>
-          <w:rtl w:val="0"/>
-        </w:rPr>
-        <w:t xml:space="preserve">Audio</w:t>
+        <w:rPr>
+          <w:color w:val="0000FF"/>
+        </w:rPr>
+      </w:pPr>
+      <w:r>
+        <w:rPr>
+          <w:color w:val="0000FF"/>
+        </w:rPr>
+        <w:t>When coloured bullets are shot, they should have a trail of particles</w:t>
+      </w:r>
+    </w:p>
+    <w:p>
+      <w:pPr>
+        <w:rPr>
+          <w:b/>
+        </w:rPr>
+      </w:pPr>
+      <w:r>
+        <w:rPr>
+          <w:b/>
+        </w:rPr>
+        <w:t>Audio</w:t>
       </w:r>
     </w:p>
     <w:p>
@@ -2473,15 +1848,10 @@
           <w:ilvl w:val="0"/>
           <w:numId w:val="5"/>
         </w:numPr>
-        <w:spacing w:after="0" w:afterAutospacing="0"/>
-        <w:ind w:left="720" w:hanging="360"/>
-        <w:rPr/>
-      </w:pPr>
-      <w:r>
-        <w:rPr>
-          <w:rtl w:val="0"/>
-        </w:rPr>
-        <w:t xml:space="preserve">Sound effects play when the following happens:</w:t>
+        <w:spacing w:after="0"/>
+      </w:pPr>
+      <w:r>
+        <w:t>Sound effects play when the following happens:</w:t>
       </w:r>
     </w:p>
     <w:p>
@@ -2490,15 +1860,10 @@
           <w:ilvl w:val="1"/>
           <w:numId w:val="5"/>
         </w:numPr>
-        <w:spacing w:after="0" w:afterAutospacing="0"/>
-        <w:ind w:left="1440" w:hanging="360"/>
-        <w:rPr/>
-      </w:pPr>
-      <w:r>
-        <w:rPr>
-          <w:rtl w:val="0"/>
-        </w:rPr>
-        <w:t xml:space="preserve">When the player is hit by an enemy/enemy bullet</w:t>
+        <w:spacing w:after="0"/>
+      </w:pPr>
+      <w:r>
+        <w:t>When the player is hit by an enemy/enemy bullet</w:t>
       </w:r>
     </w:p>
     <w:p>
@@ -2507,15 +1872,10 @@
           <w:ilvl w:val="1"/>
           <w:numId w:val="5"/>
         </w:numPr>
-        <w:spacing w:after="0" w:afterAutospacing="0"/>
-        <w:ind w:left="1440" w:hanging="360"/>
-        <w:rPr/>
-      </w:pPr>
-      <w:r>
-        <w:rPr>
-          <w:rtl w:val="0"/>
-        </w:rPr>
-        <w:t xml:space="preserve">When the player dashes</w:t>
+        <w:spacing w:after="0"/>
+      </w:pPr>
+      <w:r>
+        <w:t>When the player dashes</w:t>
       </w:r>
     </w:p>
     <w:p>
@@ -2524,15 +1884,10 @@
           <w:ilvl w:val="1"/>
           <w:numId w:val="5"/>
         </w:numPr>
-        <w:spacing w:after="0" w:afterAutospacing="0"/>
-        <w:ind w:left="1440" w:hanging="360"/>
-        <w:rPr/>
-      </w:pPr>
-      <w:r>
-        <w:rPr>
-          <w:rtl w:val="0"/>
-        </w:rPr>
-        <w:t xml:space="preserve">When the player shoots</w:t>
+        <w:spacing w:after="0"/>
+      </w:pPr>
+      <w:r>
+        <w:t>When the player shoots</w:t>
       </w:r>
     </w:p>
     <w:p>
@@ -2541,15 +1896,10 @@
           <w:ilvl w:val="1"/>
           <w:numId w:val="5"/>
         </w:numPr>
-        <w:spacing w:after="0" w:afterAutospacing="0"/>
-        <w:ind w:left="1440" w:hanging="360"/>
-        <w:rPr/>
-      </w:pPr>
-      <w:r>
-        <w:rPr>
-          <w:rtl w:val="0"/>
-        </w:rPr>
-        <w:t xml:space="preserve">When an enemy shoots</w:t>
+        <w:spacing w:after="0"/>
+      </w:pPr>
+      <w:r>
+        <w:t>When an enemy shoots</w:t>
       </w:r>
     </w:p>
     <w:p>
@@ -2558,15 +1908,10 @@
           <w:ilvl w:val="1"/>
           <w:numId w:val="5"/>
         </w:numPr>
-        <w:spacing w:after="0" w:afterAutospacing="0"/>
-        <w:ind w:left="1440" w:hanging="360"/>
-        <w:rPr/>
-      </w:pPr>
-      <w:r>
-        <w:rPr>
-          <w:rtl w:val="0"/>
-        </w:rPr>
-        <w:t xml:space="preserve">When transitioning between rooms, a door closing sound</w:t>
+        <w:spacing w:after="0"/>
+      </w:pPr>
+      <w:r>
+        <w:t>When transitioning between rooms, a door closing sound</w:t>
       </w:r>
     </w:p>
     <w:p>
@@ -2575,15 +1920,11 @@
           <w:ilvl w:val="1"/>
           <w:numId w:val="5"/>
         </w:numPr>
-        <w:spacing w:after="0" w:afterAutospacing="0"/>
-        <w:ind w:left="1440" w:hanging="360"/>
-        <w:rPr/>
-      </w:pPr>
-      <w:r>
-        <w:rPr>
-          <w:rtl w:val="0"/>
-        </w:rPr>
-        <w:t xml:space="preserve">When dialogue starts for the first two times (when the scientist calls the robot and vice versa), a ringing sound plays</w:t>
+        <w:spacing w:after="0"/>
+      </w:pPr>
+      <w:r>
+        <w:lastRenderedPageBreak/>
+        <w:t>When dialogue starts for the first two times (when the scientist calls the robot and vice versa), a ringing sound plays</w:t>
       </w:r>
     </w:p>
     <w:p>
@@ -2592,15 +1933,10 @@
           <w:ilvl w:val="1"/>
           <w:numId w:val="5"/>
         </w:numPr>
-        <w:spacing w:after="0" w:afterAutospacing="0"/>
-        <w:ind w:left="1440" w:hanging="360"/>
-        <w:rPr/>
-      </w:pPr>
-      <w:r>
-        <w:rPr>
-          <w:rtl w:val="0"/>
-        </w:rPr>
-        <w:t xml:space="preserve">When the scientist unlocks the first door in the dialogue</w:t>
+        <w:spacing w:after="0"/>
+      </w:pPr>
+      <w:r>
+        <w:t>When the scientist unlocks the first door in the dialogue</w:t>
       </w:r>
     </w:p>
     <w:p>
@@ -2609,18 +1945,16 @@
           <w:ilvl w:val="1"/>
           <w:numId w:val="5"/>
         </w:numPr>
-        <w:spacing w:after="0" w:afterAutospacing="0"/>
-        <w:ind w:left="1440" w:hanging="360"/>
-        <w:rPr>
-          <w:color w:val="0000ff"/>
-        </w:rPr>
-      </w:pPr>
-      <w:r>
-        <w:rPr>
-          <w:color w:val="0000ff"/>
-          <w:rtl w:val="0"/>
-        </w:rPr>
-        <w:t xml:space="preserve">When popping stack, pushing onto stack, obtaining the RAM stick</w:t>
+        <w:spacing w:after="0"/>
+        <w:rPr>
+          <w:color w:val="0000FF"/>
+        </w:rPr>
+      </w:pPr>
+      <w:r>
+        <w:rPr>
+          <w:color w:val="0000FF"/>
+        </w:rPr>
+        <w:t>When popping stack, pushing onto stack, obtaining the RAM stick</w:t>
       </w:r>
     </w:p>
     <w:p>
@@ -2629,18 +1963,16 @@
           <w:ilvl w:val="1"/>
           <w:numId w:val="5"/>
         </w:numPr>
-        <w:spacing w:after="0" w:afterAutospacing="0"/>
-        <w:ind w:left="1440" w:hanging="360"/>
-        <w:rPr>
-          <w:color w:val="0000ff"/>
-        </w:rPr>
-      </w:pPr>
-      <w:r>
-        <w:rPr>
-          <w:color w:val="0000ff"/>
-          <w:rtl w:val="0"/>
-        </w:rPr>
-        <w:t xml:space="preserve">When certain bullets explode into more bullets</w:t>
+        <w:spacing w:after="0"/>
+        <w:rPr>
+          <w:color w:val="0000FF"/>
+        </w:rPr>
+      </w:pPr>
+      <w:r>
+        <w:rPr>
+          <w:color w:val="0000FF"/>
+        </w:rPr>
+        <w:t>When certain bullets explode into more bullets</w:t>
       </w:r>
     </w:p>
     <w:p>
@@ -2649,51 +1981,28 @@
           <w:ilvl w:val="0"/>
           <w:numId w:val="5"/>
         </w:numPr>
-        <w:ind w:left="720" w:hanging="360"/>
-        <w:rPr>
-          <w:color w:val="0000ff"/>
-        </w:rPr>
-      </w:pPr>
-      <w:r>
-        <w:rPr>
-          <w:color w:val="0000ff"/>
-          <w:rtl w:val="0"/>
-        </w:rPr>
-        <w:t xml:space="preserve">Multiple </w:t>
-      </w:r>
-      <w:r>
-        <w:rPr>
-          <w:color w:val="0000ff"/>
-          <w:rtl w:val="0"/>
-        </w:rPr>
-        <w:t xml:space="preserve">BGMs play throughout the game</w:t>
-      </w:r>
-      <w:r>
-        <w:rPr>
-          <w:color w:val="0000ff"/>
-          <w:rtl w:val="0"/>
-        </w:rPr>
-        <w:t xml:space="preserve"> based on the current room type, such as tutorial, boss rooms, and normal rooms. The title screen also has a BGM.</w:t>
-      </w:r>
-      <w:r>
-        <w:rPr>
-          <w:rtl w:val="0"/>
-        </w:rPr>
-      </w:r>
-    </w:p>
-    <w:p>
-      <w:pPr>
-        <w:ind w:left="0" w:firstLine="0"/>
-        <w:rPr>
-          <w:b w:val="1"/>
-        </w:rPr>
-      </w:pPr>
-      <w:r>
-        <w:rPr>
-          <w:b w:val="1"/>
-          <w:rtl w:val="0"/>
-        </w:rPr>
-        <w:t xml:space="preserve">Other notes:</w:t>
+        <w:rPr>
+          <w:color w:val="0000FF"/>
+        </w:rPr>
+      </w:pPr>
+      <w:r>
+        <w:rPr>
+          <w:color w:val="0000FF"/>
+        </w:rPr>
+        <w:t>Multiple BGMs play throughout the game based on the current room type, such as tutorial, boss rooms, and normal rooms. The title screen also has a BGM.</w:t>
+      </w:r>
+    </w:p>
+    <w:p>
+      <w:pPr>
+        <w:rPr>
+          <w:b/>
+        </w:rPr>
+      </w:pPr>
+      <w:r>
+        <w:rPr>
+          <w:b/>
+        </w:rPr>
+        <w:t>Other notes:</w:t>
       </w:r>
     </w:p>
     <w:p>
@@ -2702,27 +2011,24 @@
           <w:ilvl w:val="0"/>
           <w:numId w:val="7"/>
         </w:numPr>
-        <w:spacing w:after="0" w:afterAutospacing="0"/>
-        <w:ind w:left="720" w:hanging="360"/>
-        <w:rPr>
-          <w:strike w:val="1"/>
+        <w:spacing w:after="0"/>
+        <w:rPr>
+          <w:strike/>
           <w:color w:val="980000"/>
         </w:rPr>
       </w:pPr>
       <w:r>
         <w:rPr>
-          <w:strike w:val="1"/>
+          <w:strike/>
           <w:color w:val="980000"/>
-          <w:rtl w:val="0"/>
         </w:rPr>
         <w:t xml:space="preserve">There is a debug window that can be expanded in the top right. It displays information of what effects are currently in the bullet stack and the types of rooms that each door leads to. </w:t>
       </w:r>
       <w:r>
         <w:rPr>
           <w:color w:val="980000"/>
-          <w:rtl w:val="0"/>
-        </w:rPr>
-        <w:t xml:space="preserve">Removed due to crashes on mac.</w:t>
+        </w:rPr>
+        <w:t>Removed due to crashes on mac.</w:t>
       </w:r>
     </w:p>
     <w:p>
@@ -2731,117 +2037,141 @@
           <w:ilvl w:val="0"/>
           <w:numId w:val="7"/>
         </w:numPr>
-        <w:ind w:left="720" w:hanging="360"/>
-        <w:rPr>
-          <w:color w:val="0000ff"/>
-        </w:rPr>
-      </w:pPr>
-      <w:r>
-        <w:rPr>
-          <w:color w:val="0000ff"/>
-          <w:rtl w:val="0"/>
-        </w:rPr>
-        <w:t xml:space="preserve">The game’s FPS is displayed in game and is toggleable with F.</w:t>
+        <w:rPr>
+          <w:color w:val="0000FF"/>
+        </w:rPr>
+      </w:pPr>
+      <w:r>
+        <w:rPr>
+          <w:color w:val="0000FF"/>
+        </w:rPr>
+        <w:t>The game’s FPS is displayed in game and is toggleable with F.</w:t>
       </w:r>
     </w:p>
     <w:sectPr>
-      <w:headerReference r:id="rId6" w:type="default"/>
-      <w:headerReference r:id="rId7" w:type="first"/>
-      <w:footerReference r:id="rId8" w:type="first"/>
-      <w:pgSz w:h="15840" w:w="12240" w:orient="portrait"/>
-      <w:pgMar w:bottom="1440" w:top="1440" w:left="1440" w:right="1440" w:header="720" w:footer="720"/>
+      <w:headerReference w:type="default" r:id="rId7"/>
+      <w:headerReference w:type="first" r:id="rId8"/>
+      <w:footerReference w:type="first" r:id="rId9"/>
+      <w:pgSz w:w="12240" w:h="15840"/>
+      <w:pgMar w:top="1440" w:right="1440" w:bottom="1440" w:left="1440" w:header="720" w:footer="720" w:gutter="0"/>
       <w:pgNumType w:start="1"/>
-      <w:titlePg w:val="1"/>
+      <w:cols w:space="720"/>
+      <w:titlePg/>
     </w:sectPr>
   </w:body>
 </w:document>
 </file>
 
+<file path=word/endnotes.xml><?xml version="1.0" encoding="utf-8"?>
+<w:endnotes xmlns:wpc="http://schemas.microsoft.com/office/word/2010/wordprocessingCanvas" xmlns:cx="http://schemas.microsoft.com/office/drawing/2014/chartex" xmlns:cx1="http://schemas.microsoft.com/office/drawing/2015/9/8/chartex" xmlns:cx2="http://schemas.microsoft.com/office/drawing/2015/10/21/chartex" xmlns:cx3="http://schemas.microsoft.com/office/drawing/2016/5/9/chartex" xmlns:cx4="http://schemas.microsoft.com/office/drawing/2016/5/10/chartex" xmlns:cx5="http://schemas.microsoft.com/office/drawing/2016/5/11/chartex" xmlns:cx6="http://schemas.microsoft.com/office/drawing/2016/5/12/chartex" xmlns:cx7="http://schemas.microsoft.com/office/drawing/2016/5/13/chartex" xmlns:cx8="http://schemas.microsoft.com/office/drawing/2016/5/14/chartex" xmlns:mc="http://schemas.openxmlformats.org/markup-compatibility/2006" xmlns:aink="http://schemas.microsoft.com/office/drawing/2016/ink" xmlns:am3d="http://schemas.microsoft.com/office/drawing/2017/model3d" xmlns:o="urn:schemas-microsoft-com:office:office" xmlns:oel="http://schemas.microsoft.com/office/2019/extlst" xmlns:r="http://schemas.openxmlformats.org/officeDocument/2006/relationships" xmlns:m="http://schemas.openxmlformats.org/officeDocument/2006/math" xmlns:v="urn:schemas-microsoft-com:vml" xmlns:wp14="http://schemas.microsoft.com/office/word/2010/wordprocessingDrawing" xmlns:wp="http://schemas.openxmlformats.org/drawingml/2006/wordprocessingDrawing" xmlns:w10="urn:schemas-microsoft-com:office:word" xmlns:w="http://schemas.openxmlformats.org/wordprocessingml/2006/main" xmlns:w14="http://schemas.microsoft.com/office/word/2010/wordml" xmlns:w15="http://schemas.microsoft.com/office/word/2012/wordml" xmlns:w16cex="http://schemas.microsoft.com/office/word/2018/wordml/cex" xmlns:w16cid="http://schemas.microsoft.com/office/word/2016/wordml/cid" xmlns:w16="http://schemas.microsoft.com/office/word/2018/wordml" xmlns:w16du="http://schemas.microsoft.com/office/word/2023/wordml/word16du" xmlns:w16sdtdh="http://schemas.microsoft.com/office/word/2020/wordml/sdtdatahash" xmlns:w16se="http://schemas.microsoft.com/office/word/2015/wordml/symex" xmlns:wpg="http://schemas.microsoft.com/office/word/2010/wordprocessingGroup" xmlns:wpi="http://schemas.microsoft.com/office/word/2010/wordprocessingInk" xmlns:wne="http://schemas.microsoft.com/office/word/2006/wordml" xmlns:wps="http://schemas.microsoft.com/office/word/2010/wordprocessingShape" mc:Ignorable="w14 w15 w16se w16cid w16 w16cex w16sdtdh w16du wp14">
+  <w:endnote w:type="separator" w:id="-1">
+    <w:p>
+      <w:pPr>
+        <w:spacing w:after="0" w:line="240" w:lineRule="auto"/>
+      </w:pPr>
+      <w:r>
+        <w:separator/>
+      </w:r>
+    </w:p>
+  </w:endnote>
+  <w:endnote w:type="continuationSeparator" w:id="0">
+    <w:p>
+      <w:pPr>
+        <w:spacing w:after="0" w:line="240" w:lineRule="auto"/>
+      </w:pPr>
+      <w:r>
+        <w:continuationSeparator/>
+      </w:r>
+    </w:p>
+  </w:endnote>
+</w:endnotes>
+</file>
+
 <file path=word/footer1.xml><?xml version="1.0" encoding="utf-8"?>
-<w:ftr xmlns:mc="http://schemas.openxmlformats.org/markup-compatibility/2006" xmlns:o="urn:schemas-microsoft-com:office:office" xmlns:r="http://schemas.openxmlformats.org/officeDocument/2006/relationships" xmlns:m="http://schemas.openxmlformats.org/officeDocument/2006/math" xmlns:v="urn:schemas-microsoft-com:vml" xmlns:wp="http://schemas.openxmlformats.org/drawingml/2006/wordprocessingDrawing" xmlns:w10="urn:schemas-microsoft-com:office:word" xmlns:w="http://schemas.openxmlformats.org/wordprocessingml/2006/main" xmlns:wne="http://schemas.microsoft.com/office/word/2006/wordml" xmlns:sl="http://schemas.openxmlformats.org/schemaLibrary/2006/main" xmlns:a="http://schemas.openxmlformats.org/drawingml/2006/main" xmlns:pic="http://schemas.openxmlformats.org/drawingml/2006/picture" xmlns:c="http://schemas.openxmlformats.org/drawingml/2006/chart" xmlns:lc="http://schemas.openxmlformats.org/drawingml/2006/lockedCanvas" xmlns:dgm="http://schemas.openxmlformats.org/drawingml/2006/diagram" xmlns:wps="http://schemas.microsoft.com/office/word/2010/wordprocessingShape" xmlns:wpg="http://schemas.microsoft.com/office/word/2010/wordprocessingGroup" xmlns:w14="http://schemas.microsoft.com/office/word/2010/wordml" xmlns:w15="http://schemas.microsoft.com/office/word/2012/wordml" xmlns:w16="http://schemas.microsoft.com/office/word/2018/wordml" xmlns:w16cex="http://schemas.microsoft.com/office/word/2018/wordml/cex" xmlns:w16cid="http://schemas.microsoft.com/office/word/2016/wordml/cid" xmlns="http://schemas.microsoft.com/office/tasks/2019/documenttasks" xmlns:cr="http://schemas.microsoft.com/office/comments/2020/reactions">
-  <w:p>
-    <w:pPr>
-      <w:rPr/>
-    </w:pPr>
-    <w:r>
-      <w:rPr>
-        <w:rtl w:val="0"/>
-      </w:rPr>
-    </w:r>
-  </w:p>
+<w:ftr xmlns:wpc="http://schemas.microsoft.com/office/word/2010/wordprocessingCanvas" xmlns:cx="http://schemas.microsoft.com/office/drawing/2014/chartex" xmlns:cx1="http://schemas.microsoft.com/office/drawing/2015/9/8/chartex" xmlns:cx2="http://schemas.microsoft.com/office/drawing/2015/10/21/chartex" xmlns:cx3="http://schemas.microsoft.com/office/drawing/2016/5/9/chartex" xmlns:cx4="http://schemas.microsoft.com/office/drawing/2016/5/10/chartex" xmlns:cx5="http://schemas.microsoft.com/office/drawing/2016/5/11/chartex" xmlns:cx6="http://schemas.microsoft.com/office/drawing/2016/5/12/chartex" xmlns:cx7="http://schemas.microsoft.com/office/drawing/2016/5/13/chartex" xmlns:cx8="http://schemas.microsoft.com/office/drawing/2016/5/14/chartex" xmlns:mc="http://schemas.openxmlformats.org/markup-compatibility/2006" xmlns:aink="http://schemas.microsoft.com/office/drawing/2016/ink" xmlns:am3d="http://schemas.microsoft.com/office/drawing/2017/model3d" xmlns:o="urn:schemas-microsoft-com:office:office" xmlns:oel="http://schemas.microsoft.com/office/2019/extlst" xmlns:r="http://schemas.openxmlformats.org/officeDocument/2006/relationships" xmlns:m="http://schemas.openxmlformats.org/officeDocument/2006/math" xmlns:v="urn:schemas-microsoft-com:vml" xmlns:wp14="http://schemas.microsoft.com/office/word/2010/wordprocessingDrawing" xmlns:wp="http://schemas.openxmlformats.org/drawingml/2006/wordprocessingDrawing" xmlns:w10="urn:schemas-microsoft-com:office:word" xmlns:w="http://schemas.openxmlformats.org/wordprocessingml/2006/main" xmlns:w14="http://schemas.microsoft.com/office/word/2010/wordml" xmlns:w15="http://schemas.microsoft.com/office/word/2012/wordml" xmlns:w16cex="http://schemas.microsoft.com/office/word/2018/wordml/cex" xmlns:w16cid="http://schemas.microsoft.com/office/word/2016/wordml/cid" xmlns:w16="http://schemas.microsoft.com/office/word/2018/wordml" xmlns:w16du="http://schemas.microsoft.com/office/word/2023/wordml/word16du" xmlns:w16sdtdh="http://schemas.microsoft.com/office/word/2020/wordml/sdtdatahash" xmlns:w16se="http://schemas.microsoft.com/office/word/2015/wordml/symex" xmlns:wpg="http://schemas.microsoft.com/office/word/2010/wordprocessingGroup" xmlns:wpi="http://schemas.microsoft.com/office/word/2010/wordprocessingInk" xmlns:wne="http://schemas.microsoft.com/office/word/2006/wordml" xmlns:wps="http://schemas.microsoft.com/office/word/2010/wordprocessingShape" mc:Ignorable="w14 w15 w16se w16cid w16 w16cex w16sdtdh w16du wp14">
+  <w:p/>
 </w:ftr>
 </file>
 
+<file path=word/footnotes.xml><?xml version="1.0" encoding="utf-8"?>
+<w:footnotes xmlns:wpc="http://schemas.microsoft.com/office/word/2010/wordprocessingCanvas" xmlns:cx="http://schemas.microsoft.com/office/drawing/2014/chartex" xmlns:cx1="http://schemas.microsoft.com/office/drawing/2015/9/8/chartex" xmlns:cx2="http://schemas.microsoft.com/office/drawing/2015/10/21/chartex" xmlns:cx3="http://schemas.microsoft.com/office/drawing/2016/5/9/chartex" xmlns:cx4="http://schemas.microsoft.com/office/drawing/2016/5/10/chartex" xmlns:cx5="http://schemas.microsoft.com/office/drawing/2016/5/11/chartex" xmlns:cx6="http://schemas.microsoft.com/office/drawing/2016/5/12/chartex" xmlns:cx7="http://schemas.microsoft.com/office/drawing/2016/5/13/chartex" xmlns:cx8="http://schemas.microsoft.com/office/drawing/2016/5/14/chartex" xmlns:mc="http://schemas.openxmlformats.org/markup-compatibility/2006" xmlns:aink="http://schemas.microsoft.com/office/drawing/2016/ink" xmlns:am3d="http://schemas.microsoft.com/office/drawing/2017/model3d" xmlns:o="urn:schemas-microsoft-com:office:office" xmlns:oel="http://schemas.microsoft.com/office/2019/extlst" xmlns:r="http://schemas.openxmlformats.org/officeDocument/2006/relationships" xmlns:m="http://schemas.openxmlformats.org/officeDocument/2006/math" xmlns:v="urn:schemas-microsoft-com:vml" xmlns:wp14="http://schemas.microsoft.com/office/word/2010/wordprocessingDrawing" xmlns:wp="http://schemas.openxmlformats.org/drawingml/2006/wordprocessingDrawing" xmlns:w10="urn:schemas-microsoft-com:office:word" xmlns:w="http://schemas.openxmlformats.org/wordprocessingml/2006/main" xmlns:w14="http://schemas.microsoft.com/office/word/2010/wordml" xmlns:w15="http://schemas.microsoft.com/office/word/2012/wordml" xmlns:w16cex="http://schemas.microsoft.com/office/word/2018/wordml/cex" xmlns:w16cid="http://schemas.microsoft.com/office/word/2016/wordml/cid" xmlns:w16="http://schemas.microsoft.com/office/word/2018/wordml" xmlns:w16du="http://schemas.microsoft.com/office/word/2023/wordml/word16du" xmlns:w16sdtdh="http://schemas.microsoft.com/office/word/2020/wordml/sdtdatahash" xmlns:w16se="http://schemas.microsoft.com/office/word/2015/wordml/symex" xmlns:wpg="http://schemas.microsoft.com/office/word/2010/wordprocessingGroup" xmlns:wpi="http://schemas.microsoft.com/office/word/2010/wordprocessingInk" xmlns:wne="http://schemas.microsoft.com/office/word/2006/wordml" xmlns:wps="http://schemas.microsoft.com/office/word/2010/wordprocessingShape" mc:Ignorable="w14 w15 w16se w16cid w16 w16cex w16sdtdh w16du wp14">
+  <w:footnote w:type="separator" w:id="-1">
+    <w:p>
+      <w:pPr>
+        <w:spacing w:after="0" w:line="240" w:lineRule="auto"/>
+      </w:pPr>
+      <w:r>
+        <w:separator/>
+      </w:r>
+    </w:p>
+  </w:footnote>
+  <w:footnote w:type="continuationSeparator" w:id="0">
+    <w:p>
+      <w:pPr>
+        <w:spacing w:after="0" w:line="240" w:lineRule="auto"/>
+      </w:pPr>
+      <w:r>
+        <w:continuationSeparator/>
+      </w:r>
+    </w:p>
+  </w:footnote>
+</w:footnotes>
+</file>
+
 <file path=word/header1.xml><?xml version="1.0" encoding="utf-8"?>
-<w:hdr xmlns:mc="http://schemas.openxmlformats.org/markup-compatibility/2006" xmlns:o="urn:schemas-microsoft-com:office:office" xmlns:r="http://schemas.openxmlformats.org/officeDocument/2006/relationships" xmlns:m="http://schemas.openxmlformats.org/officeDocument/2006/math" xmlns:v="urn:schemas-microsoft-com:vml" xmlns:wp="http://schemas.openxmlformats.org/drawingml/2006/wordprocessingDrawing" xmlns:w10="urn:schemas-microsoft-com:office:word" xmlns:w="http://schemas.openxmlformats.org/wordprocessingml/2006/main" xmlns:wne="http://schemas.microsoft.com/office/word/2006/wordml" xmlns:sl="http://schemas.openxmlformats.org/schemaLibrary/2006/main" xmlns:a="http://schemas.openxmlformats.org/drawingml/2006/main" xmlns:pic="http://schemas.openxmlformats.org/drawingml/2006/picture" xmlns:c="http://schemas.openxmlformats.org/drawingml/2006/chart" xmlns:lc="http://schemas.openxmlformats.org/drawingml/2006/lockedCanvas" xmlns:dgm="http://schemas.openxmlformats.org/drawingml/2006/diagram" xmlns:wps="http://schemas.microsoft.com/office/word/2010/wordprocessingShape" xmlns:wpg="http://schemas.microsoft.com/office/word/2010/wordprocessingGroup" xmlns:w14="http://schemas.microsoft.com/office/word/2010/wordml" xmlns:w15="http://schemas.microsoft.com/office/word/2012/wordml" xmlns:w16="http://schemas.microsoft.com/office/word/2018/wordml" xmlns:w16cex="http://schemas.microsoft.com/office/word/2018/wordml/cex" xmlns:w16cid="http://schemas.microsoft.com/office/word/2016/wordml/cid" xmlns="http://schemas.microsoft.com/office/tasks/2019/documenttasks" xmlns:cr="http://schemas.microsoft.com/office/comments/2020/reactions">
-  <w:p>
-    <w:pPr>
-      <w:rPr/>
-    </w:pPr>
-    <w:r>
-      <w:rPr>
-        <w:rtl w:val="0"/>
-      </w:rPr>
-    </w:r>
-  </w:p>
+<w:hdr xmlns:wpc="http://schemas.microsoft.com/office/word/2010/wordprocessingCanvas" xmlns:cx="http://schemas.microsoft.com/office/drawing/2014/chartex" xmlns:cx1="http://schemas.microsoft.com/office/drawing/2015/9/8/chartex" xmlns:cx2="http://schemas.microsoft.com/office/drawing/2015/10/21/chartex" xmlns:cx3="http://schemas.microsoft.com/office/drawing/2016/5/9/chartex" xmlns:cx4="http://schemas.microsoft.com/office/drawing/2016/5/10/chartex" xmlns:cx5="http://schemas.microsoft.com/office/drawing/2016/5/11/chartex" xmlns:cx6="http://schemas.microsoft.com/office/drawing/2016/5/12/chartex" xmlns:cx7="http://schemas.microsoft.com/office/drawing/2016/5/13/chartex" xmlns:cx8="http://schemas.microsoft.com/office/drawing/2016/5/14/chartex" xmlns:mc="http://schemas.openxmlformats.org/markup-compatibility/2006" xmlns:aink="http://schemas.microsoft.com/office/drawing/2016/ink" xmlns:am3d="http://schemas.microsoft.com/office/drawing/2017/model3d" xmlns:o="urn:schemas-microsoft-com:office:office" xmlns:oel="http://schemas.microsoft.com/office/2019/extlst" xmlns:r="http://schemas.openxmlformats.org/officeDocument/2006/relationships" xmlns:m="http://schemas.openxmlformats.org/officeDocument/2006/math" xmlns:v="urn:schemas-microsoft-com:vml" xmlns:wp14="http://schemas.microsoft.com/office/word/2010/wordprocessingDrawing" xmlns:wp="http://schemas.openxmlformats.org/drawingml/2006/wordprocessingDrawing" xmlns:w10="urn:schemas-microsoft-com:office:word" xmlns:w="http://schemas.openxmlformats.org/wordprocessingml/2006/main" xmlns:w14="http://schemas.microsoft.com/office/word/2010/wordml" xmlns:w15="http://schemas.microsoft.com/office/word/2012/wordml" xmlns:w16cex="http://schemas.microsoft.com/office/word/2018/wordml/cex" xmlns:w16cid="http://schemas.microsoft.com/office/word/2016/wordml/cid" xmlns:w16="http://schemas.microsoft.com/office/word/2018/wordml" xmlns:w16du="http://schemas.microsoft.com/office/word/2023/wordml/word16du" xmlns:w16sdtdh="http://schemas.microsoft.com/office/word/2020/wordml/sdtdatahash" xmlns:w16se="http://schemas.microsoft.com/office/word/2015/wordml/symex" xmlns:wpg="http://schemas.microsoft.com/office/word/2010/wordprocessingGroup" xmlns:wpi="http://schemas.microsoft.com/office/word/2010/wordprocessingInk" xmlns:wne="http://schemas.microsoft.com/office/word/2006/wordml" xmlns:wps="http://schemas.microsoft.com/office/word/2010/wordprocessingShape" mc:Ignorable="w14 w15 w16se w16cid w16 w16cex w16sdtdh w16du wp14">
+  <w:p/>
 </w:hdr>
 </file>
 
 <file path=word/header2.xml><?xml version="1.0" encoding="utf-8"?>
-<w:hdr xmlns:mc="http://schemas.openxmlformats.org/markup-compatibility/2006" xmlns:o="urn:schemas-microsoft-com:office:office" xmlns:r="http://schemas.openxmlformats.org/officeDocument/2006/relationships" xmlns:m="http://schemas.openxmlformats.org/officeDocument/2006/math" xmlns:v="urn:schemas-microsoft-com:vml" xmlns:wp="http://schemas.openxmlformats.org/drawingml/2006/wordprocessingDrawing" xmlns:w10="urn:schemas-microsoft-com:office:word" xmlns:w="http://schemas.openxmlformats.org/wordprocessingml/2006/main" xmlns:wne="http://schemas.microsoft.com/office/word/2006/wordml" xmlns:sl="http://schemas.openxmlformats.org/schemaLibrary/2006/main" xmlns:a="http://schemas.openxmlformats.org/drawingml/2006/main" xmlns:pic="http://schemas.openxmlformats.org/drawingml/2006/picture" xmlns:c="http://schemas.openxmlformats.org/drawingml/2006/chart" xmlns:lc="http://schemas.openxmlformats.org/drawingml/2006/lockedCanvas" xmlns:dgm="http://schemas.openxmlformats.org/drawingml/2006/diagram" xmlns:wps="http://schemas.microsoft.com/office/word/2010/wordprocessingShape" xmlns:wpg="http://schemas.microsoft.com/office/word/2010/wordprocessingGroup" xmlns:w14="http://schemas.microsoft.com/office/word/2010/wordml" xmlns:w15="http://schemas.microsoft.com/office/word/2012/wordml" xmlns:w16="http://schemas.microsoft.com/office/word/2018/wordml" xmlns:w16cex="http://schemas.microsoft.com/office/word/2018/wordml/cex" xmlns:w16cid="http://schemas.microsoft.com/office/word/2016/wordml/cid" xmlns="http://schemas.microsoft.com/office/tasks/2019/documenttasks" xmlns:cr="http://schemas.microsoft.com/office/comments/2020/reactions">
+<w:hdr xmlns:wpc="http://schemas.microsoft.com/office/word/2010/wordprocessingCanvas" xmlns:cx="http://schemas.microsoft.com/office/drawing/2014/chartex" xmlns:cx1="http://schemas.microsoft.com/office/drawing/2015/9/8/chartex" xmlns:cx2="http://schemas.microsoft.com/office/drawing/2015/10/21/chartex" xmlns:cx3="http://schemas.microsoft.com/office/drawing/2016/5/9/chartex" xmlns:cx4="http://schemas.microsoft.com/office/drawing/2016/5/10/chartex" xmlns:cx5="http://schemas.microsoft.com/office/drawing/2016/5/11/chartex" xmlns:cx6="http://schemas.microsoft.com/office/drawing/2016/5/12/chartex" xmlns:cx7="http://schemas.microsoft.com/office/drawing/2016/5/13/chartex" xmlns:cx8="http://schemas.microsoft.com/office/drawing/2016/5/14/chartex" xmlns:mc="http://schemas.openxmlformats.org/markup-compatibility/2006" xmlns:aink="http://schemas.microsoft.com/office/drawing/2016/ink" xmlns:am3d="http://schemas.microsoft.com/office/drawing/2017/model3d" xmlns:o="urn:schemas-microsoft-com:office:office" xmlns:oel="http://schemas.microsoft.com/office/2019/extlst" xmlns:r="http://schemas.openxmlformats.org/officeDocument/2006/relationships" xmlns:m="http://schemas.openxmlformats.org/officeDocument/2006/math" xmlns:v="urn:schemas-microsoft-com:vml" xmlns:wp14="http://schemas.microsoft.com/office/word/2010/wordprocessingDrawing" xmlns:wp="http://schemas.openxmlformats.org/drawingml/2006/wordprocessingDrawing" xmlns:w10="urn:schemas-microsoft-com:office:word" xmlns:w="http://schemas.openxmlformats.org/wordprocessingml/2006/main" xmlns:w14="http://schemas.microsoft.com/office/word/2010/wordml" xmlns:w15="http://schemas.microsoft.com/office/word/2012/wordml" xmlns:w16cex="http://schemas.microsoft.com/office/word/2018/wordml/cex" xmlns:w16cid="http://schemas.microsoft.com/office/word/2016/wordml/cid" xmlns:w16="http://schemas.microsoft.com/office/word/2018/wordml" xmlns:w16du="http://schemas.microsoft.com/office/word/2023/wordml/word16du" xmlns:w16sdtdh="http://schemas.microsoft.com/office/word/2020/wordml/sdtdatahash" xmlns:w16se="http://schemas.microsoft.com/office/word/2015/wordml/symex" xmlns:wpg="http://schemas.microsoft.com/office/word/2010/wordprocessingGroup" xmlns:wpi="http://schemas.microsoft.com/office/word/2010/wordprocessingInk" xmlns:wne="http://schemas.microsoft.com/office/word/2006/wordml" xmlns:wps="http://schemas.microsoft.com/office/word/2010/wordprocessingShape" mc:Ignorable="w14 w15 w16se w16cid w16 w16cex w16sdtdh w16du wp14">
   <w:p>
     <w:pPr>
       <w:jc w:val="center"/>
       <w:rPr>
-        <w:b w:val="1"/>
+        <w:b/>
         <w:sz w:val="32"/>
         <w:szCs w:val="32"/>
       </w:rPr>
     </w:pPr>
     <w:r>
       <w:rPr>
-        <w:b w:val="1"/>
+        <w:b/>
         <w:sz w:val="32"/>
         <w:szCs w:val="32"/>
-        <w:rtl w:val="0"/>
-      </w:rPr>
-      <w:t xml:space="preserve">Test Plan</w:t>
+      </w:rPr>
+      <w:t>Test Plan</w:t>
     </w:r>
   </w:p>
   <w:p>
     <w:pPr>
       <w:jc w:val="center"/>
       <w:rPr>
-        <w:b w:val="1"/>
+        <w:b/>
         <w:sz w:val="32"/>
         <w:szCs w:val="32"/>
       </w:rPr>
     </w:pPr>
     <w:r>
       <w:rPr>
-        <w:b w:val="1"/>
-        <w:rtl w:val="0"/>
+        <w:b/>
       </w:rPr>
       <w:t xml:space="preserve">Team 19: </w:t>
     </w:r>
     <w:r>
-      <w:rPr>
-        <w:rtl w:val="0"/>
-      </w:rPr>
-      <w:t xml:space="preserve">Vincent, Tom, Sky, Amanda, Dean</w:t>
-    </w:r>
-    <w:r>
-      <w:rPr>
-        <w:rtl w:val="0"/>
-      </w:rPr>
+      <w:t>Vincent, Tom, Sky, Amanda, Dean</w:t>
     </w:r>
   </w:p>
 </w:hdr>
 </file>
 
 <file path=word/numbering.xml><?xml version="1.0" encoding="utf-8"?>
-<w:numbering xmlns:mc="http://schemas.openxmlformats.org/markup-compatibility/2006" xmlns:o="urn:schemas-microsoft-com:office:office" xmlns:r="http://schemas.openxmlformats.org/officeDocument/2006/relationships" xmlns:m="http://schemas.openxmlformats.org/officeDocument/2006/math" xmlns:v="urn:schemas-microsoft-com:vml" xmlns:wp="http://schemas.openxmlformats.org/drawingml/2006/wordprocessingDrawing" xmlns:w10="urn:schemas-microsoft-com:office:word" xmlns:w="http://schemas.openxmlformats.org/wordprocessingml/2006/main" xmlns:wne="http://schemas.microsoft.com/office/word/2006/wordml" xmlns:sl="http://schemas.openxmlformats.org/schemaLibrary/2006/main" xmlns:a="http://schemas.openxmlformats.org/drawingml/2006/main" xmlns:pic="http://schemas.openxmlformats.org/drawingml/2006/picture" xmlns:c="http://schemas.openxmlformats.org/drawingml/2006/chart" xmlns:lc="http://schemas.openxmlformats.org/drawingml/2006/lockedCanvas" xmlns:dgm="http://schemas.openxmlformats.org/drawingml/2006/diagram" xmlns:wps="http://schemas.microsoft.com/office/word/2010/wordprocessingShape" xmlns:wpg="http://schemas.microsoft.com/office/word/2010/wordprocessingGroup" xmlns:w14="http://schemas.microsoft.com/office/word/2010/wordml" xmlns:w15="http://schemas.microsoft.com/office/word/2012/wordml" xmlns:w16="http://schemas.microsoft.com/office/word/2018/wordml" xmlns:w16cex="http://schemas.microsoft.com/office/word/2018/wordml/cex" xmlns:w16cid="http://schemas.microsoft.com/office/word/2016/wordml/cid" xmlns="http://schemas.microsoft.com/office/tasks/2019/documenttasks" xmlns:cr="http://schemas.microsoft.com/office/comments/2020/reactions">
-  <w:abstractNum w:abstractNumId="1">
+<w:numbering xmlns:wpc="http://schemas.microsoft.com/office/word/2010/wordprocessingCanvas" xmlns:cx="http://schemas.microsoft.com/office/drawing/2014/chartex" xmlns:cx1="http://schemas.microsoft.com/office/drawing/2015/9/8/chartex" xmlns:cx2="http://schemas.microsoft.com/office/drawing/2015/10/21/chartex" xmlns:cx3="http://schemas.microsoft.com/office/drawing/2016/5/9/chartex" xmlns:cx4="http://schemas.microsoft.com/office/drawing/2016/5/10/chartex" xmlns:cx5="http://schemas.microsoft.com/office/drawing/2016/5/11/chartex" xmlns:cx6="http://schemas.microsoft.com/office/drawing/2016/5/12/chartex" xmlns:cx7="http://schemas.microsoft.com/office/drawing/2016/5/13/chartex" xmlns:cx8="http://schemas.microsoft.com/office/drawing/2016/5/14/chartex" xmlns:mc="http://schemas.openxmlformats.org/markup-compatibility/2006" xmlns:aink="http://schemas.microsoft.com/office/drawing/2016/ink" xmlns:am3d="http://schemas.microsoft.com/office/drawing/2017/model3d" xmlns:o="urn:schemas-microsoft-com:office:office" xmlns:oel="http://schemas.microsoft.com/office/2019/extlst" xmlns:r="http://schemas.openxmlformats.org/officeDocument/2006/relationships" xmlns:m="http://schemas.openxmlformats.org/officeDocument/2006/math" xmlns:v="urn:schemas-microsoft-com:vml" xmlns:wp14="http://schemas.microsoft.com/office/word/2010/wordprocessingDrawing" xmlns:wp="http://schemas.openxmlformats.org/drawingml/2006/wordprocessingDrawing" xmlns:w10="urn:schemas-microsoft-com:office:word" xmlns:w="http://schemas.openxmlformats.org/wordprocessingml/2006/main" xmlns:w14="http://schemas.microsoft.com/office/word/2010/wordml" xmlns:w15="http://schemas.microsoft.com/office/word/2012/wordml" xmlns:w16cex="http://schemas.microsoft.com/office/word/2018/wordml/cex" xmlns:w16cid="http://schemas.microsoft.com/office/word/2016/wordml/cid" xmlns:w16="http://schemas.microsoft.com/office/word/2018/wordml" xmlns:w16du="http://schemas.microsoft.com/office/word/2023/wordml/word16du" xmlns:w16sdtdh="http://schemas.microsoft.com/office/word/2020/wordml/sdtdatahash" xmlns:w16se="http://schemas.microsoft.com/office/word/2015/wordml/symex" xmlns:wpg="http://schemas.microsoft.com/office/word/2010/wordprocessingGroup" xmlns:wpi="http://schemas.microsoft.com/office/word/2010/wordprocessingInk" xmlns:wne="http://schemas.microsoft.com/office/word/2006/wordml" xmlns:wps="http://schemas.microsoft.com/office/word/2010/wordprocessingShape" mc:Ignorable="w14 w15 w16se w16cid w16 w16cex w16sdtdh w16du wp14">
+  <w:abstractNum w:abstractNumId="0" w15:restartNumberingAfterBreak="0">
+    <w:nsid w:val="05A36DBE"/>
+    <w:multiLevelType w:val="multilevel"/>
+    <w:tmpl w:val="B51A517C"/>
     <w:lvl w:ilvl="0">
       <w:start w:val="1"/>
       <w:numFmt w:val="decimal"/>
@@ -2951,7 +2281,10 @@
       </w:rPr>
     </w:lvl>
   </w:abstractNum>
-  <w:abstractNum w:abstractNumId="2">
+  <w:abstractNum w:abstractNumId="1" w15:restartNumberingAfterBreak="0">
+    <w:nsid w:val="135851AD"/>
+    <w:multiLevelType w:val="multilevel"/>
+    <w:tmpl w:val="43ACA04C"/>
     <w:lvl w:ilvl="0">
       <w:start w:val="1"/>
       <w:numFmt w:val="decimal"/>
@@ -3061,7 +2394,10 @@
       </w:rPr>
     </w:lvl>
   </w:abstractNum>
-  <w:abstractNum w:abstractNumId="3">
+  <w:abstractNum w:abstractNumId="2" w15:restartNumberingAfterBreak="0">
+    <w:nsid w:val="1B0721C3"/>
+    <w:multiLevelType w:val="multilevel"/>
+    <w:tmpl w:val="C4E6491C"/>
     <w:lvl w:ilvl="0">
       <w:start w:val="1"/>
       <w:numFmt w:val="decimal"/>
@@ -3171,7 +2507,10 @@
       </w:rPr>
     </w:lvl>
   </w:abstractNum>
-  <w:abstractNum w:abstractNumId="4">
+  <w:abstractNum w:abstractNumId="3" w15:restartNumberingAfterBreak="0">
+    <w:nsid w:val="22D7391F"/>
+    <w:multiLevelType w:val="multilevel"/>
+    <w:tmpl w:val="25520958"/>
     <w:lvl w:ilvl="0">
       <w:start w:val="1"/>
       <w:numFmt w:val="decimal"/>
@@ -3281,7 +2620,10 @@
       </w:rPr>
     </w:lvl>
   </w:abstractNum>
-  <w:abstractNum w:abstractNumId="5">
+  <w:abstractNum w:abstractNumId="4" w15:restartNumberingAfterBreak="0">
+    <w:nsid w:val="32C84D80"/>
+    <w:multiLevelType w:val="multilevel"/>
+    <w:tmpl w:val="BC3CD9EC"/>
     <w:lvl w:ilvl="0">
       <w:start w:val="1"/>
       <w:numFmt w:val="decimal"/>
@@ -3391,7 +2733,10 @@
       </w:rPr>
     </w:lvl>
   </w:abstractNum>
-  <w:abstractNum w:abstractNumId="6">
+  <w:abstractNum w:abstractNumId="5" w15:restartNumberingAfterBreak="0">
+    <w:nsid w:val="43583EFD"/>
+    <w:multiLevelType w:val="multilevel"/>
+    <w:tmpl w:val="5A0A9F4A"/>
     <w:lvl w:ilvl="0">
       <w:start w:val="1"/>
       <w:numFmt w:val="decimal"/>
@@ -3501,7 +2846,10 @@
       </w:rPr>
     </w:lvl>
   </w:abstractNum>
-  <w:abstractNum w:abstractNumId="7">
+  <w:abstractNum w:abstractNumId="6" w15:restartNumberingAfterBreak="0">
+    <w:nsid w:val="44EA0B57"/>
+    <w:multiLevelType w:val="multilevel"/>
+    <w:tmpl w:val="5FA6BD58"/>
     <w:lvl w:ilvl="0">
       <w:start w:val="1"/>
       <w:numFmt w:val="decimal"/>
@@ -3611,7 +2959,10 @@
       </w:rPr>
     </w:lvl>
   </w:abstractNum>
-  <w:abstractNum w:abstractNumId="8">
+  <w:abstractNum w:abstractNumId="7" w15:restartNumberingAfterBreak="0">
+    <w:nsid w:val="4DF441AB"/>
+    <w:multiLevelType w:val="multilevel"/>
+    <w:tmpl w:val="EBE07A20"/>
     <w:lvl w:ilvl="0">
       <w:start w:val="1"/>
       <w:numFmt w:val="decimal"/>
@@ -3721,7 +3072,10 @@
       </w:rPr>
     </w:lvl>
   </w:abstractNum>
-  <w:abstractNum w:abstractNumId="9">
+  <w:abstractNum w:abstractNumId="8" w15:restartNumberingAfterBreak="0">
+    <w:nsid w:val="51695E3A"/>
+    <w:multiLevelType w:val="multilevel"/>
+    <w:tmpl w:val="5F860BAC"/>
     <w:lvl w:ilvl="0">
       <w:start w:val="1"/>
       <w:numFmt w:val="decimal"/>
@@ -3831,7 +3185,10 @@
       </w:rPr>
     </w:lvl>
   </w:abstractNum>
-  <w:abstractNum w:abstractNumId="10">
+  <w:abstractNum w:abstractNumId="9" w15:restartNumberingAfterBreak="0">
+    <w:nsid w:val="5555669E"/>
+    <w:multiLevelType w:val="multilevel"/>
+    <w:tmpl w:val="FCF27E86"/>
     <w:lvl w:ilvl="0">
       <w:start w:val="1"/>
       <w:numFmt w:val="decimal"/>
@@ -3941,7 +3298,10 @@
       </w:rPr>
     </w:lvl>
   </w:abstractNum>
-  <w:abstractNum w:abstractNumId="11">
+  <w:abstractNum w:abstractNumId="10" w15:restartNumberingAfterBreak="0">
+    <w:nsid w:val="63A74470"/>
+    <w:multiLevelType w:val="multilevel"/>
+    <w:tmpl w:val="791EFFA8"/>
     <w:lvl w:ilvl="0">
       <w:start w:val="1"/>
       <w:numFmt w:val="decimal"/>
@@ -4051,7 +3411,10 @@
       </w:rPr>
     </w:lvl>
   </w:abstractNum>
-  <w:abstractNum w:abstractNumId="12">
+  <w:abstractNum w:abstractNumId="11" w15:restartNumberingAfterBreak="0">
+    <w:nsid w:val="68F30B62"/>
+    <w:multiLevelType w:val="multilevel"/>
+    <w:tmpl w:val="C832A9DA"/>
     <w:lvl w:ilvl="0">
       <w:start w:val="1"/>
       <w:numFmt w:val="decimal"/>
@@ -4161,7 +3524,10 @@
       </w:rPr>
     </w:lvl>
   </w:abstractNum>
-  <w:abstractNum w:abstractNumId="13">
+  <w:abstractNum w:abstractNumId="12" w15:restartNumberingAfterBreak="0">
+    <w:nsid w:val="72ED3FAF"/>
+    <w:multiLevelType w:val="multilevel"/>
+    <w:tmpl w:val="A62C9942"/>
     <w:lvl w:ilvl="0">
       <w:start w:val="1"/>
       <w:numFmt w:val="decimal"/>
@@ -4271,57 +3637,57 @@
       </w:rPr>
     </w:lvl>
   </w:abstractNum>
-  <w:num w:numId="1">
+  <w:num w:numId="1" w16cid:durableId="1780879103">
+    <w:abstractNumId w:val="10"/>
+  </w:num>
+  <w:num w:numId="2" w16cid:durableId="1014653318">
+    <w:abstractNumId w:val="2"/>
+  </w:num>
+  <w:num w:numId="3" w16cid:durableId="1173685336">
+    <w:abstractNumId w:val="3"/>
+  </w:num>
+  <w:num w:numId="4" w16cid:durableId="1723869822">
+    <w:abstractNumId w:val="6"/>
+  </w:num>
+  <w:num w:numId="5" w16cid:durableId="51390318">
+    <w:abstractNumId w:val="0"/>
+  </w:num>
+  <w:num w:numId="6" w16cid:durableId="1920822442">
+    <w:abstractNumId w:val="11"/>
+  </w:num>
+  <w:num w:numId="7" w16cid:durableId="501355894">
+    <w:abstractNumId w:val="8"/>
+  </w:num>
+  <w:num w:numId="8" w16cid:durableId="1115558020">
+    <w:abstractNumId w:val="7"/>
+  </w:num>
+  <w:num w:numId="9" w16cid:durableId="1174876509">
     <w:abstractNumId w:val="1"/>
   </w:num>
-  <w:num w:numId="2">
-    <w:abstractNumId w:val="2"/>
+  <w:num w:numId="10" w16cid:durableId="1319992182">
+    <w:abstractNumId w:val="9"/>
   </w:num>
-  <w:num w:numId="3">
-    <w:abstractNumId w:val="3"/>
-  </w:num>
-  <w:num w:numId="4">
-    <w:abstractNumId w:val="4"/>
-  </w:num>
-  <w:num w:numId="5">
+  <w:num w:numId="11" w16cid:durableId="1472595541">
     <w:abstractNumId w:val="5"/>
   </w:num>
-  <w:num w:numId="6">
-    <w:abstractNumId w:val="6"/>
-  </w:num>
-  <w:num w:numId="7">
-    <w:abstractNumId w:val="7"/>
-  </w:num>
-  <w:num w:numId="8">
-    <w:abstractNumId w:val="8"/>
-  </w:num>
-  <w:num w:numId="9">
-    <w:abstractNumId w:val="9"/>
-  </w:num>
-  <w:num w:numId="10">
-    <w:abstractNumId w:val="10"/>
-  </w:num>
-  <w:num w:numId="11">
-    <w:abstractNumId w:val="11"/>
-  </w:num>
-  <w:num w:numId="12">
+  <w:num w:numId="12" w16cid:durableId="1418361772">
     <w:abstractNumId w:val="12"/>
   </w:num>
-  <w:num w:numId="13">
-    <w:abstractNumId w:val="13"/>
+  <w:num w:numId="13" w16cid:durableId="517042497">
+    <w:abstractNumId w:val="4"/>
   </w:num>
 </w:numbering>
 </file>
 
 <file path=word/styles.xml><?xml version="1.0" encoding="utf-8"?>
-<w:styles xmlns:mc="http://schemas.openxmlformats.org/markup-compatibility/2006" xmlns:o="urn:schemas-microsoft-com:office:office" xmlns:r="http://schemas.openxmlformats.org/officeDocument/2006/relationships" xmlns:m="http://schemas.openxmlformats.org/officeDocument/2006/math" xmlns:v="urn:schemas-microsoft-com:vml" xmlns:wp="http://schemas.openxmlformats.org/drawingml/2006/wordprocessingDrawing" xmlns:w10="urn:schemas-microsoft-com:office:word" xmlns:w="http://schemas.openxmlformats.org/wordprocessingml/2006/main" xmlns:wne="http://schemas.microsoft.com/office/word/2006/wordml" xmlns:sl="http://schemas.openxmlformats.org/schemaLibrary/2006/main" xmlns:a="http://schemas.openxmlformats.org/drawingml/2006/main" xmlns:pic="http://schemas.openxmlformats.org/drawingml/2006/picture" xmlns:c="http://schemas.openxmlformats.org/drawingml/2006/chart" xmlns:lc="http://schemas.openxmlformats.org/drawingml/2006/lockedCanvas" xmlns:dgm="http://schemas.openxmlformats.org/drawingml/2006/diagram" xmlns:wps="http://schemas.microsoft.com/office/word/2010/wordprocessingShape" xmlns:wpg="http://schemas.microsoft.com/office/word/2010/wordprocessingGroup" xmlns:w14="http://schemas.microsoft.com/office/word/2010/wordml" xmlns:w15="http://schemas.microsoft.com/office/word/2012/wordml" xmlns:w16="http://schemas.microsoft.com/office/word/2018/wordml" xmlns:w16cex="http://schemas.microsoft.com/office/word/2018/wordml/cex" xmlns:w16cid="http://schemas.microsoft.com/office/word/2016/wordml/cid" xmlns="http://schemas.microsoft.com/office/tasks/2019/documenttasks" xmlns:cr="http://schemas.microsoft.com/office/comments/2020/reactions">
+<w:styles xmlns:mc="http://schemas.openxmlformats.org/markup-compatibility/2006" xmlns:r="http://schemas.openxmlformats.org/officeDocument/2006/relationships" xmlns:w="http://schemas.openxmlformats.org/wordprocessingml/2006/main" xmlns:w14="http://schemas.microsoft.com/office/word/2010/wordml" xmlns:w15="http://schemas.microsoft.com/office/word/2012/wordml" xmlns:w16cex="http://schemas.microsoft.com/office/word/2018/wordml/cex" xmlns:w16cid="http://schemas.microsoft.com/office/word/2016/wordml/cid" xmlns:w16="http://schemas.microsoft.com/office/word/2018/wordml" xmlns:w16du="http://schemas.microsoft.com/office/word/2023/wordml/word16du" xmlns:w16sdtdh="http://schemas.microsoft.com/office/word/2020/wordml/sdtdatahash" xmlns:w16se="http://schemas.microsoft.com/office/word/2015/wordml/symex" mc:Ignorable="w14 w15 w16se w16cid w16 w16cex w16sdtdh w16du">
   <w:docDefaults>
     <w:rPrDefault>
       <w:rPr>
-        <w:rFonts w:ascii="Arial" w:cs="Arial" w:eastAsia="Arial" w:hAnsi="Arial"/>
+        <w:rFonts w:ascii="Arial" w:eastAsia="Arial" w:hAnsi="Arial" w:cs="Arial"/>
         <w:sz w:val="22"/>
         <w:szCs w:val="22"/>
-        <w:lang w:val="en"/>
+        <w:lang w:val="en" w:eastAsia="zh-CN" w:bidi="ar-SA"/>
       </w:rPr>
     </w:rPrDefault>
     <w:pPrDefault>
@@ -4330,24 +3696,403 @@
       </w:pPr>
     </w:pPrDefault>
   </w:docDefaults>
-  <w:style w:type="paragraph" w:styleId="Normal" w:default="1">
-    <w:name w:val="normal"/>
-  </w:style>
-  <w:style w:type="table" w:styleId="TableNormal" w:default="1">
-    <w:name w:val="Table Normal"/>
+  <w:latentStyles w:defLockedState="0" w:defUIPriority="99" w:defSemiHidden="0" w:defUnhideWhenUsed="0" w:defQFormat="0" w:count="376">
+    <w:lsdException w:name="Normal" w:uiPriority="0" w:qFormat="1"/>
+    <w:lsdException w:name="heading 1" w:uiPriority="9" w:qFormat="1"/>
+    <w:lsdException w:name="heading 2" w:semiHidden="1" w:uiPriority="9" w:unhideWhenUsed="1" w:qFormat="1"/>
+    <w:lsdException w:name="heading 3" w:semiHidden="1" w:uiPriority="9" w:unhideWhenUsed="1" w:qFormat="1"/>
+    <w:lsdException w:name="heading 4" w:semiHidden="1" w:uiPriority="9" w:unhideWhenUsed="1" w:qFormat="1"/>
+    <w:lsdException w:name="heading 5" w:semiHidden="1" w:uiPriority="9" w:unhideWhenUsed="1" w:qFormat="1"/>
+    <w:lsdException w:name="heading 6" w:semiHidden="1" w:uiPriority="9" w:unhideWhenUsed="1" w:qFormat="1"/>
+    <w:lsdException w:name="heading 7" w:semiHidden="1" w:uiPriority="9" w:unhideWhenUsed="1" w:qFormat="1"/>
+    <w:lsdException w:name="heading 8" w:semiHidden="1" w:uiPriority="9" w:unhideWhenUsed="1" w:qFormat="1"/>
+    <w:lsdException w:name="heading 9" w:semiHidden="1" w:uiPriority="9" w:unhideWhenUsed="1" w:qFormat="1"/>
+    <w:lsdException w:name="index 1" w:semiHidden="1" w:unhideWhenUsed="1"/>
+    <w:lsdException w:name="index 2" w:semiHidden="1" w:unhideWhenUsed="1"/>
+    <w:lsdException w:name="index 3" w:semiHidden="1" w:unhideWhenUsed="1"/>
+    <w:lsdException w:name="index 4" w:semiHidden="1" w:unhideWhenUsed="1"/>
+    <w:lsdException w:name="index 5" w:semiHidden="1" w:unhideWhenUsed="1"/>
+    <w:lsdException w:name="index 6" w:semiHidden="1" w:unhideWhenUsed="1"/>
+    <w:lsdException w:name="index 7" w:semiHidden="1" w:unhideWhenUsed="1"/>
+    <w:lsdException w:name="index 8" w:semiHidden="1" w:unhideWhenUsed="1"/>
+    <w:lsdException w:name="index 9" w:semiHidden="1" w:unhideWhenUsed="1"/>
+    <w:lsdException w:name="toc 1" w:semiHidden="1" w:uiPriority="39" w:unhideWhenUsed="1"/>
+    <w:lsdException w:name="toc 2" w:semiHidden="1" w:uiPriority="39" w:unhideWhenUsed="1"/>
+    <w:lsdException w:name="toc 3" w:semiHidden="1" w:uiPriority="39" w:unhideWhenUsed="1"/>
+    <w:lsdException w:name="toc 4" w:semiHidden="1" w:uiPriority="39" w:unhideWhenUsed="1"/>
+    <w:lsdException w:name="toc 5" w:semiHidden="1" w:uiPriority="39" w:unhideWhenUsed="1"/>
+    <w:lsdException w:name="toc 6" w:semiHidden="1" w:uiPriority="39" w:unhideWhenUsed="1"/>
+    <w:lsdException w:name="toc 7" w:semiHidden="1" w:uiPriority="39" w:unhideWhenUsed="1"/>
+    <w:lsdException w:name="toc 8" w:semiHidden="1" w:uiPriority="39" w:unhideWhenUsed="1"/>
+    <w:lsdException w:name="toc 9" w:semiHidden="1" w:uiPriority="39" w:unhideWhenUsed="1"/>
+    <w:lsdException w:name="Normal Indent" w:semiHidden="1" w:unhideWhenUsed="1"/>
+    <w:lsdException w:name="footnote text" w:semiHidden="1" w:unhideWhenUsed="1"/>
+    <w:lsdException w:name="annotation text" w:semiHidden="1" w:unhideWhenUsed="1"/>
+    <w:lsdException w:name="header" w:semiHidden="1" w:unhideWhenUsed="1"/>
+    <w:lsdException w:name="footer" w:semiHidden="1" w:unhideWhenUsed="1"/>
+    <w:lsdException w:name="index heading" w:semiHidden="1" w:unhideWhenUsed="1"/>
+    <w:lsdException w:name="caption" w:semiHidden="1" w:uiPriority="35" w:unhideWhenUsed="1" w:qFormat="1"/>
+    <w:lsdException w:name="table of figures" w:semiHidden="1" w:unhideWhenUsed="1"/>
+    <w:lsdException w:name="envelope address" w:semiHidden="1" w:unhideWhenUsed="1"/>
+    <w:lsdException w:name="envelope return" w:semiHidden="1" w:unhideWhenUsed="1"/>
+    <w:lsdException w:name="footnote reference" w:semiHidden="1" w:unhideWhenUsed="1"/>
+    <w:lsdException w:name="annotation reference" w:semiHidden="1" w:unhideWhenUsed="1"/>
+    <w:lsdException w:name="line number" w:semiHidden="1" w:unhideWhenUsed="1"/>
+    <w:lsdException w:name="page number" w:semiHidden="1" w:unhideWhenUsed="1"/>
+    <w:lsdException w:name="endnote reference" w:semiHidden="1" w:unhideWhenUsed="1"/>
+    <w:lsdException w:name="endnote text" w:semiHidden="1" w:unhideWhenUsed="1"/>
+    <w:lsdException w:name="table of authorities" w:semiHidden="1" w:unhideWhenUsed="1"/>
+    <w:lsdException w:name="macro" w:semiHidden="1" w:unhideWhenUsed="1"/>
+    <w:lsdException w:name="toa heading" w:semiHidden="1" w:unhideWhenUsed="1"/>
+    <w:lsdException w:name="List" w:semiHidden="1" w:unhideWhenUsed="1"/>
+    <w:lsdException w:name="List Bullet" w:semiHidden="1" w:unhideWhenUsed="1"/>
+    <w:lsdException w:name="List Number" w:semiHidden="1" w:unhideWhenUsed="1"/>
+    <w:lsdException w:name="List 2" w:semiHidden="1" w:unhideWhenUsed="1"/>
+    <w:lsdException w:name="List 3" w:semiHidden="1" w:unhideWhenUsed="1"/>
+    <w:lsdException w:name="List 4" w:semiHidden="1" w:unhideWhenUsed="1"/>
+    <w:lsdException w:name="List 5" w:semiHidden="1" w:unhideWhenUsed="1"/>
+    <w:lsdException w:name="List Bullet 2" w:semiHidden="1" w:unhideWhenUsed="1"/>
+    <w:lsdException w:name="List Bullet 3" w:semiHidden="1" w:unhideWhenUsed="1"/>
+    <w:lsdException w:name="List Bullet 4" w:semiHidden="1" w:unhideWhenUsed="1"/>
+    <w:lsdException w:name="List Bullet 5" w:semiHidden="1" w:unhideWhenUsed="1"/>
+    <w:lsdException w:name="List Number 2" w:semiHidden="1" w:unhideWhenUsed="1"/>
+    <w:lsdException w:name="List Number 3" w:semiHidden="1" w:unhideWhenUsed="1"/>
+    <w:lsdException w:name="List Number 4" w:semiHidden="1" w:unhideWhenUsed="1"/>
+    <w:lsdException w:name="List Number 5" w:semiHidden="1" w:unhideWhenUsed="1"/>
+    <w:lsdException w:name="Title" w:uiPriority="10" w:qFormat="1"/>
+    <w:lsdException w:name="Closing" w:semiHidden="1" w:unhideWhenUsed="1"/>
+    <w:lsdException w:name="Signature" w:semiHidden="1" w:unhideWhenUsed="1"/>
+    <w:lsdException w:name="Default Paragraph Font" w:semiHidden="1" w:uiPriority="1" w:unhideWhenUsed="1"/>
+    <w:lsdException w:name="Body Text" w:semiHidden="1" w:unhideWhenUsed="1"/>
+    <w:lsdException w:name="Body Text Indent" w:semiHidden="1" w:unhideWhenUsed="1"/>
+    <w:lsdException w:name="List Continue" w:semiHidden="1" w:unhideWhenUsed="1"/>
+    <w:lsdException w:name="List Continue 2" w:semiHidden="1" w:unhideWhenUsed="1"/>
+    <w:lsdException w:name="List Continue 3" w:semiHidden="1" w:unhideWhenUsed="1"/>
+    <w:lsdException w:name="List Continue 4" w:semiHidden="1" w:unhideWhenUsed="1"/>
+    <w:lsdException w:name="List Continue 5" w:semiHidden="1" w:unhideWhenUsed="1"/>
+    <w:lsdException w:name="Message Header" w:semiHidden="1" w:unhideWhenUsed="1"/>
+    <w:lsdException w:name="Subtitle" w:uiPriority="11" w:qFormat="1"/>
+    <w:lsdException w:name="Salutation" w:semiHidden="1" w:unhideWhenUsed="1"/>
+    <w:lsdException w:name="Date" w:semiHidden="1" w:unhideWhenUsed="1"/>
+    <w:lsdException w:name="Body Text First Indent" w:semiHidden="1" w:unhideWhenUsed="1"/>
+    <w:lsdException w:name="Body Text First Indent 2" w:semiHidden="1" w:unhideWhenUsed="1"/>
+    <w:lsdException w:name="Note Heading" w:semiHidden="1" w:unhideWhenUsed="1"/>
+    <w:lsdException w:name="Body Text 2" w:semiHidden="1" w:unhideWhenUsed="1"/>
+    <w:lsdException w:name="Body Text 3" w:semiHidden="1" w:unhideWhenUsed="1"/>
+    <w:lsdException w:name="Body Text Indent 2" w:semiHidden="1" w:unhideWhenUsed="1"/>
+    <w:lsdException w:name="Body Text Indent 3" w:semiHidden="1" w:unhideWhenUsed="1"/>
+    <w:lsdException w:name="Block Text" w:semiHidden="1" w:unhideWhenUsed="1"/>
+    <w:lsdException w:name="Hyperlink" w:semiHidden="1" w:unhideWhenUsed="1"/>
+    <w:lsdException w:name="FollowedHyperlink" w:semiHidden="1" w:unhideWhenUsed="1"/>
+    <w:lsdException w:name="Strong" w:uiPriority="22" w:qFormat="1"/>
+    <w:lsdException w:name="Emphasis" w:uiPriority="20" w:qFormat="1"/>
+    <w:lsdException w:name="Document Map" w:semiHidden="1" w:unhideWhenUsed="1"/>
+    <w:lsdException w:name="Plain Text" w:semiHidden="1" w:unhideWhenUsed="1"/>
+    <w:lsdException w:name="E-mail Signature" w:semiHidden="1" w:unhideWhenUsed="1"/>
+    <w:lsdException w:name="HTML Top of Form" w:semiHidden="1" w:unhideWhenUsed="1"/>
+    <w:lsdException w:name="HTML Bottom of Form" w:semiHidden="1" w:unhideWhenUsed="1"/>
+    <w:lsdException w:name="Normal (Web)" w:semiHidden="1" w:unhideWhenUsed="1"/>
+    <w:lsdException w:name="HTML Acronym" w:semiHidden="1" w:unhideWhenUsed="1"/>
+    <w:lsdException w:name="HTML Address" w:semiHidden="1" w:unhideWhenUsed="1"/>
+    <w:lsdException w:name="HTML Cite" w:semiHidden="1" w:unhideWhenUsed="1"/>
+    <w:lsdException w:name="HTML Code" w:semiHidden="1" w:unhideWhenUsed="1"/>
+    <w:lsdException w:name="HTML Definition" w:semiHidden="1" w:unhideWhenUsed="1"/>
+    <w:lsdException w:name="HTML Keyboard" w:semiHidden="1" w:unhideWhenUsed="1"/>
+    <w:lsdException w:name="HTML Preformatted" w:semiHidden="1" w:unhideWhenUsed="1"/>
+    <w:lsdException w:name="HTML Sample" w:semiHidden="1" w:unhideWhenUsed="1"/>
+    <w:lsdException w:name="HTML Typewriter" w:semiHidden="1" w:unhideWhenUsed="1"/>
+    <w:lsdException w:name="HTML Variable" w:semiHidden="1" w:unhideWhenUsed="1"/>
+    <w:lsdException w:name="Normal Table" w:semiHidden="1" w:unhideWhenUsed="1"/>
+    <w:lsdException w:name="annotation subject" w:semiHidden="1" w:unhideWhenUsed="1"/>
+    <w:lsdException w:name="No List" w:semiHidden="1" w:unhideWhenUsed="1"/>
+    <w:lsdException w:name="Outline List 1" w:semiHidden="1" w:unhideWhenUsed="1"/>
+    <w:lsdException w:name="Outline List 2" w:semiHidden="1" w:unhideWhenUsed="1"/>
+    <w:lsdException w:name="Outline List 3" w:semiHidden="1" w:unhideWhenUsed="1"/>
+    <w:lsdException w:name="Table Simple 1" w:semiHidden="1" w:unhideWhenUsed="1"/>
+    <w:lsdException w:name="Table Simple 2" w:semiHidden="1" w:unhideWhenUsed="1"/>
+    <w:lsdException w:name="Table Simple 3" w:semiHidden="1" w:unhideWhenUsed="1"/>
+    <w:lsdException w:name="Table Classic 1" w:semiHidden="1" w:unhideWhenUsed="1"/>
+    <w:lsdException w:name="Table Classic 2" w:semiHidden="1" w:unhideWhenUsed="1"/>
+    <w:lsdException w:name="Table Classic 3" w:semiHidden="1" w:unhideWhenUsed="1"/>
+    <w:lsdException w:name="Table Classic 4" w:semiHidden="1" w:unhideWhenUsed="1"/>
+    <w:lsdException w:name="Table Colorful 1" w:semiHidden="1" w:unhideWhenUsed="1"/>
+    <w:lsdException w:name="Table Colorful 2" w:semiHidden="1" w:unhideWhenUsed="1"/>
+    <w:lsdException w:name="Table Colorful 3" w:semiHidden="1" w:unhideWhenUsed="1"/>
+    <w:lsdException w:name="Table Columns 1" w:semiHidden="1" w:unhideWhenUsed="1"/>
+    <w:lsdException w:name="Table Columns 2" w:semiHidden="1" w:unhideWhenUsed="1"/>
+    <w:lsdException w:name="Table Columns 3" w:semiHidden="1" w:unhideWhenUsed="1"/>
+    <w:lsdException w:name="Table Columns 4" w:semiHidden="1" w:unhideWhenUsed="1"/>
+    <w:lsdException w:name="Table Columns 5" w:semiHidden="1" w:unhideWhenUsed="1"/>
+    <w:lsdException w:name="Table Grid 1" w:semiHidden="1" w:unhideWhenUsed="1"/>
+    <w:lsdException w:name="Table Grid 2" w:semiHidden="1" w:unhideWhenUsed="1"/>
+    <w:lsdException w:name="Table Grid 3" w:semiHidden="1" w:unhideWhenUsed="1"/>
+    <w:lsdException w:name="Table Grid 4" w:semiHidden="1" w:unhideWhenUsed="1"/>
+    <w:lsdException w:name="Table Grid 5" w:semiHidden="1" w:unhideWhenUsed="1"/>
+    <w:lsdException w:name="Table Grid 6" w:semiHidden="1" w:unhideWhenUsed="1"/>
+    <w:lsdException w:name="Table Grid 7" w:semiHidden="1" w:unhideWhenUsed="1"/>
+    <w:lsdException w:name="Table Grid 8" w:semiHidden="1" w:unhideWhenUsed="1"/>
+    <w:lsdException w:name="Table List 1" w:semiHidden="1" w:unhideWhenUsed="1"/>
+    <w:lsdException w:name="Table List 2" w:semiHidden="1" w:unhideWhenUsed="1"/>
+    <w:lsdException w:name="Table List 3" w:semiHidden="1" w:unhideWhenUsed="1"/>
+    <w:lsdException w:name="Table List 4" w:semiHidden="1" w:unhideWhenUsed="1"/>
+    <w:lsdException w:name="Table List 5" w:semiHidden="1" w:unhideWhenUsed="1"/>
+    <w:lsdException w:name="Table List 6" w:semiHidden="1" w:unhideWhenUsed="1"/>
+    <w:lsdException w:name="Table List 7" w:semiHidden="1" w:unhideWhenUsed="1"/>
+    <w:lsdException w:name="Table List 8" w:semiHidden="1" w:unhideWhenUsed="1"/>
+    <w:lsdException w:name="Table 3D effects 1" w:semiHidden="1" w:unhideWhenUsed="1"/>
+    <w:lsdException w:name="Table 3D effects 2" w:semiHidden="1" w:unhideWhenUsed="1"/>
+    <w:lsdException w:name="Table 3D effects 3" w:semiHidden="1" w:unhideWhenUsed="1"/>
+    <w:lsdException w:name="Table Contemporary" w:semiHidden="1" w:unhideWhenUsed="1"/>
+    <w:lsdException w:name="Table Elegant" w:semiHidden="1" w:unhideWhenUsed="1"/>
+    <w:lsdException w:name="Table Professional" w:semiHidden="1" w:unhideWhenUsed="1"/>
+    <w:lsdException w:name="Table Subtle 1" w:semiHidden="1" w:unhideWhenUsed="1"/>
+    <w:lsdException w:name="Table Subtle 2" w:semiHidden="1" w:unhideWhenUsed="1"/>
+    <w:lsdException w:name="Table Web 1" w:semiHidden="1" w:unhideWhenUsed="1"/>
+    <w:lsdException w:name="Table Web 2" w:semiHidden="1" w:unhideWhenUsed="1"/>
+    <w:lsdException w:name="Table Web 3" w:semiHidden="1" w:unhideWhenUsed="1"/>
+    <w:lsdException w:name="Balloon Text" w:semiHidden="1" w:unhideWhenUsed="1"/>
+    <w:lsdException w:name="Table Grid" w:uiPriority="39"/>
+    <w:lsdException w:name="Table Theme" w:semiHidden="1" w:unhideWhenUsed="1"/>
+    <w:lsdException w:name="Placeholder Text" w:semiHidden="1"/>
+    <w:lsdException w:name="No Spacing" w:uiPriority="1" w:qFormat="1"/>
+    <w:lsdException w:name="Light Shading" w:uiPriority="60"/>
+    <w:lsdException w:name="Light List" w:uiPriority="61"/>
+    <w:lsdException w:name="Light Grid" w:uiPriority="62"/>
+    <w:lsdException w:name="Medium Shading 1" w:uiPriority="63"/>
+    <w:lsdException w:name="Medium Shading 2" w:uiPriority="64"/>
+    <w:lsdException w:name="Medium List 1" w:uiPriority="65"/>
+    <w:lsdException w:name="Medium List 2" w:uiPriority="66"/>
+    <w:lsdException w:name="Medium Grid 1" w:uiPriority="67"/>
+    <w:lsdException w:name="Medium Grid 2" w:uiPriority="68"/>
+    <w:lsdException w:name="Medium Grid 3" w:uiPriority="69"/>
+    <w:lsdException w:name="Dark List" w:uiPriority="70"/>
+    <w:lsdException w:name="Colorful Shading" w:uiPriority="71"/>
+    <w:lsdException w:name="Colorful List" w:uiPriority="72"/>
+    <w:lsdException w:name="Colorful Grid" w:uiPriority="73"/>
+    <w:lsdException w:name="Light Shading Accent 1" w:uiPriority="60"/>
+    <w:lsdException w:name="Light List Accent 1" w:uiPriority="61"/>
+    <w:lsdException w:name="Light Grid Accent 1" w:uiPriority="62"/>
+    <w:lsdException w:name="Medium Shading 1 Accent 1" w:uiPriority="63"/>
+    <w:lsdException w:name="Medium Shading 2 Accent 1" w:uiPriority="64"/>
+    <w:lsdException w:name="Medium List 1 Accent 1" w:uiPriority="65"/>
+    <w:lsdException w:name="Revision" w:semiHidden="1"/>
+    <w:lsdException w:name="List Paragraph" w:uiPriority="34" w:qFormat="1"/>
+    <w:lsdException w:name="Quote" w:uiPriority="29" w:qFormat="1"/>
+    <w:lsdException w:name="Intense Quote" w:uiPriority="30" w:qFormat="1"/>
+    <w:lsdException w:name="Medium List 2 Accent 1" w:uiPriority="66"/>
+    <w:lsdException w:name="Medium Grid 1 Accent 1" w:uiPriority="67"/>
+    <w:lsdException w:name="Medium Grid 2 Accent 1" w:uiPriority="68"/>
+    <w:lsdException w:name="Medium Grid 3 Accent 1" w:uiPriority="69"/>
+    <w:lsdException w:name="Dark List Accent 1" w:uiPriority="70"/>
+    <w:lsdException w:name="Colorful Shading Accent 1" w:uiPriority="71"/>
+    <w:lsdException w:name="Colorful List Accent 1" w:uiPriority="72"/>
+    <w:lsdException w:name="Colorful Grid Accent 1" w:uiPriority="73"/>
+    <w:lsdException w:name="Light Shading Accent 2" w:uiPriority="60"/>
+    <w:lsdException w:name="Light List Accent 2" w:uiPriority="61"/>
+    <w:lsdException w:name="Light Grid Accent 2" w:uiPriority="62"/>
+    <w:lsdException w:name="Medium Shading 1 Accent 2" w:uiPriority="63"/>
+    <w:lsdException w:name="Medium Shading 2 Accent 2" w:uiPriority="64"/>
+    <w:lsdException w:name="Medium List 1 Accent 2" w:uiPriority="65"/>
+    <w:lsdException w:name="Medium List 2 Accent 2" w:uiPriority="66"/>
+    <w:lsdException w:name="Medium Grid 1 Accent 2" w:uiPriority="67"/>
+    <w:lsdException w:name="Medium Grid 2 Accent 2" w:uiPriority="68"/>
+    <w:lsdException w:name="Medium Grid 3 Accent 2" w:uiPriority="69"/>
+    <w:lsdException w:name="Dark List Accent 2" w:uiPriority="70"/>
+    <w:lsdException w:name="Colorful Shading Accent 2" w:uiPriority="71"/>
+    <w:lsdException w:name="Colorful List Accent 2" w:uiPriority="72"/>
+    <w:lsdException w:name="Colorful Grid Accent 2" w:uiPriority="73"/>
+    <w:lsdException w:name="Light Shading Accent 3" w:uiPriority="60"/>
+    <w:lsdException w:name="Light List Accent 3" w:uiPriority="61"/>
+    <w:lsdException w:name="Light Grid Accent 3" w:uiPriority="62"/>
+    <w:lsdException w:name="Medium Shading 1 Accent 3" w:uiPriority="63"/>
+    <w:lsdException w:name="Medium Shading 2 Accent 3" w:uiPriority="64"/>
+    <w:lsdException w:name="Medium List 1 Accent 3" w:uiPriority="65"/>
+    <w:lsdException w:name="Medium List 2 Accent 3" w:uiPriority="66"/>
+    <w:lsdException w:name="Medium Grid 1 Accent 3" w:uiPriority="67"/>
+    <w:lsdException w:name="Medium Grid 2 Accent 3" w:uiPriority="68"/>
+    <w:lsdException w:name="Medium Grid 3 Accent 3" w:uiPriority="69"/>
+    <w:lsdException w:name="Dark List Accent 3" w:uiPriority="70"/>
+    <w:lsdException w:name="Colorful Shading Accent 3" w:uiPriority="71"/>
+    <w:lsdException w:name="Colorful List Accent 3" w:uiPriority="72"/>
+    <w:lsdException w:name="Colorful Grid Accent 3" w:uiPriority="73"/>
+    <w:lsdException w:name="Light Shading Accent 4" w:uiPriority="60"/>
+    <w:lsdException w:name="Light List Accent 4" w:uiPriority="61"/>
+    <w:lsdException w:name="Light Grid Accent 4" w:uiPriority="62"/>
+    <w:lsdException w:name="Medium Shading 1 Accent 4" w:uiPriority="63"/>
+    <w:lsdException w:name="Medium Shading 2 Accent 4" w:uiPriority="64"/>
+    <w:lsdException w:name="Medium List 1 Accent 4" w:uiPriority="65"/>
+    <w:lsdException w:name="Medium List 2 Accent 4" w:uiPriority="66"/>
+    <w:lsdException w:name="Medium Grid 1 Accent 4" w:uiPriority="67"/>
+    <w:lsdException w:name="Medium Grid 2 Accent 4" w:uiPriority="68"/>
+    <w:lsdException w:name="Medium Grid 3 Accent 4" w:uiPriority="69"/>
+    <w:lsdException w:name="Dark List Accent 4" w:uiPriority="70"/>
+    <w:lsdException w:name="Colorful Shading Accent 4" w:uiPriority="71"/>
+    <w:lsdException w:name="Colorful List Accent 4" w:uiPriority="72"/>
+    <w:lsdException w:name="Colorful Grid Accent 4" w:uiPriority="73"/>
+    <w:lsdException w:name="Light Shading Accent 5" w:uiPriority="60"/>
+    <w:lsdException w:name="Light List Accent 5" w:uiPriority="61"/>
+    <w:lsdException w:name="Light Grid Accent 5" w:uiPriority="62"/>
+    <w:lsdException w:name="Medium Shading 1 Accent 5" w:uiPriority="63"/>
+    <w:lsdException w:name="Medium Shading 2 Accent 5" w:uiPriority="64"/>
+    <w:lsdException w:name="Medium List 1 Accent 5" w:uiPriority="65"/>
+    <w:lsdException w:name="Medium List 2 Accent 5" w:uiPriority="66"/>
+    <w:lsdException w:name="Medium Grid 1 Accent 5" w:uiPriority="67"/>
+    <w:lsdException w:name="Medium Grid 2 Accent 5" w:uiPriority="68"/>
+    <w:lsdException w:name="Medium Grid 3 Accent 5" w:uiPriority="69"/>
+    <w:lsdException w:name="Dark List Accent 5" w:uiPriority="70"/>
+    <w:lsdException w:name="Colorful Shading Accent 5" w:uiPriority="71"/>
+    <w:lsdException w:name="Colorful List Accent 5" w:uiPriority="72"/>
+    <w:lsdException w:name="Colorful Grid Accent 5" w:uiPriority="73"/>
+    <w:lsdException w:name="Light Shading Accent 6" w:uiPriority="60"/>
+    <w:lsdException w:name="Light List Accent 6" w:uiPriority="61"/>
+    <w:lsdException w:name="Light Grid Accent 6" w:uiPriority="62"/>
+    <w:lsdException w:name="Medium Shading 1 Accent 6" w:uiPriority="63"/>
+    <w:lsdException w:name="Medium Shading 2 Accent 6" w:uiPriority="64"/>
+    <w:lsdException w:name="Medium List 1 Accent 6" w:uiPriority="65"/>
+    <w:lsdException w:name="Medium List 2 Accent 6" w:uiPriority="66"/>
+    <w:lsdException w:name="Medium Grid 1 Accent 6" w:uiPriority="67"/>
+    <w:lsdException w:name="Medium Grid 2 Accent 6" w:uiPriority="68"/>
+    <w:lsdException w:name="Medium Grid 3 Accent 6" w:uiPriority="69"/>
+    <w:lsdException w:name="Dark List Accent 6" w:uiPriority="70"/>
+    <w:lsdException w:name="Colorful Shading Accent 6" w:uiPriority="71"/>
+    <w:lsdException w:name="Colorful List Accent 6" w:uiPriority="72"/>
+    <w:lsdException w:name="Colorful Grid Accent 6" w:uiPriority="73"/>
+    <w:lsdException w:name="Subtle Emphasis" w:uiPriority="19" w:qFormat="1"/>
+    <w:lsdException w:name="Intense Emphasis" w:uiPriority="21" w:qFormat="1"/>
+    <w:lsdException w:name="Subtle Reference" w:uiPriority="31" w:qFormat="1"/>
+    <w:lsdException w:name="Intense Reference" w:uiPriority="32" w:qFormat="1"/>
+    <w:lsdException w:name="Book Title" w:uiPriority="33" w:qFormat="1"/>
+    <w:lsdException w:name="Bibliography" w:semiHidden="1" w:uiPriority="37" w:unhideWhenUsed="1"/>
+    <w:lsdException w:name="TOC Heading" w:semiHidden="1" w:uiPriority="39" w:unhideWhenUsed="1" w:qFormat="1"/>
+    <w:lsdException w:name="Plain Table 1" w:uiPriority="41"/>
+    <w:lsdException w:name="Plain Table 2" w:uiPriority="42"/>
+    <w:lsdException w:name="Plain Table 3" w:uiPriority="43"/>
+    <w:lsdException w:name="Plain Table 4" w:uiPriority="44"/>
+    <w:lsdException w:name="Plain Table 5" w:uiPriority="45"/>
+    <w:lsdException w:name="Grid Table Light" w:uiPriority="40"/>
+    <w:lsdException w:name="Grid Table 1 Light" w:uiPriority="46"/>
+    <w:lsdException w:name="Grid Table 2" w:uiPriority="47"/>
+    <w:lsdException w:name="Grid Table 3" w:uiPriority="48"/>
+    <w:lsdException w:name="Grid Table 4" w:uiPriority="49"/>
+    <w:lsdException w:name="Grid Table 5 Dark" w:uiPriority="50"/>
+    <w:lsdException w:name="Grid Table 6 Colorful" w:uiPriority="51"/>
+    <w:lsdException w:name="Grid Table 7 Colorful" w:uiPriority="52"/>
+    <w:lsdException w:name="Grid Table 1 Light Accent 1" w:uiPriority="46"/>
+    <w:lsdException w:name="Grid Table 2 Accent 1" w:uiPriority="47"/>
+    <w:lsdException w:name="Grid Table 3 Accent 1" w:uiPriority="48"/>
+    <w:lsdException w:name="Grid Table 4 Accent 1" w:uiPriority="49"/>
+    <w:lsdException w:name="Grid Table 5 Dark Accent 1" w:uiPriority="50"/>
+    <w:lsdException w:name="Grid Table 6 Colorful Accent 1" w:uiPriority="51"/>
+    <w:lsdException w:name="Grid Table 7 Colorful Accent 1" w:uiPriority="52"/>
+    <w:lsdException w:name="Grid Table 1 Light Accent 2" w:uiPriority="46"/>
+    <w:lsdException w:name="Grid Table 2 Accent 2" w:uiPriority="47"/>
+    <w:lsdException w:name="Grid Table 3 Accent 2" w:uiPriority="48"/>
+    <w:lsdException w:name="Grid Table 4 Accent 2" w:uiPriority="49"/>
+    <w:lsdException w:name="Grid Table 5 Dark Accent 2" w:uiPriority="50"/>
+    <w:lsdException w:name="Grid Table 6 Colorful Accent 2" w:uiPriority="51"/>
+    <w:lsdException w:name="Grid Table 7 Colorful Accent 2" w:uiPriority="52"/>
+    <w:lsdException w:name="Grid Table 1 Light Accent 3" w:uiPriority="46"/>
+    <w:lsdException w:name="Grid Table 2 Accent 3" w:uiPriority="47"/>
+    <w:lsdException w:name="Grid Table 3 Accent 3" w:uiPriority="48"/>
+    <w:lsdException w:name="Grid Table 4 Accent 3" w:uiPriority="49"/>
+    <w:lsdException w:name="Grid Table 5 Dark Accent 3" w:uiPriority="50"/>
+    <w:lsdException w:name="Grid Table 6 Colorful Accent 3" w:uiPriority="51"/>
+    <w:lsdException w:name="Grid Table 7 Colorful Accent 3" w:uiPriority="52"/>
+    <w:lsdException w:name="Grid Table 1 Light Accent 4" w:uiPriority="46"/>
+    <w:lsdException w:name="Grid Table 2 Accent 4" w:uiPriority="47"/>
+    <w:lsdException w:name="Grid Table 3 Accent 4" w:uiPriority="48"/>
+    <w:lsdException w:name="Grid Table 4 Accent 4" w:uiPriority="49"/>
+    <w:lsdException w:name="Grid Table 5 Dark Accent 4" w:uiPriority="50"/>
+    <w:lsdException w:name="Grid Table 6 Colorful Accent 4" w:uiPriority="51"/>
+    <w:lsdException w:name="Grid Table 7 Colorful Accent 4" w:uiPriority="52"/>
+    <w:lsdException w:name="Grid Table 1 Light Accent 5" w:uiPriority="46"/>
+    <w:lsdException w:name="Grid Table 2 Accent 5" w:uiPriority="47"/>
+    <w:lsdException w:name="Grid Table 3 Accent 5" w:uiPriority="48"/>
+    <w:lsdException w:name="Grid Table 4 Accent 5" w:uiPriority="49"/>
+    <w:lsdException w:name="Grid Table 5 Dark Accent 5" w:uiPriority="50"/>
+    <w:lsdException w:name="Grid Table 6 Colorful Accent 5" w:uiPriority="51"/>
+    <w:lsdException w:name="Grid Table 7 Colorful Accent 5" w:uiPriority="52"/>
+    <w:lsdException w:name="Grid Table 1 Light Accent 6" w:uiPriority="46"/>
+    <w:lsdException w:name="Grid Table 2 Accent 6" w:uiPriority="47"/>
+    <w:lsdException w:name="Grid Table 3 Accent 6" w:uiPriority="48"/>
+    <w:lsdException w:name="Grid Table 4 Accent 6" w:uiPriority="49"/>
+    <w:lsdException w:name="Grid Table 5 Dark Accent 6" w:uiPriority="50"/>
+    <w:lsdException w:name="Grid Table 6 Colorful Accent 6" w:uiPriority="51"/>
+    <w:lsdException w:name="Grid Table 7 Colorful Accent 6" w:uiPriority="52"/>
+    <w:lsdException w:name="List Table 1 Light" w:uiPriority="46"/>
+    <w:lsdException w:name="List Table 2" w:uiPriority="47"/>
+    <w:lsdException w:name="List Table 3" w:uiPriority="48"/>
+    <w:lsdException w:name="List Table 4" w:uiPriority="49"/>
+    <w:lsdException w:name="List Table 5 Dark" w:uiPriority="50"/>
+    <w:lsdException w:name="List Table 6 Colorful" w:uiPriority="51"/>
+    <w:lsdException w:name="List Table 7 Colorful" w:uiPriority="52"/>
+    <w:lsdException w:name="List Table 1 Light Accent 1" w:uiPriority="46"/>
+    <w:lsdException w:name="List Table 2 Accent 1" w:uiPriority="47"/>
+    <w:lsdException w:name="List Table 3 Accent 1" w:uiPriority="48"/>
+    <w:lsdException w:name="List Table 4 Accent 1" w:uiPriority="49"/>
+    <w:lsdException w:name="List Table 5 Dark Accent 1" w:uiPriority="50"/>
+    <w:lsdException w:name="List Table 6 Colorful Accent 1" w:uiPriority="51"/>
+    <w:lsdException w:name="List Table 7 Colorful Accent 1" w:uiPriority="52"/>
+    <w:lsdException w:name="List Table 1 Light Accent 2" w:uiPriority="46"/>
+    <w:lsdException w:name="List Table 2 Accent 2" w:uiPriority="47"/>
+    <w:lsdException w:name="List Table 3 Accent 2" w:uiPriority="48"/>
+    <w:lsdException w:name="List Table 4 Accent 2" w:uiPriority="49"/>
+    <w:lsdException w:name="List Table 5 Dark Accent 2" w:uiPriority="50"/>
+    <w:lsdException w:name="List Table 6 Colorful Accent 2" w:uiPriority="51"/>
+    <w:lsdException w:name="List Table 7 Colorful Accent 2" w:uiPriority="52"/>
+    <w:lsdException w:name="List Table 1 Light Accent 3" w:uiPriority="46"/>
+    <w:lsdException w:name="List Table 2 Accent 3" w:uiPriority="47"/>
+    <w:lsdException w:name="List Table 3 Accent 3" w:uiPriority="48"/>
+    <w:lsdException w:name="List Table 4 Accent 3" w:uiPriority="49"/>
+    <w:lsdException w:name="List Table 5 Dark Accent 3" w:uiPriority="50"/>
+    <w:lsdException w:name="List Table 6 Colorful Accent 3" w:uiPriority="51"/>
+    <w:lsdException w:name="List Table 7 Colorful Accent 3" w:uiPriority="52"/>
+    <w:lsdException w:name="List Table 1 Light Accent 4" w:uiPriority="46"/>
+    <w:lsdException w:name="List Table 2 Accent 4" w:uiPriority="47"/>
+    <w:lsdException w:name="List Table 3 Accent 4" w:uiPriority="48"/>
+    <w:lsdException w:name="List Table 4 Accent 4" w:uiPriority="49"/>
+    <w:lsdException w:name="List Table 5 Dark Accent 4" w:uiPriority="50"/>
+    <w:lsdException w:name="List Table 6 Colorful Accent 4" w:uiPriority="51"/>
+    <w:lsdException w:name="List Table 7 Colorful Accent 4" w:uiPriority="52"/>
+    <w:lsdException w:name="List Table 1 Light Accent 5" w:uiPriority="46"/>
+    <w:lsdException w:name="List Table 2 Accent 5" w:uiPriority="47"/>
+    <w:lsdException w:name="List Table 3 Accent 5" w:uiPriority="48"/>
+    <w:lsdException w:name="List Table 4 Accent 5" w:uiPriority="49"/>
+    <w:lsdException w:name="List Table 5 Dark Accent 5" w:uiPriority="50"/>
+    <w:lsdException w:name="List Table 6 Colorful Accent 5" w:uiPriority="51"/>
+    <w:lsdException w:name="List Table 7 Colorful Accent 5" w:uiPriority="52"/>
+    <w:lsdException w:name="List Table 1 Light Accent 6" w:uiPriority="46"/>
+    <w:lsdException w:name="List Table 2 Accent 6" w:uiPriority="47"/>
+    <w:lsdException w:name="List Table 3 Accent 6" w:uiPriority="48"/>
+    <w:lsdException w:name="List Table 4 Accent 6" w:uiPriority="49"/>
+    <w:lsdException w:name="List Table 5 Dark Accent 6" w:uiPriority="50"/>
+    <w:lsdException w:name="List Table 6 Colorful Accent 6" w:uiPriority="51"/>
+    <w:lsdException w:name="List Table 7 Colorful Accent 6" w:uiPriority="52"/>
+    <w:lsdException w:name="Mention" w:semiHidden="1" w:unhideWhenUsed="1"/>
+    <w:lsdException w:name="Smart Hyperlink" w:semiHidden="1" w:unhideWhenUsed="1"/>
+    <w:lsdException w:name="Hashtag" w:semiHidden="1" w:unhideWhenUsed="1"/>
+    <w:lsdException w:name="Unresolved Mention" w:semiHidden="1" w:unhideWhenUsed="1"/>
+    <w:lsdException w:name="Smart Link" w:semiHidden="1" w:unhideWhenUsed="1"/>
+  </w:latentStyles>
+  <w:style w:type="paragraph" w:default="1" w:styleId="Normal">
+    <w:name w:val="Normal"/>
+    <w:qFormat/>
   </w:style>
   <w:style w:type="paragraph" w:styleId="Heading1">
     <w:name w:val="heading 1"/>
     <w:basedOn w:val="Normal"/>
     <w:next w:val="Normal"/>
+    <w:uiPriority w:val="9"/>
+    <w:qFormat/>
     <w:pPr>
-      <w:keepNext w:val="1"/>
-      <w:keepLines w:val="1"/>
-      <w:spacing w:after="80" w:before="360" w:lineRule="auto"/>
+      <w:keepNext/>
+      <w:keepLines/>
+      <w:spacing w:before="360" w:after="80"/>
+      <w:outlineLvl w:val="0"/>
     </w:pPr>
     <w:rPr>
-      <w:rFonts w:ascii="Play" w:cs="Play" w:eastAsia="Play" w:hAnsi="Play"/>
-      <w:color w:val="0f4761"/>
+      <w:rFonts w:ascii="Play" w:eastAsia="Play" w:hAnsi="Play" w:cs="Play"/>
+      <w:color w:val="0F4761"/>
       <w:sz w:val="40"/>
       <w:szCs w:val="40"/>
     </w:rPr>
@@ -4356,14 +4101,19 @@
     <w:name w:val="heading 2"/>
     <w:basedOn w:val="Normal"/>
     <w:next w:val="Normal"/>
+    <w:uiPriority w:val="9"/>
+    <w:semiHidden/>
+    <w:unhideWhenUsed/>
+    <w:qFormat/>
     <w:pPr>
-      <w:keepNext w:val="1"/>
-      <w:keepLines w:val="1"/>
-      <w:spacing w:after="80" w:before="160" w:lineRule="auto"/>
+      <w:keepNext/>
+      <w:keepLines/>
+      <w:spacing w:before="160" w:after="80"/>
+      <w:outlineLvl w:val="1"/>
     </w:pPr>
     <w:rPr>
-      <w:rFonts w:ascii="Play" w:cs="Play" w:eastAsia="Play" w:hAnsi="Play"/>
-      <w:color w:val="0f4761"/>
+      <w:rFonts w:ascii="Play" w:eastAsia="Play" w:hAnsi="Play" w:cs="Play"/>
+      <w:color w:val="0F4761"/>
       <w:sz w:val="32"/>
       <w:szCs w:val="32"/>
     </w:rPr>
@@ -4372,13 +4122,18 @@
     <w:name w:val="heading 3"/>
     <w:basedOn w:val="Normal"/>
     <w:next w:val="Normal"/>
+    <w:uiPriority w:val="9"/>
+    <w:semiHidden/>
+    <w:unhideWhenUsed/>
+    <w:qFormat/>
     <w:pPr>
-      <w:keepNext w:val="1"/>
-      <w:keepLines w:val="1"/>
-      <w:spacing w:after="80" w:before="160" w:lineRule="auto"/>
+      <w:keepNext/>
+      <w:keepLines/>
+      <w:spacing w:before="160" w:after="80"/>
+      <w:outlineLvl w:val="2"/>
     </w:pPr>
     <w:rPr>
-      <w:color w:val="0f4761"/>
+      <w:color w:val="0F4761"/>
       <w:sz w:val="28"/>
       <w:szCs w:val="28"/>
     </w:rPr>
@@ -4387,52 +4142,96 @@
     <w:name w:val="heading 4"/>
     <w:basedOn w:val="Normal"/>
     <w:next w:val="Normal"/>
+    <w:uiPriority w:val="9"/>
+    <w:semiHidden/>
+    <w:unhideWhenUsed/>
+    <w:qFormat/>
     <w:pPr>
-      <w:keepNext w:val="1"/>
-      <w:keepLines w:val="1"/>
-      <w:spacing w:after="40" w:before="80" w:lineRule="auto"/>
+      <w:keepNext/>
+      <w:keepLines/>
+      <w:spacing w:before="80" w:after="40"/>
+      <w:outlineLvl w:val="3"/>
     </w:pPr>
     <w:rPr>
-      <w:i w:val="1"/>
-      <w:color w:val="0f4761"/>
+      <w:i/>
+      <w:color w:val="0F4761"/>
     </w:rPr>
   </w:style>
   <w:style w:type="paragraph" w:styleId="Heading5">
     <w:name w:val="heading 5"/>
     <w:basedOn w:val="Normal"/>
     <w:next w:val="Normal"/>
+    <w:uiPriority w:val="9"/>
+    <w:semiHidden/>
+    <w:unhideWhenUsed/>
+    <w:qFormat/>
     <w:pPr>
-      <w:keepNext w:val="1"/>
-      <w:keepLines w:val="1"/>
-      <w:spacing w:after="40" w:before="80" w:lineRule="auto"/>
+      <w:keepNext/>
+      <w:keepLines/>
+      <w:spacing w:before="80" w:after="40"/>
+      <w:outlineLvl w:val="4"/>
     </w:pPr>
     <w:rPr>
-      <w:color w:val="0f4761"/>
+      <w:color w:val="0F4761"/>
     </w:rPr>
   </w:style>
   <w:style w:type="paragraph" w:styleId="Heading6">
     <w:name w:val="heading 6"/>
     <w:basedOn w:val="Normal"/>
     <w:next w:val="Normal"/>
+    <w:uiPriority w:val="9"/>
+    <w:semiHidden/>
+    <w:unhideWhenUsed/>
+    <w:qFormat/>
     <w:pPr>
-      <w:keepNext w:val="1"/>
-      <w:keepLines w:val="1"/>
-      <w:spacing w:after="0" w:before="40" w:lineRule="auto"/>
+      <w:keepNext/>
+      <w:keepLines/>
+      <w:spacing w:before="40" w:after="0"/>
+      <w:outlineLvl w:val="5"/>
     </w:pPr>
     <w:rPr>
-      <w:i w:val="1"/>
+      <w:i/>
       <w:color w:val="595959"/>
     </w:rPr>
+  </w:style>
+  <w:style w:type="character" w:default="1" w:styleId="DefaultParagraphFont">
+    <w:name w:val="Default Paragraph Font"/>
+    <w:uiPriority w:val="1"/>
+    <w:semiHidden/>
+    <w:unhideWhenUsed/>
+  </w:style>
+  <w:style w:type="table" w:default="1" w:styleId="TableNormal">
+    <w:name w:val="Normal Table"/>
+    <w:uiPriority w:val="99"/>
+    <w:semiHidden/>
+    <w:unhideWhenUsed/>
+    <w:tblPr>
+      <w:tblInd w:w="0" w:type="dxa"/>
+      <w:tblCellMar>
+        <w:top w:w="0" w:type="dxa"/>
+        <w:left w:w="108" w:type="dxa"/>
+        <w:bottom w:w="0" w:type="dxa"/>
+        <w:right w:w="108" w:type="dxa"/>
+      </w:tblCellMar>
+    </w:tblPr>
+  </w:style>
+  <w:style w:type="numbering" w:default="1" w:styleId="NoList">
+    <w:name w:val="No List"/>
+    <w:uiPriority w:val="99"/>
+    <w:semiHidden/>
+    <w:unhideWhenUsed/>
   </w:style>
   <w:style w:type="paragraph" w:styleId="Title">
     <w:name w:val="Title"/>
     <w:basedOn w:val="Normal"/>
     <w:next w:val="Normal"/>
+    <w:uiPriority w:val="10"/>
+    <w:qFormat/>
     <w:pPr>
       <w:spacing w:after="80" w:line="240" w:lineRule="auto"/>
     </w:pPr>
     <w:rPr>
-      <w:rFonts w:ascii="Play" w:cs="Play" w:eastAsia="Play" w:hAnsi="Play"/>
+      <w:rFonts w:ascii="Play" w:eastAsia="Play" w:hAnsi="Play" w:cs="Play"/>
       <w:sz w:val="56"/>
       <w:szCs w:val="56"/>
     </w:rPr>
@@ -4441,7 +4240,8 @@
     <w:name w:val="Subtitle"/>
     <w:basedOn w:val="Normal"/>
     <w:next w:val="Normal"/>
-    <w:pPr/>
+    <w:uiPriority w:val="11"/>
+    <w:qFormat/>
     <w:rPr>
       <w:color w:val="595959"/>
       <w:sz w:val="28"/>

</xml_diff>